<commit_message>
Add the draft introduction to manuscript
</commit_message>
<xml_diff>
--- a/doc/manuscript.docx
+++ b/doc/manuscript.docx
@@ -210,7 +210,275 @@
         <w:t xml:space="preserve">The title</w:t>
       </w:r>
     </w:p>
-    <w:bookmarkStart w:id="54" w:name="results"/>
+    <w:bookmarkStart w:id="21" w:name="introduction"/>
+    <w:p>
+      <w:pPr>
+        <w:pStyle w:val="berschrift1"/>
+      </w:pPr>
+      <w:r>
+        <w:t xml:space="preserve">Introduction</w:t>
+      </w:r>
+    </w:p>
+    <w:p>
+      <w:pPr>
+        <w:pStyle w:val="FirstParagraph"/>
+      </w:pPr>
+      <w:r>
+        <w:t xml:space="preserve">Sleep is an important determinant of population health</w:t>
+      </w:r>
+      <w:r>
+        <w:t xml:space="preserve"> </w:t>
+      </w:r>
+      <w:r>
+        <w:t xml:space="preserve">[1]</w:t>
+      </w:r>
+      <w:r>
+        <w:t xml:space="preserve">.</w:t>
+      </w:r>
+      <w:r>
+        <w:t xml:space="preserve"> </w:t>
+      </w:r>
+      <w:r>
+        <w:t xml:space="preserve">The consequences of poor sleep are profound and include increased all-cause mortality</w:t>
+      </w:r>
+      <w:r>
+        <w:t xml:space="preserve"> </w:t>
+      </w:r>
+      <w:r>
+        <w:t xml:space="preserve">[2]</w:t>
+      </w:r>
+      <w:r>
+        <w:t xml:space="preserve">, cardiovascular disease</w:t>
+      </w:r>
+      <w:r>
+        <w:t xml:space="preserve"> </w:t>
+      </w:r>
+      <w:r>
+        <w:t xml:space="preserve">[3]</w:t>
+      </w:r>
+      <w:r>
+        <w:t xml:space="preserve">, cancers</w:t>
+      </w:r>
+      <w:r>
+        <w:t xml:space="preserve"> </w:t>
+      </w:r>
+      <w:r>
+        <w:t xml:space="preserve">[4]</w:t>
+      </w:r>
+      <w:r>
+        <w:t xml:space="preserve">, and poor mental health</w:t>
+      </w:r>
+      <w:r>
+        <w:t xml:space="preserve"> </w:t>
+      </w:r>
+      <w:r>
+        <w:t xml:space="preserve">[5]</w:t>
+      </w:r>
+      <w:r>
+        <w:t xml:space="preserve">.</w:t>
+      </w:r>
+      <w:r>
+        <w:t xml:space="preserve"> </w:t>
+      </w:r>
+      <w:r>
+        <w:t xml:space="preserve">Poor sleep is common: over 50% of children and adolescents</w:t>
+      </w:r>
+      <w:r>
+        <w:t xml:space="preserve"> </w:t>
+      </w:r>
+      <w:r>
+        <w:t xml:space="preserve">[6]</w:t>
+      </w:r>
+      <w:r>
+        <w:t xml:space="preserve"> </w:t>
+      </w:r>
+      <w:r>
+        <w:t xml:space="preserve">and 35% of adults</w:t>
+      </w:r>
+      <w:r>
+        <w:t xml:space="preserve"> </w:t>
+      </w:r>
+      <w:r>
+        <w:t xml:space="preserve">[7]</w:t>
+      </w:r>
+      <w:r>
+        <w:t xml:space="preserve"> </w:t>
+      </w:r>
+      <w:r>
+        <w:t xml:space="preserve">report less sleep than recommended.</w:t>
+      </w:r>
+      <w:r>
+        <w:t xml:space="preserve"> </w:t>
+      </w:r>
+      <w:r>
+        <w:t xml:space="preserve">Improving sleep should be a priority for public health policy and more safe and accessible strategies that promote sleep are needed</w:t>
+      </w:r>
+      <w:r>
+        <w:t xml:space="preserve"> </w:t>
+      </w:r>
+      <w:r>
+        <w:t xml:space="preserve">[8]</w:t>
+      </w:r>
+      <w:r>
+        <w:t xml:space="preserve">.</w:t>
+      </w:r>
+      <w:r>
+        <w:t xml:space="preserve"> </w:t>
+      </w:r>
+      <w:r>
+        <w:t xml:space="preserve">In adults, being physically active appears to improve both the quantity and quality of sleep</w:t>
+      </w:r>
+      <w:r>
+        <w:t xml:space="preserve"> </w:t>
+      </w:r>
+      <w:r>
+        <w:t xml:space="preserve">[9]</w:t>
+      </w:r>
+      <w:r>
+        <w:t xml:space="preserve"> </w:t>
+      </w:r>
+      <w:r>
+        <w:t xml:space="preserve">and the World Health Organisation recommends physical activity as a method to improve sleep in adults</w:t>
+      </w:r>
+      <w:r>
+        <w:t xml:space="preserve"> </w:t>
+      </w:r>
+      <w:r>
+        <w:t xml:space="preserve">[10]</w:t>
+      </w:r>
+      <w:r>
+        <w:t xml:space="preserve">.</w:t>
+      </w:r>
+      <w:r>
+        <w:t xml:space="preserve"> </w:t>
+      </w:r>
+      <w:r>
+        <w:t xml:space="preserve">In children, adolescents, and older adults associations are unclear</w:t>
+      </w:r>
+      <w:r>
+        <w:t xml:space="preserve"> </w:t>
+      </w:r>
+      <w:r>
+        <w:t xml:space="preserve">[8,11,12]</w:t>
+      </w:r>
+      <w:r>
+        <w:t xml:space="preserve"> </w:t>
+      </w:r>
+      <w:r>
+        <w:t xml:space="preserve">and guidelines do not currently support a role for physical activity to improve sleep.</w:t>
+      </w:r>
+    </w:p>
+    <w:p>
+      <w:pPr>
+        <w:pStyle w:val="Textkrper"/>
+      </w:pPr>
+      <w:r>
+        <w:t xml:space="preserve">Promoting physical activity may be an effective method to improve sleep across the lifespan but the published literature to date has at least two limitations that prevent firm conclusions to support health guidelines.</w:t>
+      </w:r>
+      <w:r>
+        <w:t xml:space="preserve"> </w:t>
+      </w:r>
+      <w:r>
+        <w:t xml:space="preserve">First, most studies have relied on self-report measures of sleep and physical activity</w:t>
+      </w:r>
+      <w:r>
+        <w:t xml:space="preserve"> </w:t>
+      </w:r>
+      <w:r>
+        <w:t xml:space="preserve">[8,11,12]</w:t>
+      </w:r>
+      <w:r>
+        <w:t xml:space="preserve">, which could confound associations and limit the precision of analyses designed to identify a dose-response relationship between physical activity and sleep.</w:t>
+      </w:r>
+      <w:r>
+        <w:t xml:space="preserve"> </w:t>
+      </w:r>
+      <w:r>
+        <w:t xml:space="preserve">Second, no study has collected data from a large sample that included participants across the lifespan.</w:t>
+      </w:r>
+      <w:r>
+        <w:t xml:space="preserve"> </w:t>
+      </w:r>
+      <w:r>
+        <w:t xml:space="preserve">Umbrella reviews</w:t>
+      </w:r>
+      <w:r>
+        <w:t xml:space="preserve"> </w:t>
+      </w:r>
+      <w:r>
+        <w:t xml:space="preserve">[8]</w:t>
+      </w:r>
+      <w:r>
+        <w:t xml:space="preserve"> </w:t>
+      </w:r>
+      <w:r>
+        <w:t xml:space="preserve">and meta-analyses</w:t>
+      </w:r>
+      <w:r>
+        <w:t xml:space="preserve"> </w:t>
+      </w:r>
+      <w:r>
+        <w:t xml:space="preserve">[3,4,9,11–28]</w:t>
+      </w:r>
+      <w:r>
+        <w:t xml:space="preserve"> </w:t>
+      </w:r>
+      <w:r>
+        <w:t xml:space="preserve">have provided some suggestive evidence about how physical activity as a means of improving sleep may vary across the lifespan.</w:t>
+      </w:r>
+      <w:r>
+        <w:t xml:space="preserve"> </w:t>
+      </w:r>
+      <w:r>
+        <w:t xml:space="preserve">However, their reliance on aggregated study-level effects limits the quality and scope of data that can be used to analyse the influence of age</w:t>
+      </w:r>
+      <w:r>
+        <w:t xml:space="preserve"> </w:t>
+      </w:r>
+      <w:r>
+        <w:t xml:space="preserve">[29]</w:t>
+      </w:r>
+      <w:r>
+        <w:t xml:space="preserve">.</w:t>
+      </w:r>
+      <w:r>
+        <w:t xml:space="preserve"> </w:t>
+      </w:r>
+      <w:r>
+        <w:t xml:space="preserve">Individual participant data (IPD) analysis can overcome these limitations</w:t>
+      </w:r>
+      <w:r>
+        <w:t xml:space="preserve"> </w:t>
+      </w:r>
+      <w:r>
+        <w:t xml:space="preserve">[30]</w:t>
+      </w:r>
+      <w:r>
+        <w:t xml:space="preserve">.</w:t>
+      </w:r>
+    </w:p>
+    <w:p>
+      <w:pPr>
+        <w:pStyle w:val="Textkrper"/>
+      </w:pPr>
+      <w:r>
+        <w:t xml:space="preserve">In this study we harmonised individual participant data (IPD) from activity monitor observations obtained from studies around the world.</w:t>
+      </w:r>
+      <w:r>
+        <w:t xml:space="preserve"> </w:t>
+      </w:r>
+      <w:r>
+        <w:t xml:space="preserve">The objective of this pooled IPD study was to investigate the relationship between device-measured physical activity and sleep across the lifespan.</w:t>
+      </w:r>
+      <w:r>
+        <w:t xml:space="preserve"> </w:t>
+      </w:r>
+      <w:r>
+        <w:t xml:space="preserve">We examined whether individuals who are more physically active have better sleep, whether age, sex, and socio-cultural factors moderate the association between physical activity and sleep, and whether there is a bidirectional association between physical activity and sleep.</w:t>
+      </w:r>
+    </w:p>
+    <w:bookmarkEnd w:id="21"/>
+    <w:bookmarkStart w:id="116" w:name="results"/>
     <w:p>
       <w:pPr>
         <w:pStyle w:val="berschrift1"/>
@@ -305,8 +573,8 @@
       <w:pPr>
         <w:pStyle w:val="TableCaption"/>
       </w:pPr>
-      <w:bookmarkStart w:id="21" w:name="tab:demo-participants"/>
-      <w:bookmarkEnd w:id="21"/>
+      <w:bookmarkStart w:id="22" w:name="tab:demo-participants"/>
+      <w:bookmarkEnd w:id="22"/>
       <w:r>
         <w:t xml:space="preserve">Table </w:t>
       </w:r>
@@ -3187,7 +3455,7 @@
         <w:t xml:space="preserve"> </w:t>
       </w:r>
     </w:p>
-    <w:bookmarkStart w:id="27" w:name="X05639e6ef7ae98db4ab1ccd43c53beb5b18ad39"/>
+    <w:bookmarkStart w:id="28" w:name="X05639e6ef7ae98db4ab1ccd43c53beb5b18ad39"/>
     <w:p>
       <w:pPr>
         <w:pStyle w:val="berschrift2"/>
@@ -3256,8 +3524,8 @@
       <w:pPr>
         <w:pStyle w:val="TableCaption"/>
       </w:pPr>
-      <w:bookmarkStart w:id="22" w:name="tab:sleep-outcomes"/>
-      <w:bookmarkEnd w:id="22"/>
+      <w:bookmarkStart w:id="23" w:name="tab:sleep-outcomes"/>
+      <w:bookmarkEnd w:id="23"/>
       <w:r>
         <w:t xml:space="preserve">Table </w:t>
       </w:r>
@@ -6788,18 +7056,18 @@
           <wp:inline>
             <wp:extent cx="3810000" cy="2540000"/>
             <wp:effectExtent b="0" l="0" r="0" t="0"/>
-            <wp:docPr descr="Figure 1: Sleep metrics on physical activity volume. The panels on the left show the curvilinear relationship between PA volume and each of the sleep outcomes at the ages indicated in each column. The panels on the right show the same relationships but by age continuously. The white band indicates predictions which were not significantly different from zero. These plots demonstrate exact turning points where the effects of PA volume change by age." title="" id="24" name="Picture"/>
+            <wp:docPr descr="Figure 1: Sleep metrics on physical activity volume. The panels on the left show the curvilinear relationship between PA volume and each of the sleep outcomes at the ages indicated in each column. The panels on the right show the same relationships but by age continuously. The white band indicates predictions which were not significantly different from zero. These plots demonstrate exact turning points where the effects of PA volume change by age." title="" id="25" name="Picture"/>
             <a:graphic>
               <a:graphicData uri="http://schemas.openxmlformats.org/drawingml/2006/picture">
                 <pic:pic>
                   <pic:nvPicPr>
-                    <pic:cNvPr descr="../Figures/Sleep%20on%20scale_pa_volume%20by%20Age_nolog.jpg" id="25" name="Picture"/>
+                    <pic:cNvPr descr="../Figures/Sleep%20on%20scale_pa_volume%20by%20Age_nolog.jpg" id="26" name="Picture"/>
                     <pic:cNvPicPr>
                       <a:picLocks noChangeArrowheads="1" noChangeAspect="1"/>
                     </pic:cNvPicPr>
                   </pic:nvPicPr>
                   <pic:blipFill>
-                    <a:blip r:embed="rId23"/>
+                    <a:blip r:embed="rId24"/>
                     <a:stretch>
                       <a:fillRect/>
                     </a:stretch>
@@ -6830,14 +7098,14 @@
       <w:pPr>
         <w:pStyle w:val="ImageCaption"/>
       </w:pPr>
-      <w:bookmarkStart w:id="26" w:name="fig:sleep-by-volume-fig"/>
-      <w:bookmarkEnd w:id="26"/>
+      <w:bookmarkStart w:id="27" w:name="fig:sleep-by-volume-fig"/>
+      <w:bookmarkEnd w:id="27"/>
       <w:r>
         <w:t xml:space="preserve">Figure 1: Sleep metrics on physical activity volume. The panels on the left show the curvilinear relationship between PA volume and each of the sleep outcomes at the ages indicated in each column. The panels on the right show the same relationships but by age continuously. The white band indicates predictions which were not significantly different from zero. These plots demonstrate exact turning points where the effects of PA volume change by age.</w:t>
       </w:r>
     </w:p>
-    <w:bookmarkEnd w:id="27"/>
-    <w:bookmarkStart w:id="32" w:name="Xa76f34ddb50b78b74a569c66731f68ed699c5c1"/>
+    <w:bookmarkEnd w:id="28"/>
+    <w:bookmarkStart w:id="33" w:name="Xa76f34ddb50b78b74a569c66731f68ed699c5c1"/>
     <w:p>
       <w:pPr>
         <w:pStyle w:val="berschrift2"/>
@@ -6902,18 +7170,18 @@
           <wp:inline>
             <wp:extent cx="3810000" cy="2540000"/>
             <wp:effectExtent b="0" l="0" r="0" t="0"/>
-            <wp:docPr descr="Figure 2: Sleep metrics on physical activity intensity. The panels on the left show the curvilinear relationship between PA intensity and each of the sleep outcomes at the ages indicated in each column. The panels on the right show the same relationships but by age continuously. The white band indicates predictions which were not significantly different from zero." title="" id="29" name="Picture"/>
+            <wp:docPr descr="Figure 2: Sleep metrics on physical activity intensity. The panels on the left show the curvilinear relationship between PA intensity and each of the sleep outcomes at the ages indicated in each column. The panels on the right show the same relationships but by age continuously. The white band indicates predictions which were not significantly different from zero." title="" id="30" name="Picture"/>
             <a:graphic>
               <a:graphicData uri="http://schemas.openxmlformats.org/drawingml/2006/picture">
                 <pic:pic>
                   <pic:nvPicPr>
-                    <pic:cNvPr descr="../Figures/Sleep%20on%20scale_pa_intensity%20by%20Age_nolog.jpg" id="30" name="Picture"/>
+                    <pic:cNvPr descr="../Figures/Sleep%20on%20scale_pa_intensity%20by%20Age_nolog.jpg" id="31" name="Picture"/>
                     <pic:cNvPicPr>
                       <a:picLocks noChangeArrowheads="1" noChangeAspect="1"/>
                     </pic:cNvPicPr>
                   </pic:nvPicPr>
                   <pic:blipFill>
-                    <a:blip r:embed="rId28"/>
+                    <a:blip r:embed="rId29"/>
                     <a:stretch>
                       <a:fillRect/>
                     </a:stretch>
@@ -6944,14 +7212,14 @@
       <w:pPr>
         <w:pStyle w:val="ImageCaption"/>
       </w:pPr>
-      <w:bookmarkStart w:id="31" w:name="fig:sleep-by-intensity-fig"/>
-      <w:bookmarkEnd w:id="31"/>
+      <w:bookmarkStart w:id="32" w:name="fig:sleep-by-intensity-fig"/>
+      <w:bookmarkEnd w:id="32"/>
       <w:r>
         <w:t xml:space="preserve">Figure 2: Sleep metrics on physical activity intensity. The panels on the left show the curvilinear relationship between PA intensity and each of the sleep outcomes at the ages indicated in each column. The panels on the right show the same relationships but by age continuously. The white band indicates predictions which were not significantly different from zero.</w:t>
       </w:r>
     </w:p>
-    <w:bookmarkEnd w:id="32"/>
-    <w:bookmarkStart w:id="38" w:name="X1f1e5025560e06f33688db1a4382872e901155b"/>
+    <w:bookmarkEnd w:id="33"/>
+    <w:bookmarkStart w:id="39" w:name="X1f1e5025560e06f33688db1a4382872e901155b"/>
     <w:p>
       <w:pPr>
         <w:pStyle w:val="berschrift2"/>
@@ -7011,8 +7279,8 @@
       <w:pPr>
         <w:pStyle w:val="TableCaption"/>
       </w:pPr>
-      <w:bookmarkStart w:id="33" w:name="tab:pa-outcomes"/>
-      <w:bookmarkEnd w:id="33"/>
+      <w:bookmarkStart w:id="34" w:name="tab:pa-outcomes"/>
+      <w:bookmarkEnd w:id="34"/>
       <w:r>
         <w:t xml:space="preserve">Table </w:t>
       </w:r>
@@ -10543,18 +10811,18 @@
           <wp:inline>
             <wp:extent cx="3810000" cy="2540000"/>
             <wp:effectExtent b="0" l="0" r="0" t="0"/>
-            <wp:docPr descr="Figure 3: Physical activity by sleep duration. The panels on the left show the curvilinear relationship between sleep duration and each of the physical activity outcomes at the ages indicated in each column. The panels on the right show the same relationships but by age continuously. The white band indicates predictions which were not significantly different from zero." title="" id="35" name="Picture"/>
+            <wp:docPr descr="Figure 3: Physical activity by sleep duration. The panels on the left show the curvilinear relationship between sleep duration and each of the physical activity outcomes at the ages indicated in each column. The panels on the right show the same relationships but by age continuously. The white band indicates predictions which were not significantly different from zero." title="" id="36" name="Picture"/>
             <a:graphic>
               <a:graphicData uri="http://schemas.openxmlformats.org/drawingml/2006/picture">
                 <pic:pic>
                   <pic:nvPicPr>
-                    <pic:cNvPr descr="../Figures/PA%20on%20scale_sleep_duration_lag%20by%20Age_nolog.jpg" id="36" name="Picture"/>
+                    <pic:cNvPr descr="../Figures/PA%20on%20scale_sleep_duration_lag%20by%20Age_nolog.jpg" id="37" name="Picture"/>
                     <pic:cNvPicPr>
                       <a:picLocks noChangeArrowheads="1" noChangeAspect="1"/>
                     </pic:cNvPicPr>
                   </pic:nvPicPr>
                   <pic:blipFill>
-                    <a:blip r:embed="rId34"/>
+                    <a:blip r:embed="rId35"/>
                     <a:stretch>
                       <a:fillRect/>
                     </a:stretch>
@@ -10585,14 +10853,14 @@
       <w:pPr>
         <w:pStyle w:val="ImageCaption"/>
       </w:pPr>
-      <w:bookmarkStart w:id="37" w:name="fig:PA-by-sleep-duration-fig"/>
-      <w:bookmarkEnd w:id="37"/>
+      <w:bookmarkStart w:id="38" w:name="fig:PA-by-sleep-duration-fig"/>
+      <w:bookmarkEnd w:id="38"/>
       <w:r>
         <w:t xml:space="preserve">Figure 3: Physical activity by sleep duration. The panels on the left show the curvilinear relationship between sleep duration and each of the physical activity outcomes at the ages indicated in each column. The panels on the right show the same relationships but by age continuously. The white band indicates predictions which were not significantly different from zero.</w:t>
       </w:r>
     </w:p>
-    <w:bookmarkEnd w:id="38"/>
-    <w:bookmarkStart w:id="43" w:name="X4f938f992ae8f586cf755ad0143b241d25fead3"/>
+    <w:bookmarkEnd w:id="39"/>
+    <w:bookmarkStart w:id="44" w:name="X4f938f992ae8f586cf755ad0143b241d25fead3"/>
     <w:p>
       <w:pPr>
         <w:pStyle w:val="berschrift2"/>
@@ -10657,18 +10925,18 @@
           <wp:inline>
             <wp:extent cx="3810000" cy="2540000"/>
             <wp:effectExtent b="0" l="0" r="0" t="0"/>
-            <wp:docPr descr="Figure 4: Physical activity by sleep efficiency. The panels on the left show the curvilinear relationship between sleep efficiency and each of the physical activity outcomes at the ages indicated in each column. The panels on the right show the same relationships but by age continuously. The white band indicates predictions which were not significantly different from zero." title="" id="40" name="Picture"/>
+            <wp:docPr descr="Figure 4: Physical activity by sleep efficiency. The panels on the left show the curvilinear relationship between sleep efficiency and each of the physical activity outcomes at the ages indicated in each column. The panels on the right show the same relationships but by age continuously. The white band indicates predictions which were not significantly different from zero." title="" id="41" name="Picture"/>
             <a:graphic>
               <a:graphicData uri="http://schemas.openxmlformats.org/drawingml/2006/picture">
                 <pic:pic>
                   <pic:nvPicPr>
-                    <pic:cNvPr descr="../Figures/PA%20on%20scale_sleep_efficiency_lag%20by%20Age_nolog.jpg" id="41" name="Picture"/>
+                    <pic:cNvPr descr="../Figures/PA%20on%20scale_sleep_efficiency_lag%20by%20Age_nolog.jpg" id="42" name="Picture"/>
                     <pic:cNvPicPr>
                       <a:picLocks noChangeArrowheads="1" noChangeAspect="1"/>
                     </pic:cNvPicPr>
                   </pic:nvPicPr>
                   <pic:blipFill>
-                    <a:blip r:embed="rId39"/>
+                    <a:blip r:embed="rId40"/>
                     <a:stretch>
                       <a:fillRect/>
                     </a:stretch>
@@ -10699,14 +10967,14 @@
       <w:pPr>
         <w:pStyle w:val="ImageCaption"/>
       </w:pPr>
-      <w:bookmarkStart w:id="42" w:name="fig:PA-by-sleep-efficiency-fig"/>
-      <w:bookmarkEnd w:id="42"/>
+      <w:bookmarkStart w:id="43" w:name="fig:PA-by-sleep-efficiency-fig"/>
+      <w:bookmarkEnd w:id="43"/>
       <w:r>
         <w:t xml:space="preserve">Figure 4: Physical activity by sleep efficiency. The panels on the left show the curvilinear relationship between sleep efficiency and each of the physical activity outcomes at the ages indicated in each column. The panels on the right show the same relationships but by age continuously. The white band indicates predictions which were not significantly different from zero.</w:t>
       </w:r>
     </w:p>
-    <w:bookmarkEnd w:id="43"/>
-    <w:bookmarkStart w:id="48" w:name="X1f81d2ba0159bcbfb61758cd80661e798901b57"/>
+    <w:bookmarkEnd w:id="44"/>
+    <w:bookmarkStart w:id="49" w:name="X1f81d2ba0159bcbfb61758cd80661e798901b57"/>
     <w:p>
       <w:pPr>
         <w:pStyle w:val="berschrift2"/>
@@ -10771,18 +11039,18 @@
           <wp:inline>
             <wp:extent cx="3810000" cy="2540000"/>
             <wp:effectExtent b="0" l="0" r="0" t="0"/>
-            <wp:docPr descr="Figure 5: Physical activity by sleep onset. The panels on the left show the curvilinear relationship between sleep onset and each of the physical activity outcomes at the ages indicated in each column. The panels on the right show the same relationships but by age continuously. The white band indicates predictions which were not significantly different from zero." title="" id="45" name="Picture"/>
+            <wp:docPr descr="Figure 5: Physical activity by sleep onset. The panels on the left show the curvilinear relationship between sleep onset and each of the physical activity outcomes at the ages indicated in each column. The panels on the right show the same relationships but by age continuously. The white band indicates predictions which were not significantly different from zero." title="" id="46" name="Picture"/>
             <a:graphic>
               <a:graphicData uri="http://schemas.openxmlformats.org/drawingml/2006/picture">
                 <pic:pic>
                   <pic:nvPicPr>
-                    <pic:cNvPr descr="../Figures/PA%20on%20scale_sleep_onset_lag%20by%20Age_nolog.jpg" id="46" name="Picture"/>
+                    <pic:cNvPr descr="../Figures/PA%20on%20scale_sleep_onset_lag%20by%20Age_nolog.jpg" id="47" name="Picture"/>
                     <pic:cNvPicPr>
                       <a:picLocks noChangeArrowheads="1" noChangeAspect="1"/>
                     </pic:cNvPicPr>
                   </pic:nvPicPr>
                   <pic:blipFill>
-                    <a:blip r:embed="rId44"/>
+                    <a:blip r:embed="rId45"/>
                     <a:stretch>
                       <a:fillRect/>
                     </a:stretch>
@@ -10813,14 +11081,14 @@
       <w:pPr>
         <w:pStyle w:val="ImageCaption"/>
       </w:pPr>
-      <w:bookmarkStart w:id="47" w:name="fig:PA-by-sleep-onset-fig"/>
-      <w:bookmarkEnd w:id="47"/>
+      <w:bookmarkStart w:id="48" w:name="fig:PA-by-sleep-onset-fig"/>
+      <w:bookmarkEnd w:id="48"/>
       <w:r>
         <w:t xml:space="preserve">Figure 5: Physical activity by sleep onset. The panels on the left show the curvilinear relationship between sleep onset and each of the physical activity outcomes at the ages indicated in each column. The panels on the right show the same relationships but by age continuously. The white band indicates predictions which were not significantly different from zero.</w:t>
       </w:r>
     </w:p>
-    <w:bookmarkEnd w:id="48"/>
-    <w:bookmarkStart w:id="53" w:name="X5a2a01188f3a4beede9359d895f20f75d3e9c49"/>
+    <w:bookmarkEnd w:id="49"/>
+    <w:bookmarkStart w:id="115" w:name="X5a2a01188f3a4beede9359d895f20f75d3e9c49"/>
     <w:p>
       <w:pPr>
         <w:pStyle w:val="berschrift2"/>
@@ -10903,18 +11171,18 @@
           <wp:inline>
             <wp:extent cx="3810000" cy="2540000"/>
             <wp:effectExtent b="0" l="0" r="0" t="0"/>
-            <wp:docPr descr="Figure 6: Physical activity by sleep regularity. The panels on the left show the curvilinear relationship between sleep regularity and each of the physical activity outcomes at the ages indicated in each column. The panels on the right show the same relationships but by age continuously. The white band indicates predictions which were not significantly different from zero." title="" id="50" name="Picture"/>
+            <wp:docPr descr="Figure 6: Physical activity by sleep regularity. The panels on the left show the curvilinear relationship between sleep regularity and each of the physical activity outcomes at the ages indicated in each column. The panels on the right show the same relationships but by age continuously. The white band indicates predictions which were not significantly different from zero." title="" id="51" name="Picture"/>
             <a:graphic>
               <a:graphicData uri="http://schemas.openxmlformats.org/drawingml/2006/picture">
                 <pic:pic>
                   <pic:nvPicPr>
-                    <pic:cNvPr descr="../Figures/PA%20on%20scale_sleep_regularity_lag%20by%20Age_nolog.jpg" id="51" name="Picture"/>
+                    <pic:cNvPr descr="../Figures/PA%20on%20scale_sleep_regularity_lag%20by%20Age_nolog.jpg" id="52" name="Picture"/>
                     <pic:cNvPicPr>
                       <a:picLocks noChangeArrowheads="1" noChangeAspect="1"/>
                     </pic:cNvPicPr>
                   </pic:nvPicPr>
                   <pic:blipFill>
-                    <a:blip r:embed="rId49"/>
+                    <a:blip r:embed="rId50"/>
                     <a:stretch>
                       <a:fillRect/>
                     </a:stretch>
@@ -10945,14 +11213,2151 @@
       <w:pPr>
         <w:pStyle w:val="ImageCaption"/>
       </w:pPr>
-      <w:bookmarkStart w:id="52" w:name="fig:PA-by-sleep-regularity-fig"/>
-      <w:bookmarkEnd w:id="52"/>
+      <w:bookmarkStart w:id="53" w:name="fig:PA-by-sleep-regularity-fig"/>
+      <w:bookmarkEnd w:id="53"/>
       <w:r>
         <w:t xml:space="preserve">Figure 6: Physical activity by sleep regularity. The panels on the left show the curvilinear relationship between sleep regularity and each of the physical activity outcomes at the ages indicated in each column. The panels on the right show the same relationships but by age continuously. The white band indicates predictions which were not significantly different from zero.</w:t>
       </w:r>
     </w:p>
-    <w:bookmarkEnd w:id="53"/>
-    <w:bookmarkEnd w:id="54"/>
+    <w:bookmarkStart w:id="114" w:name="refs"/>
+    <w:bookmarkStart w:id="55" w:name="ref-luysterSleepHealthImperative2012"/>
+    <w:p>
+      <w:pPr>
+        <w:pStyle w:val="Literaturverzeichnis"/>
+      </w:pPr>
+      <w:r>
+        <w:t xml:space="preserve">1</w:t>
+      </w:r>
+      <w:r>
+        <w:t xml:space="preserve"> </w:t>
+      </w:r>
+      <w:r>
+        <w:t xml:space="preserve">	</w:t>
+      </w:r>
+      <w:r>
+        <w:t xml:space="preserve">Luyster FS, Strollo PJ, Zee PC,</w:t>
+      </w:r>
+      <w:r>
+        <w:t xml:space="preserve"> </w:t>
+      </w:r>
+      <w:r>
+        <w:rPr>
+          <w:i/>
+          <w:iCs/>
+        </w:rPr>
+        <w:t xml:space="preserve">et al.</w:t>
+      </w:r>
+      <w:r>
+        <w:t xml:space="preserve"> Sleep:</w:t>
+      </w:r>
+      <w:r>
+        <w:t xml:space="preserve"> </w:t>
+      </w:r>
+      <w:r>
+        <w:t xml:space="preserve">A Health Imperative</w:t>
+      </w:r>
+      <w:r>
+        <w:t xml:space="preserve">.</w:t>
+      </w:r>
+      <w:r>
+        <w:t xml:space="preserve"> </w:t>
+      </w:r>
+      <w:r>
+        <w:rPr>
+          <w:i/>
+          <w:iCs/>
+        </w:rPr>
+        <w:t xml:space="preserve">Sleep</w:t>
+      </w:r>
+      <w:r>
+        <w:t xml:space="preserve">. 2012;35:727–34. doi:</w:t>
+      </w:r>
+      <w:r>
+        <w:t xml:space="preserve"> </w:t>
+      </w:r>
+      <w:hyperlink r:id="rId54">
+        <w:r>
+          <w:rPr>
+            <w:rStyle w:val="Hyperlink"/>
+          </w:rPr>
+          <w:t xml:space="preserve">10.5665/sleep.1846</w:t>
+        </w:r>
+      </w:hyperlink>
+    </w:p>
+    <w:bookmarkEnd w:id="55"/>
+    <w:bookmarkStart w:id="57" w:name="ref-huangSleepPhysicalActivity2022"/>
+    <w:p>
+      <w:pPr>
+        <w:pStyle w:val="Literaturverzeichnis"/>
+      </w:pPr>
+      <w:r>
+        <w:t xml:space="preserve">2</w:t>
+      </w:r>
+      <w:r>
+        <w:t xml:space="preserve"> </w:t>
+      </w:r>
+      <w:r>
+        <w:t xml:space="preserve">	</w:t>
+      </w:r>
+      <w:r>
+        <w:t xml:space="preserve">Huang B-H, Duncan MJ, Cistulli PA,</w:t>
+      </w:r>
+      <w:r>
+        <w:t xml:space="preserve"> </w:t>
+      </w:r>
+      <w:r>
+        <w:rPr>
+          <w:i/>
+          <w:iCs/>
+        </w:rPr>
+        <w:t xml:space="preserve">et al.</w:t>
+      </w:r>
+      <w:r>
+        <w:t xml:space="preserve"> Sleep and physical activity in relation to all-cause, cardiovascular disease and cancer mortality risk.</w:t>
+      </w:r>
+      <w:r>
+        <w:t xml:space="preserve"> </w:t>
+      </w:r>
+      <w:r>
+        <w:rPr>
+          <w:i/>
+          <w:iCs/>
+        </w:rPr>
+        <w:t xml:space="preserve">British Journal of Sports Medicine</w:t>
+      </w:r>
+      <w:r>
+        <w:t xml:space="preserve">. 2022;56:718–24. doi:</w:t>
+      </w:r>
+      <w:r>
+        <w:t xml:space="preserve"> </w:t>
+      </w:r>
+      <w:hyperlink r:id="rId56">
+        <w:r>
+          <w:rPr>
+            <w:rStyle w:val="Hyperlink"/>
+          </w:rPr>
+          <w:t xml:space="preserve">10.1136/bjsports-2021-104046</w:t>
+        </w:r>
+      </w:hyperlink>
+    </w:p>
+    <w:bookmarkEnd w:id="57"/>
+    <w:bookmarkStart w:id="59" w:name="ref-kwokSelfReportedSleep2018"/>
+    <w:p>
+      <w:pPr>
+        <w:pStyle w:val="Literaturverzeichnis"/>
+      </w:pPr>
+      <w:r>
+        <w:t xml:space="preserve">3</w:t>
+      </w:r>
+      <w:r>
+        <w:t xml:space="preserve"> </w:t>
+      </w:r>
+      <w:r>
+        <w:t xml:space="preserve">	</w:t>
+      </w:r>
+      <w:r>
+        <w:t xml:space="preserve">Kwok CS, Kontopantelis E, Kuligowski G,</w:t>
+      </w:r>
+      <w:r>
+        <w:t xml:space="preserve"> </w:t>
+      </w:r>
+      <w:r>
+        <w:rPr>
+          <w:i/>
+          <w:iCs/>
+        </w:rPr>
+        <w:t xml:space="preserve">et al.</w:t>
+      </w:r>
+      <w:r>
+        <w:t xml:space="preserve"> Self-</w:t>
+      </w:r>
+      <w:r>
+        <w:t xml:space="preserve">Reported Sleep Duration</w:t>
+      </w:r>
+      <w:r>
+        <w:t xml:space="preserve"> </w:t>
+      </w:r>
+      <w:r>
+        <w:t xml:space="preserve">and</w:t>
+      </w:r>
+      <w:r>
+        <w:t xml:space="preserve"> </w:t>
+      </w:r>
+      <w:r>
+        <w:t xml:space="preserve">Quality</w:t>
+      </w:r>
+      <w:r>
+        <w:t xml:space="preserve"> </w:t>
+      </w:r>
+      <w:r>
+        <w:t xml:space="preserve">and</w:t>
+      </w:r>
+      <w:r>
+        <w:t xml:space="preserve"> </w:t>
+      </w:r>
+      <w:r>
+        <w:t xml:space="preserve">Cardiovascular Disease</w:t>
+      </w:r>
+      <w:r>
+        <w:t xml:space="preserve"> </w:t>
+      </w:r>
+      <w:r>
+        <w:t xml:space="preserve">and</w:t>
+      </w:r>
+      <w:r>
+        <w:t xml:space="preserve"> </w:t>
+      </w:r>
+      <w:r>
+        <w:t xml:space="preserve">Mortality</w:t>
+      </w:r>
+      <w:r>
+        <w:t xml:space="preserve">:</w:t>
+      </w:r>
+      <w:r>
+        <w:t xml:space="preserve"> </w:t>
+      </w:r>
+      <w:r>
+        <w:t xml:space="preserve">A Dose</w:t>
+      </w:r>
+      <w:r>
+        <w:t xml:space="preserve">-</w:t>
+      </w:r>
+      <w:r>
+        <w:t xml:space="preserve">Response Meta</w:t>
+      </w:r>
+      <w:r>
+        <w:t xml:space="preserve">-</w:t>
+      </w:r>
+      <w:r>
+        <w:t xml:space="preserve">Analysis</w:t>
+      </w:r>
+      <w:r>
+        <w:t xml:space="preserve">.</w:t>
+      </w:r>
+      <w:r>
+        <w:t xml:space="preserve"> </w:t>
+      </w:r>
+      <w:r>
+        <w:rPr>
+          <w:i/>
+          <w:iCs/>
+        </w:rPr>
+        <w:t xml:space="preserve">Journal of the American Heart Association</w:t>
+      </w:r>
+      <w:r>
+        <w:t xml:space="preserve">. 2018;7. doi:</w:t>
+      </w:r>
+      <w:r>
+        <w:t xml:space="preserve"> </w:t>
+      </w:r>
+      <w:hyperlink r:id="rId58">
+        <w:r>
+          <w:rPr>
+            <w:rStyle w:val="Hyperlink"/>
+          </w:rPr>
+          <w:t xml:space="preserve">10.1161/jaha.118.008552</w:t>
+        </w:r>
+      </w:hyperlink>
+    </w:p>
+    <w:bookmarkEnd w:id="59"/>
+    <w:bookmarkStart w:id="61" w:name="ref-maSleepDurationTotal2016"/>
+    <w:p>
+      <w:pPr>
+        <w:pStyle w:val="Literaturverzeichnis"/>
+      </w:pPr>
+      <w:r>
+        <w:t xml:space="preserve">4</w:t>
+      </w:r>
+      <w:r>
+        <w:t xml:space="preserve"> </w:t>
+      </w:r>
+      <w:r>
+        <w:t xml:space="preserve">	</w:t>
+      </w:r>
+      <w:r>
+        <w:t xml:space="preserve">Ma Q-Q, Yao Q, Lin L,</w:t>
+      </w:r>
+      <w:r>
+        <w:t xml:space="preserve"> </w:t>
+      </w:r>
+      <w:r>
+        <w:rPr>
+          <w:i/>
+          <w:iCs/>
+        </w:rPr>
+        <w:t xml:space="preserve">et al.</w:t>
+      </w:r>
+      <w:r>
+        <w:t xml:space="preserve"> Sleep duration and total cancer mortality: A meta-analysis of prospective studies.</w:t>
+      </w:r>
+      <w:r>
+        <w:t xml:space="preserve"> </w:t>
+      </w:r>
+      <w:r>
+        <w:rPr>
+          <w:i/>
+          <w:iCs/>
+        </w:rPr>
+        <w:t xml:space="preserve">Sleep Medicine</w:t>
+      </w:r>
+      <w:r>
+        <w:t xml:space="preserve">. 2016;27–28:39–44. doi:</w:t>
+      </w:r>
+      <w:r>
+        <w:t xml:space="preserve"> </w:t>
+      </w:r>
+      <w:hyperlink r:id="rId60">
+        <w:r>
+          <w:rPr>
+            <w:rStyle w:val="Hyperlink"/>
+          </w:rPr>
+          <w:t xml:space="preserve">10.1016/j.sleep.2016.06.036</w:t>
+        </w:r>
+      </w:hyperlink>
+    </w:p>
+    <w:bookmarkEnd w:id="61"/>
+    <w:bookmarkStart w:id="63" w:name="X346925cdfc2f52c89d96d4a14a2ac1b330702a3"/>
+    <w:p>
+      <w:pPr>
+        <w:pStyle w:val="Literaturverzeichnis"/>
+      </w:pPr>
+      <w:r>
+        <w:t xml:space="preserve">5</w:t>
+      </w:r>
+      <w:r>
+        <w:t xml:space="preserve"> </w:t>
+      </w:r>
+      <w:r>
+        <w:t xml:space="preserve">	</w:t>
+      </w:r>
+      <w:r>
+        <w:t xml:space="preserve">Wakefield JRH, Bowe M, Kellezi B,</w:t>
+      </w:r>
+      <w:r>
+        <w:t xml:space="preserve"> </w:t>
+      </w:r>
+      <w:r>
+        <w:rPr>
+          <w:i/>
+          <w:iCs/>
+        </w:rPr>
+        <w:t xml:space="preserve">et al.</w:t>
+      </w:r>
+      <w:r>
+        <w:t xml:space="preserve"> Longitudinal associations between family identification, loneliness, depression, and sleep quality.</w:t>
+      </w:r>
+      <w:r>
+        <w:t xml:space="preserve"> </w:t>
+      </w:r>
+      <w:r>
+        <w:rPr>
+          <w:i/>
+          <w:iCs/>
+        </w:rPr>
+        <w:t xml:space="preserve">British Journal of Health Psychology</w:t>
+      </w:r>
+      <w:r>
+        <w:t xml:space="preserve">. 2020;25:1–16. doi:</w:t>
+      </w:r>
+      <w:r>
+        <w:t xml:space="preserve"> </w:t>
+      </w:r>
+      <w:hyperlink r:id="rId62">
+        <w:r>
+          <w:rPr>
+            <w:rStyle w:val="Hyperlink"/>
+          </w:rPr>
+          <w:t xml:space="preserve">10.1111/bjhp.12391</w:t>
+        </w:r>
+      </w:hyperlink>
+    </w:p>
+    <w:bookmarkEnd w:id="63"/>
+    <w:bookmarkStart w:id="65" w:name="ref-wheatonShortSleepDuration2018"/>
+    <w:p>
+      <w:pPr>
+        <w:pStyle w:val="Literaturverzeichnis"/>
+      </w:pPr>
+      <w:r>
+        <w:t xml:space="preserve">6</w:t>
+      </w:r>
+      <w:r>
+        <w:t xml:space="preserve"> </w:t>
+      </w:r>
+      <w:r>
+        <w:t xml:space="preserve">	</w:t>
+      </w:r>
+      <w:r>
+        <w:t xml:space="preserve">Wheaton AG, Jones SE, Cooper AC,</w:t>
+      </w:r>
+      <w:r>
+        <w:t xml:space="preserve"> </w:t>
+      </w:r>
+      <w:r>
+        <w:rPr>
+          <w:i/>
+          <w:iCs/>
+        </w:rPr>
+        <w:t xml:space="preserve">et al.</w:t>
+      </w:r>
+      <w:r>
+        <w:t xml:space="preserve"> Short</w:t>
+      </w:r>
+      <w:r>
+        <w:t xml:space="preserve"> </w:t>
+      </w:r>
+      <w:r>
+        <w:t xml:space="preserve">Sleep Duration Among Middle School</w:t>
+      </w:r>
+      <w:r>
+        <w:t xml:space="preserve"> </w:t>
+      </w:r>
+      <w:r>
+        <w:t xml:space="preserve">and</w:t>
+      </w:r>
+      <w:r>
+        <w:t xml:space="preserve"> </w:t>
+      </w:r>
+      <w:r>
+        <w:t xml:space="preserve">High School Students</w:t>
+      </w:r>
+      <w:r>
+        <w:t xml:space="preserve"> </w:t>
+      </w:r>
+      <w:r>
+        <w:t xml:space="preserve">-</w:t>
+      </w:r>
+      <w:r>
+        <w:t xml:space="preserve"> </w:t>
+      </w:r>
+      <w:r>
+        <w:t xml:space="preserve">United States</w:t>
+      </w:r>
+      <w:r>
+        <w:t xml:space="preserve">, 2015.</w:t>
+      </w:r>
+      <w:r>
+        <w:t xml:space="preserve"> </w:t>
+      </w:r>
+      <w:r>
+        <w:rPr>
+          <w:i/>
+          <w:iCs/>
+        </w:rPr>
+        <w:t xml:space="preserve">MMWR Morbidity and mortality weekly report</w:t>
+      </w:r>
+      <w:r>
+        <w:t xml:space="preserve">. 2018;67:85–90. doi:</w:t>
+      </w:r>
+      <w:r>
+        <w:t xml:space="preserve"> </w:t>
+      </w:r>
+      <w:hyperlink r:id="rId64">
+        <w:r>
+          <w:rPr>
+            <w:rStyle w:val="Hyperlink"/>
+          </w:rPr>
+          <w:t xml:space="preserve">10.15585/mmwr.mm6703a1</w:t>
+        </w:r>
+      </w:hyperlink>
+    </w:p>
+    <w:bookmarkEnd w:id="65"/>
+    <w:bookmarkStart w:id="67" w:name="ref-liuPrevalenceHealthySleep2016"/>
+    <w:p>
+      <w:pPr>
+        <w:pStyle w:val="Literaturverzeichnis"/>
+      </w:pPr>
+      <w:r>
+        <w:t xml:space="preserve">7</w:t>
+      </w:r>
+      <w:r>
+        <w:t xml:space="preserve"> </w:t>
+      </w:r>
+      <w:r>
+        <w:t xml:space="preserve">	</w:t>
+      </w:r>
+      <w:r>
+        <w:t xml:space="preserve">Liu Y, Wheaton AG, Chapman DP,</w:t>
+      </w:r>
+      <w:r>
+        <w:t xml:space="preserve"> </w:t>
+      </w:r>
+      <w:r>
+        <w:rPr>
+          <w:i/>
+          <w:iCs/>
+        </w:rPr>
+        <w:t xml:space="preserve">et al.</w:t>
+      </w:r>
+      <w:r>
+        <w:t xml:space="preserve"> Prevalence of</w:t>
+      </w:r>
+      <w:r>
+        <w:t xml:space="preserve"> </w:t>
+      </w:r>
+      <w:r>
+        <w:t xml:space="preserve">Healthy Sleep Duration</w:t>
+      </w:r>
+      <w:r>
+        <w:t xml:space="preserve"> </w:t>
+      </w:r>
+      <w:r>
+        <w:t xml:space="preserve">among</w:t>
+      </w:r>
+      <w:r>
+        <w:t xml:space="preserve"> </w:t>
+      </w:r>
+      <w:r>
+        <w:t xml:space="preserve">Adults–United States</w:t>
+      </w:r>
+      <w:r>
+        <w:t xml:space="preserve">, 2014.</w:t>
+      </w:r>
+      <w:r>
+        <w:t xml:space="preserve"> </w:t>
+      </w:r>
+      <w:r>
+        <w:rPr>
+          <w:i/>
+          <w:iCs/>
+        </w:rPr>
+        <w:t xml:space="preserve">MMWR Morbidity and mortality weekly report</w:t>
+      </w:r>
+      <w:r>
+        <w:t xml:space="preserve">. 2016;65:137–41. doi:</w:t>
+      </w:r>
+      <w:r>
+        <w:t xml:space="preserve"> </w:t>
+      </w:r>
+      <w:hyperlink r:id="rId66">
+        <w:r>
+          <w:rPr>
+            <w:rStyle w:val="Hyperlink"/>
+          </w:rPr>
+          <w:t xml:space="preserve">10.15585/mmwr.mm6506a1</w:t>
+        </w:r>
+      </w:hyperlink>
+    </w:p>
+    <w:bookmarkEnd w:id="67"/>
+    <w:bookmarkStart w:id="69" w:name="ref-klinePhysicalActivitySleep2021"/>
+    <w:p>
+      <w:pPr>
+        <w:pStyle w:val="Literaturverzeichnis"/>
+      </w:pPr>
+      <w:r>
+        <w:t xml:space="preserve">8</w:t>
+      </w:r>
+      <w:r>
+        <w:t xml:space="preserve"> </w:t>
+      </w:r>
+      <w:r>
+        <w:t xml:space="preserve">	</w:t>
+      </w:r>
+      <w:r>
+        <w:t xml:space="preserve">Kline CE, Hillman CH, Bloodgood Sheppard B,</w:t>
+      </w:r>
+      <w:r>
+        <w:t xml:space="preserve"> </w:t>
+      </w:r>
+      <w:r>
+        <w:rPr>
+          <w:i/>
+          <w:iCs/>
+        </w:rPr>
+        <w:t xml:space="preserve">et al.</w:t>
+      </w:r>
+      <w:r>
+        <w:t xml:space="preserve"> Physical activity and sleep:</w:t>
+      </w:r>
+      <w:r>
+        <w:t xml:space="preserve"> </w:t>
+      </w:r>
+      <w:r>
+        <w:t xml:space="preserve">An</w:t>
+      </w:r>
+      <w:r>
+        <w:t xml:space="preserve"> </w:t>
+      </w:r>
+      <w:r>
+        <w:t xml:space="preserve">updated umbrella review of the 2018</w:t>
+      </w:r>
+      <w:r>
+        <w:t xml:space="preserve"> </w:t>
+      </w:r>
+      <w:r>
+        <w:t xml:space="preserve">Physical Activity Guidelines Advisory Committee</w:t>
+      </w:r>
+      <w:r>
+        <w:t xml:space="preserve"> </w:t>
+      </w:r>
+      <w:r>
+        <w:t xml:space="preserve">report.</w:t>
+      </w:r>
+      <w:r>
+        <w:t xml:space="preserve"> </w:t>
+      </w:r>
+      <w:r>
+        <w:rPr>
+          <w:i/>
+          <w:iCs/>
+        </w:rPr>
+        <w:t xml:space="preserve">Sleep Medicine Reviews</w:t>
+      </w:r>
+      <w:r>
+        <w:t xml:space="preserve">. 2021;58:101489. doi:</w:t>
+      </w:r>
+      <w:r>
+        <w:t xml:space="preserve"> </w:t>
+      </w:r>
+      <w:hyperlink r:id="rId68">
+        <w:r>
+          <w:rPr>
+            <w:rStyle w:val="Hyperlink"/>
+          </w:rPr>
+          <w:t xml:space="preserve">10.1016/j.smrv.2021.101489</w:t>
+        </w:r>
+      </w:hyperlink>
+    </w:p>
+    <w:bookmarkEnd w:id="69"/>
+    <w:bookmarkStart w:id="71" w:name="ref-kredlowEffectsPhysicalActivity2015"/>
+    <w:p>
+      <w:pPr>
+        <w:pStyle w:val="Literaturverzeichnis"/>
+      </w:pPr>
+      <w:r>
+        <w:t xml:space="preserve">9</w:t>
+      </w:r>
+      <w:r>
+        <w:t xml:space="preserve"> </w:t>
+      </w:r>
+      <w:r>
+        <w:t xml:space="preserve">	</w:t>
+      </w:r>
+      <w:r>
+        <w:t xml:space="preserve">Kredlow MA, Capozzoli MC, Hearon BA,</w:t>
+      </w:r>
+      <w:r>
+        <w:t xml:space="preserve"> </w:t>
+      </w:r>
+      <w:r>
+        <w:rPr>
+          <w:i/>
+          <w:iCs/>
+        </w:rPr>
+        <w:t xml:space="preserve">et al.</w:t>
+      </w:r>
+      <w:r>
+        <w:t xml:space="preserve"> The effects of physical activity on sleep: A meta-analytic review.</w:t>
+      </w:r>
+      <w:r>
+        <w:t xml:space="preserve"> </w:t>
+      </w:r>
+      <w:r>
+        <w:rPr>
+          <w:i/>
+          <w:iCs/>
+        </w:rPr>
+        <w:t xml:space="preserve">Journal of Behavioral Medicine</w:t>
+      </w:r>
+      <w:r>
+        <w:t xml:space="preserve">. 2015;38:427–49. doi:</w:t>
+      </w:r>
+      <w:r>
+        <w:t xml:space="preserve"> </w:t>
+      </w:r>
+      <w:hyperlink r:id="rId70">
+        <w:r>
+          <w:rPr>
+            <w:rStyle w:val="Hyperlink"/>
+          </w:rPr>
+          <w:t xml:space="preserve">10.1007/s10865-015-9617-6</w:t>
+        </w:r>
+      </w:hyperlink>
+    </w:p>
+    <w:bookmarkEnd w:id="71"/>
+    <w:bookmarkStart w:id="73" w:name="ref-bullWorldHealthOrganization2020"/>
+    <w:p>
+      <w:pPr>
+        <w:pStyle w:val="Literaturverzeichnis"/>
+      </w:pPr>
+      <w:r>
+        <w:t xml:space="preserve">10</w:t>
+      </w:r>
+      <w:r>
+        <w:t xml:space="preserve"> </w:t>
+      </w:r>
+      <w:r>
+        <w:t xml:space="preserve">	</w:t>
+      </w:r>
+      <w:r>
+        <w:t xml:space="preserve">Bull FC, Al-Ansari SS, Biddle S,</w:t>
+      </w:r>
+      <w:r>
+        <w:t xml:space="preserve"> </w:t>
+      </w:r>
+      <w:r>
+        <w:rPr>
+          <w:i/>
+          <w:iCs/>
+        </w:rPr>
+        <w:t xml:space="preserve">et al.</w:t>
+      </w:r>
+      <w:r>
+        <w:t xml:space="preserve"> World</w:t>
+      </w:r>
+      <w:r>
+        <w:t xml:space="preserve"> </w:t>
+      </w:r>
+      <w:r>
+        <w:t xml:space="preserve">Health Organization</w:t>
+      </w:r>
+      <w:r>
+        <w:t xml:space="preserve"> </w:t>
+      </w:r>
+      <w:r>
+        <w:t xml:space="preserve">2020 guidelines on physical activity and sedentary behaviour.</w:t>
+      </w:r>
+      <w:r>
+        <w:t xml:space="preserve"> </w:t>
+      </w:r>
+      <w:r>
+        <w:rPr>
+          <w:i/>
+          <w:iCs/>
+        </w:rPr>
+        <w:t xml:space="preserve">British Journal of Sports Medicine</w:t>
+      </w:r>
+      <w:r>
+        <w:t xml:space="preserve">. 2020;54:1451–62. doi:</w:t>
+      </w:r>
+      <w:r>
+        <w:t xml:space="preserve"> </w:t>
+      </w:r>
+      <w:hyperlink r:id="rId72">
+        <w:r>
+          <w:rPr>
+            <w:rStyle w:val="Hyperlink"/>
+          </w:rPr>
+          <w:t xml:space="preserve">10.1136/bjsports-2020-102955</w:t>
+        </w:r>
+      </w:hyperlink>
+    </w:p>
+    <w:bookmarkEnd w:id="73"/>
+    <w:bookmarkStart w:id="75" w:name="ref-antczakPhysicalActivitySleep2020"/>
+    <w:p>
+      <w:pPr>
+        <w:pStyle w:val="Literaturverzeichnis"/>
+      </w:pPr>
+      <w:r>
+        <w:t xml:space="preserve">11</w:t>
+      </w:r>
+      <w:r>
+        <w:t xml:space="preserve"> </w:t>
+      </w:r>
+      <w:r>
+        <w:t xml:space="preserve">	</w:t>
+      </w:r>
+      <w:r>
+        <w:t xml:space="preserve">Antczak D, Lonsdale C, Lee J,</w:t>
+      </w:r>
+      <w:r>
+        <w:t xml:space="preserve"> </w:t>
+      </w:r>
+      <w:r>
+        <w:rPr>
+          <w:i/>
+          <w:iCs/>
+        </w:rPr>
+        <w:t xml:space="preserve">et al.</w:t>
+      </w:r>
+      <w:r>
+        <w:t xml:space="preserve"> Physical activity and sleep are inconsistently related in healthy children:</w:t>
+      </w:r>
+      <w:r>
+        <w:t xml:space="preserve"> </w:t>
+      </w:r>
+      <w:r>
+        <w:t xml:space="preserve">A</w:t>
+      </w:r>
+      <w:r>
+        <w:t xml:space="preserve"> </w:t>
+      </w:r>
+      <w:r>
+        <w:t xml:space="preserve">systematic review and meta-analysis.</w:t>
+      </w:r>
+      <w:r>
+        <w:t xml:space="preserve"> </w:t>
+      </w:r>
+      <w:r>
+        <w:rPr>
+          <w:i/>
+          <w:iCs/>
+        </w:rPr>
+        <w:t xml:space="preserve">Sleep Medicine Reviews</w:t>
+      </w:r>
+      <w:r>
+        <w:t xml:space="preserve">. 2020;51:101278. doi:</w:t>
+      </w:r>
+      <w:r>
+        <w:t xml:space="preserve"> </w:t>
+      </w:r>
+      <w:hyperlink r:id="rId74">
+        <w:r>
+          <w:rPr>
+            <w:rStyle w:val="Hyperlink"/>
+          </w:rPr>
+          <w:t xml:space="preserve">10.1016/j.smrv.2020.101278</w:t>
+        </w:r>
+      </w:hyperlink>
+    </w:p>
+    <w:bookmarkEnd w:id="75"/>
+    <w:bookmarkStart w:id="77" w:name="ref-langRelationshipPhysicalActivity2016"/>
+    <w:p>
+      <w:pPr>
+        <w:pStyle w:val="Literaturverzeichnis"/>
+      </w:pPr>
+      <w:r>
+        <w:t xml:space="preserve">12</w:t>
+      </w:r>
+      <w:r>
+        <w:t xml:space="preserve"> </w:t>
+      </w:r>
+      <w:r>
+        <w:t xml:space="preserve">	</w:t>
+      </w:r>
+      <w:r>
+        <w:t xml:space="preserve">Lang C, Kalak N, Brand S,</w:t>
+      </w:r>
+      <w:r>
+        <w:t xml:space="preserve"> </w:t>
+      </w:r>
+      <w:r>
+        <w:rPr>
+          <w:i/>
+          <w:iCs/>
+        </w:rPr>
+        <w:t xml:space="preserve">et al.</w:t>
+      </w:r>
+      <w:r>
+        <w:t xml:space="preserve"> The relationship between physical activity and sleep from mid adolescence to early adulthood.</w:t>
+      </w:r>
+      <w:r>
+        <w:t xml:space="preserve"> </w:t>
+      </w:r>
+      <w:r>
+        <w:t xml:space="preserve">A</w:t>
+      </w:r>
+      <w:r>
+        <w:t xml:space="preserve"> </w:t>
+      </w:r>
+      <w:r>
+        <w:t xml:space="preserve">systematic review of methodological approaches and meta-analysis.</w:t>
+      </w:r>
+      <w:r>
+        <w:t xml:space="preserve"> </w:t>
+      </w:r>
+      <w:r>
+        <w:rPr>
+          <w:i/>
+          <w:iCs/>
+        </w:rPr>
+        <w:t xml:space="preserve">Sleep Medicine Reviews</w:t>
+      </w:r>
+      <w:r>
+        <w:t xml:space="preserve">. 2016;28:32–45. doi:</w:t>
+      </w:r>
+      <w:r>
+        <w:t xml:space="preserve"> </w:t>
+      </w:r>
+      <w:hyperlink r:id="rId76">
+        <w:r>
+          <w:rPr>
+            <w:rStyle w:val="Hyperlink"/>
+          </w:rPr>
+          <w:t xml:space="preserve">10.1016/j.smrv.2015.07.004</w:t>
+        </w:r>
+      </w:hyperlink>
+    </w:p>
+    <w:bookmarkEnd w:id="77"/>
+    <w:bookmarkStart w:id="79" w:name="ref-aielloEffectExerciseTraining2016"/>
+    <w:p>
+      <w:pPr>
+        <w:pStyle w:val="Literaturverzeichnis"/>
+      </w:pPr>
+      <w:r>
+        <w:t xml:space="preserve">13</w:t>
+      </w:r>
+      <w:r>
+        <w:t xml:space="preserve"> </w:t>
+      </w:r>
+      <w:r>
+        <w:t xml:space="preserve">	</w:t>
+      </w:r>
+      <w:r>
+        <w:t xml:space="preserve">Aiello KD, Caughey WG, Nelluri B,</w:t>
+      </w:r>
+      <w:r>
+        <w:t xml:space="preserve"> </w:t>
+      </w:r>
+      <w:r>
+        <w:rPr>
+          <w:i/>
+          <w:iCs/>
+        </w:rPr>
+        <w:t xml:space="preserve">et al.</w:t>
+      </w:r>
+      <w:r>
+        <w:t xml:space="preserve"> Effect of exercise training on sleep apnea:</w:t>
+      </w:r>
+      <w:r>
+        <w:t xml:space="preserve"> </w:t>
+      </w:r>
+      <w:r>
+        <w:t xml:space="preserve">A</w:t>
+      </w:r>
+      <w:r>
+        <w:t xml:space="preserve"> </w:t>
+      </w:r>
+      <w:r>
+        <w:t xml:space="preserve">systematic review and meta-analysis.</w:t>
+      </w:r>
+      <w:r>
+        <w:t xml:space="preserve"> </w:t>
+      </w:r>
+      <w:r>
+        <w:rPr>
+          <w:i/>
+          <w:iCs/>
+        </w:rPr>
+        <w:t xml:space="preserve">Respiratory Medicine</w:t>
+      </w:r>
+      <w:r>
+        <w:t xml:space="preserve">. 2016;116:85–92. doi:</w:t>
+      </w:r>
+      <w:r>
+        <w:t xml:space="preserve"> </w:t>
+      </w:r>
+      <w:hyperlink r:id="rId78">
+        <w:r>
+          <w:rPr>
+            <w:rStyle w:val="Hyperlink"/>
+          </w:rPr>
+          <w:t xml:space="preserve">10.1016/j.rmed.2016.05.015</w:t>
+        </w:r>
+      </w:hyperlink>
+    </w:p>
+    <w:bookmarkEnd w:id="79"/>
+    <w:bookmarkStart w:id="81" w:name="ref-bannoExerciseCanImprove2018"/>
+    <w:p>
+      <w:pPr>
+        <w:pStyle w:val="Literaturverzeichnis"/>
+      </w:pPr>
+      <w:r>
+        <w:t xml:space="preserve">14</w:t>
+      </w:r>
+      <w:r>
+        <w:t xml:space="preserve"> </w:t>
+      </w:r>
+      <w:r>
+        <w:t xml:space="preserve">	</w:t>
+      </w:r>
+      <w:r>
+        <w:t xml:space="preserve">Banno M, Harada Y, Taniguchi M,</w:t>
+      </w:r>
+      <w:r>
+        <w:t xml:space="preserve"> </w:t>
+      </w:r>
+      <w:r>
+        <w:rPr>
+          <w:i/>
+          <w:iCs/>
+        </w:rPr>
+        <w:t xml:space="preserve">et al.</w:t>
+      </w:r>
+      <w:r>
+        <w:t xml:space="preserve"> Exercise can improve sleep quality:</w:t>
+      </w:r>
+      <w:r>
+        <w:t xml:space="preserve"> </w:t>
+      </w:r>
+      <w:r>
+        <w:t xml:space="preserve">A</w:t>
+      </w:r>
+      <w:r>
+        <w:t xml:space="preserve"> </w:t>
+      </w:r>
+      <w:r>
+        <w:t xml:space="preserve">systematic review and meta-analysis.</w:t>
+      </w:r>
+      <w:r>
+        <w:t xml:space="preserve"> </w:t>
+      </w:r>
+      <w:r>
+        <w:rPr>
+          <w:i/>
+          <w:iCs/>
+        </w:rPr>
+        <w:t xml:space="preserve">PeerJ</w:t>
+      </w:r>
+      <w:r>
+        <w:t xml:space="preserve">. 2018;2018. doi:</w:t>
+      </w:r>
+      <w:r>
+        <w:t xml:space="preserve"> </w:t>
+      </w:r>
+      <w:hyperlink r:id="rId80">
+        <w:r>
+          <w:rPr>
+            <w:rStyle w:val="Hyperlink"/>
+          </w:rPr>
+          <w:t xml:space="preserve">10.7717/peerj.5172</w:t>
+        </w:r>
+      </w:hyperlink>
+    </w:p>
+    <w:bookmarkEnd w:id="81"/>
+    <w:bookmarkStart w:id="83" w:name="ref-bartelProtectiveRiskFactors2015"/>
+    <w:p>
+      <w:pPr>
+        <w:pStyle w:val="Literaturverzeichnis"/>
+      </w:pPr>
+      <w:r>
+        <w:t xml:space="preserve">15</w:t>
+      </w:r>
+      <w:r>
+        <w:t xml:space="preserve"> </w:t>
+      </w:r>
+      <w:r>
+        <w:t xml:space="preserve">	</w:t>
+      </w:r>
+      <w:r>
+        <w:t xml:space="preserve">Bartel KA, Gradisar M, Williamson P. Protective and risk factors for adolescent sleep:</w:t>
+      </w:r>
+      <w:r>
+        <w:t xml:space="preserve"> </w:t>
+      </w:r>
+      <w:r>
+        <w:t xml:space="preserve">A</w:t>
+      </w:r>
+      <w:r>
+        <w:t xml:space="preserve"> </w:t>
+      </w:r>
+      <w:r>
+        <w:t xml:space="preserve">meta-analytic review.</w:t>
+      </w:r>
+      <w:r>
+        <w:t xml:space="preserve"> </w:t>
+      </w:r>
+      <w:r>
+        <w:rPr>
+          <w:i/>
+          <w:iCs/>
+        </w:rPr>
+        <w:t xml:space="preserve">Sleep Medicine Reviews</w:t>
+      </w:r>
+      <w:r>
+        <w:t xml:space="preserve">. 2015;21:72–85. doi:</w:t>
+      </w:r>
+      <w:r>
+        <w:t xml:space="preserve"> </w:t>
+      </w:r>
+      <w:hyperlink r:id="rId82">
+        <w:r>
+          <w:rPr>
+            <w:rStyle w:val="Hyperlink"/>
+          </w:rPr>
+          <w:t xml:space="preserve">10.1016/j.smrv.2014.08.002</w:t>
+        </w:r>
+      </w:hyperlink>
+    </w:p>
+    <w:bookmarkEnd w:id="83"/>
+    <w:bookmarkStart w:id="85" w:name="ref-edwardsAssessingImpactDiet2019"/>
+    <w:p>
+      <w:pPr>
+        <w:pStyle w:val="Literaturverzeichnis"/>
+      </w:pPr>
+      <w:r>
+        <w:t xml:space="preserve">16</w:t>
+      </w:r>
+      <w:r>
+        <w:t xml:space="preserve"> </w:t>
+      </w:r>
+      <w:r>
+        <w:t xml:space="preserve">	</w:t>
+      </w:r>
+      <w:r>
+        <w:t xml:space="preserve">Edwards BA, Bristow C, O’Driscoll DM,</w:t>
+      </w:r>
+      <w:r>
+        <w:t xml:space="preserve"> </w:t>
+      </w:r>
+      <w:r>
+        <w:rPr>
+          <w:i/>
+          <w:iCs/>
+        </w:rPr>
+        <w:t xml:space="preserve">et al.</w:t>
+      </w:r>
+      <w:r>
+        <w:t xml:space="preserve"> Assessing the impact of diet, exercise and the combination of the two as a treatment for</w:t>
+      </w:r>
+      <w:r>
+        <w:t xml:space="preserve"> </w:t>
+      </w:r>
+      <w:r>
+        <w:t xml:space="preserve">OSA</w:t>
+      </w:r>
+      <w:r>
+        <w:t xml:space="preserve">:</w:t>
+      </w:r>
+      <w:r>
+        <w:t xml:space="preserve"> </w:t>
+      </w:r>
+      <w:r>
+        <w:t xml:space="preserve">A</w:t>
+      </w:r>
+      <w:r>
+        <w:t xml:space="preserve"> </w:t>
+      </w:r>
+      <w:r>
+        <w:t xml:space="preserve">systematic review and meta-analysis.</w:t>
+      </w:r>
+      <w:r>
+        <w:t xml:space="preserve"> </w:t>
+      </w:r>
+      <w:r>
+        <w:rPr>
+          <w:i/>
+          <w:iCs/>
+        </w:rPr>
+        <w:t xml:space="preserve">Respirology</w:t>
+      </w:r>
+      <w:r>
+        <w:t xml:space="preserve">. 2019;24:740–51. doi:</w:t>
+      </w:r>
+      <w:r>
+        <w:t xml:space="preserve"> </w:t>
+      </w:r>
+      <w:hyperlink r:id="rId84">
+        <w:r>
+          <w:rPr>
+            <w:rStyle w:val="Hyperlink"/>
+          </w:rPr>
+          <w:t xml:space="preserve">10.1111/resp.13580</w:t>
+        </w:r>
+      </w:hyperlink>
+    </w:p>
+    <w:bookmarkEnd w:id="85"/>
+    <w:bookmarkStart w:id="87" w:name="ref-gaoShorttermEfficacyMinimally2019"/>
+    <w:p>
+      <w:pPr>
+        <w:pStyle w:val="Literaturverzeichnis"/>
+      </w:pPr>
+      <w:r>
+        <w:t xml:space="preserve">17</w:t>
+      </w:r>
+      <w:r>
+        <w:t xml:space="preserve"> </w:t>
+      </w:r>
+      <w:r>
+        <w:t xml:space="preserve">	</w:t>
+      </w:r>
+      <w:r>
+        <w:t xml:space="preserve">Gao Y-N, Wu Y-C, Lin S-Y,</w:t>
+      </w:r>
+      <w:r>
+        <w:t xml:space="preserve"> </w:t>
+      </w:r>
+      <w:r>
+        <w:rPr>
+          <w:i/>
+          <w:iCs/>
+        </w:rPr>
+        <w:t xml:space="preserve">et al.</w:t>
+      </w:r>
+      <w:r>
+        <w:t xml:space="preserve"> Short-term efficacy of minimally invasive treatments for adult obstructive sleep apnea:</w:t>
+      </w:r>
+      <w:r>
+        <w:t xml:space="preserve"> </w:t>
+      </w:r>
+      <w:r>
+        <w:t xml:space="preserve">A</w:t>
+      </w:r>
+      <w:r>
+        <w:t xml:space="preserve"> </w:t>
+      </w:r>
+      <w:r>
+        <w:t xml:space="preserve">systematic review and network meta-analysis of randomized controlled trials.</w:t>
+      </w:r>
+      <w:r>
+        <w:t xml:space="preserve"> </w:t>
+      </w:r>
+      <w:r>
+        <w:rPr>
+          <w:i/>
+          <w:iCs/>
+        </w:rPr>
+        <w:t xml:space="preserve">Journal of the Formosan Medical Association</w:t>
+      </w:r>
+      <w:r>
+        <w:t xml:space="preserve">. 2019;118:750–65. doi:</w:t>
+      </w:r>
+      <w:r>
+        <w:t xml:space="preserve"> </w:t>
+      </w:r>
+      <w:hyperlink r:id="rId86">
+        <w:r>
+          <w:rPr>
+            <w:rStyle w:val="Hyperlink"/>
+          </w:rPr>
+          <w:t xml:space="preserve">10.1016/j.jfma.2018.02.008</w:t>
+        </w:r>
+      </w:hyperlink>
+    </w:p>
+    <w:bookmarkEnd w:id="87"/>
+    <w:bookmarkStart w:id="89" w:name="ref-iftikharComparativeEfficacyCPAP2017"/>
+    <w:p>
+      <w:pPr>
+        <w:pStyle w:val="Literaturverzeichnis"/>
+      </w:pPr>
+      <w:r>
+        <w:t xml:space="preserve">18</w:t>
+      </w:r>
+      <w:r>
+        <w:t xml:space="preserve"> </w:t>
+      </w:r>
+      <w:r>
+        <w:t xml:space="preserve">	</w:t>
+      </w:r>
+      <w:r>
+        <w:t xml:space="preserve">Iftikhar IH, Bittencourt L, Youngstedt SD,</w:t>
+      </w:r>
+      <w:r>
+        <w:t xml:space="preserve"> </w:t>
+      </w:r>
+      <w:r>
+        <w:rPr>
+          <w:i/>
+          <w:iCs/>
+        </w:rPr>
+        <w:t xml:space="preserve">et al.</w:t>
+      </w:r>
+      <w:r>
+        <w:t xml:space="preserve"> Comparative efficacy of</w:t>
+      </w:r>
+      <w:r>
+        <w:t xml:space="preserve"> </w:t>
+      </w:r>
+      <w:r>
+        <w:t xml:space="preserve">CPAP</w:t>
+      </w:r>
+      <w:r>
+        <w:t xml:space="preserve">,</w:t>
+      </w:r>
+      <w:r>
+        <w:t xml:space="preserve"> </w:t>
+      </w:r>
+      <w:r>
+        <w:t xml:space="preserve">MADs</w:t>
+      </w:r>
+      <w:r>
+        <w:t xml:space="preserve">, exercise-training, and dietary weight loss for sleep apnea: A network meta-analysis.</w:t>
+      </w:r>
+      <w:r>
+        <w:t xml:space="preserve"> </w:t>
+      </w:r>
+      <w:r>
+        <w:rPr>
+          <w:i/>
+          <w:iCs/>
+        </w:rPr>
+        <w:t xml:space="preserve">Sleep Medicine</w:t>
+      </w:r>
+      <w:r>
+        <w:t xml:space="preserve">. 2017;30:7–14. doi:</w:t>
+      </w:r>
+      <w:r>
+        <w:t xml:space="preserve"> </w:t>
+      </w:r>
+      <w:hyperlink r:id="rId88">
+        <w:r>
+          <w:rPr>
+            <w:rStyle w:val="Hyperlink"/>
+          </w:rPr>
+          <w:t xml:space="preserve">10.1016/j.sleep.2016.06.001</w:t>
+        </w:r>
+      </w:hyperlink>
+    </w:p>
+    <w:bookmarkEnd w:id="89"/>
+    <w:bookmarkStart w:id="91" w:name="ref-iftikharEffectsExerciseTraining2014"/>
+    <w:p>
+      <w:pPr>
+        <w:pStyle w:val="Literaturverzeichnis"/>
+      </w:pPr>
+      <w:r>
+        <w:t xml:space="preserve">19</w:t>
+      </w:r>
+      <w:r>
+        <w:t xml:space="preserve"> </w:t>
+      </w:r>
+      <w:r>
+        <w:t xml:space="preserve">	</w:t>
+      </w:r>
+      <w:r>
+        <w:t xml:space="preserve">Iftikhar IH, Kline CE, Youngstedt SD. Effects of exercise training on sleep apnea:</w:t>
+      </w:r>
+      <w:r>
+        <w:t xml:space="preserve"> </w:t>
+      </w:r>
+      <w:r>
+        <w:t xml:space="preserve">A</w:t>
+      </w:r>
+      <w:r>
+        <w:t xml:space="preserve"> </w:t>
+      </w:r>
+      <w:r>
+        <w:t xml:space="preserve">meta-analysis.</w:t>
+      </w:r>
+      <w:r>
+        <w:t xml:space="preserve"> </w:t>
+      </w:r>
+      <w:r>
+        <w:rPr>
+          <w:i/>
+          <w:iCs/>
+        </w:rPr>
+        <w:t xml:space="preserve">Lung</w:t>
+      </w:r>
+      <w:r>
+        <w:t xml:space="preserve">. 2014;192:175–84. doi:</w:t>
+      </w:r>
+      <w:r>
+        <w:t xml:space="preserve"> </w:t>
+      </w:r>
+      <w:hyperlink r:id="rId90">
+        <w:r>
+          <w:rPr>
+            <w:rStyle w:val="Hyperlink"/>
+          </w:rPr>
+          <w:t xml:space="preserve">10.1007/s00408-013-9511-3</w:t>
+        </w:r>
+      </w:hyperlink>
+    </w:p>
+    <w:bookmarkEnd w:id="91"/>
+    <w:bookmarkStart w:id="93" w:name="ref-janssenAssociationsScreenTime2020"/>
+    <w:p>
+      <w:pPr>
+        <w:pStyle w:val="Literaturverzeichnis"/>
+      </w:pPr>
+      <w:r>
+        <w:t xml:space="preserve">20</w:t>
+      </w:r>
+      <w:r>
+        <w:t xml:space="preserve"> </w:t>
+      </w:r>
+      <w:r>
+        <w:t xml:space="preserve">	</w:t>
+      </w:r>
+      <w:r>
+        <w:t xml:space="preserve">Janssen X, Martin A, Hughes AR,</w:t>
+      </w:r>
+      <w:r>
+        <w:t xml:space="preserve"> </w:t>
+      </w:r>
+      <w:r>
+        <w:rPr>
+          <w:i/>
+          <w:iCs/>
+        </w:rPr>
+        <w:t xml:space="preserve">et al.</w:t>
+      </w:r>
+      <w:r>
+        <w:t xml:space="preserve"> Associations of screen time, sedentary time and physical activity with sleep in under 5s:</w:t>
+      </w:r>
+      <w:r>
+        <w:t xml:space="preserve"> </w:t>
+      </w:r>
+      <w:r>
+        <w:t xml:space="preserve">A</w:t>
+      </w:r>
+      <w:r>
+        <w:t xml:space="preserve"> </w:t>
+      </w:r>
+      <w:r>
+        <w:t xml:space="preserve">systematic review and meta-analysis.</w:t>
+      </w:r>
+      <w:r>
+        <w:t xml:space="preserve"> </w:t>
+      </w:r>
+      <w:r>
+        <w:rPr>
+          <w:i/>
+          <w:iCs/>
+        </w:rPr>
+        <w:t xml:space="preserve">Sleep Medicine Reviews</w:t>
+      </w:r>
+      <w:r>
+        <w:t xml:space="preserve">. 2020;49:101226. doi:</w:t>
+      </w:r>
+      <w:r>
+        <w:t xml:space="preserve"> </w:t>
+      </w:r>
+      <w:hyperlink r:id="rId92">
+        <w:r>
+          <w:rPr>
+            <w:rStyle w:val="Hyperlink"/>
+          </w:rPr>
+          <w:t xml:space="preserve">10.1016/j.smrv.2019.101226</w:t>
+        </w:r>
+      </w:hyperlink>
+    </w:p>
+    <w:bookmarkEnd w:id="93"/>
+    <w:bookmarkStart w:id="95" w:name="ref-ledermanDoesExerciseImprove2019"/>
+    <w:p>
+      <w:pPr>
+        <w:pStyle w:val="Literaturverzeichnis"/>
+      </w:pPr>
+      <w:r>
+        <w:t xml:space="preserve">21</w:t>
+      </w:r>
+      <w:r>
+        <w:t xml:space="preserve"> </w:t>
+      </w:r>
+      <w:r>
+        <w:t xml:space="preserve">	</w:t>
+      </w:r>
+      <w:r>
+        <w:t xml:space="preserve">Lederman O, Ward PB, Firth J,</w:t>
+      </w:r>
+      <w:r>
+        <w:t xml:space="preserve"> </w:t>
+      </w:r>
+      <w:r>
+        <w:rPr>
+          <w:i/>
+          <w:iCs/>
+        </w:rPr>
+        <w:t xml:space="preserve">et al.</w:t>
+      </w:r>
+      <w:r>
+        <w:t xml:space="preserve"> Does exercise improve sleep quality in individuals with mental illness?</w:t>
+      </w:r>
+      <w:r>
+        <w:t xml:space="preserve"> </w:t>
+      </w:r>
+      <w:r>
+        <w:t xml:space="preserve">A</w:t>
+      </w:r>
+      <w:r>
+        <w:t xml:space="preserve"> </w:t>
+      </w:r>
+      <w:r>
+        <w:t xml:space="preserve">systematic review and meta-analysis.</w:t>
+      </w:r>
+      <w:r>
+        <w:t xml:space="preserve"> </w:t>
+      </w:r>
+      <w:r>
+        <w:rPr>
+          <w:i/>
+          <w:iCs/>
+        </w:rPr>
+        <w:t xml:space="preserve">Journal of Psychiatric Research</w:t>
+      </w:r>
+      <w:r>
+        <w:t xml:space="preserve">. 2019;109:96–106. doi:</w:t>
+      </w:r>
+      <w:r>
+        <w:t xml:space="preserve"> </w:t>
+      </w:r>
+      <w:hyperlink r:id="rId94">
+        <w:r>
+          <w:rPr>
+            <w:rStyle w:val="Hyperlink"/>
+          </w:rPr>
+          <w:t xml:space="preserve">10.1016/j.jpsychires.2018.11.004</w:t>
+        </w:r>
+      </w:hyperlink>
+    </w:p>
+    <w:bookmarkEnd w:id="95"/>
+    <w:bookmarkStart w:id="97" w:name="ref-lins-filhoEffectExerciseTraining2020"/>
+    <w:p>
+      <w:pPr>
+        <w:pStyle w:val="Literaturverzeichnis"/>
+      </w:pPr>
+      <w:r>
+        <w:t xml:space="preserve">22</w:t>
+      </w:r>
+      <w:r>
+        <w:t xml:space="preserve"> </w:t>
+      </w:r>
+      <w:r>
+        <w:t xml:space="preserve">	</w:t>
+      </w:r>
+      <w:r>
+        <w:t xml:space="preserve">Lins-Filho OL, Pedrosa RP, Gomes JML,</w:t>
+      </w:r>
+      <w:r>
+        <w:t xml:space="preserve"> </w:t>
+      </w:r>
+      <w:r>
+        <w:rPr>
+          <w:i/>
+          <w:iCs/>
+        </w:rPr>
+        <w:t xml:space="preserve">et al.</w:t>
+      </w:r>
+      <w:r>
+        <w:t xml:space="preserve"> Effect of exercise training on subjective parameters in patients with obstructive sleep apnea: A systematic review and meta-analysis.</w:t>
+      </w:r>
+      <w:r>
+        <w:t xml:space="preserve"> </w:t>
+      </w:r>
+      <w:r>
+        <w:rPr>
+          <w:i/>
+          <w:iCs/>
+        </w:rPr>
+        <w:t xml:space="preserve">Sleep Medicine</w:t>
+      </w:r>
+      <w:r>
+        <w:t xml:space="preserve">. 2020;69:1–7. doi:</w:t>
+      </w:r>
+      <w:r>
+        <w:t xml:space="preserve"> </w:t>
+      </w:r>
+      <w:hyperlink r:id="rId96">
+        <w:r>
+          <w:rPr>
+            <w:rStyle w:val="Hyperlink"/>
+          </w:rPr>
+          <w:t xml:space="preserve">10.1016/j.sleep.2019.12.022</w:t>
+        </w:r>
+      </w:hyperlink>
+    </w:p>
+    <w:bookmarkEnd w:id="97"/>
+    <w:bookmarkStart w:id="99" w:name="ref-mendelsonObstructiveSleepApnea2018"/>
+    <w:p>
+      <w:pPr>
+        <w:pStyle w:val="Literaturverzeichnis"/>
+      </w:pPr>
+      <w:r>
+        <w:t xml:space="preserve">23</w:t>
+      </w:r>
+      <w:r>
+        <w:t xml:space="preserve"> </w:t>
+      </w:r>
+      <w:r>
+        <w:t xml:space="preserve">	</w:t>
+      </w:r>
+      <w:r>
+        <w:t xml:space="preserve">Mendelson M, Bailly S, Marillier M,</w:t>
+      </w:r>
+      <w:r>
+        <w:t xml:space="preserve"> </w:t>
+      </w:r>
+      <w:r>
+        <w:rPr>
+          <w:i/>
+          <w:iCs/>
+        </w:rPr>
+        <w:t xml:space="preserve">et al.</w:t>
+      </w:r>
+      <w:r>
+        <w:t xml:space="preserve"> Obstructive sleep apnea syndrome, objectively measured physical activity and exercise training interventions:</w:t>
+      </w:r>
+      <w:r>
+        <w:t xml:space="preserve"> </w:t>
+      </w:r>
+      <w:r>
+        <w:t xml:space="preserve">A</w:t>
+      </w:r>
+      <w:r>
+        <w:t xml:space="preserve"> </w:t>
+      </w:r>
+      <w:r>
+        <w:t xml:space="preserve">systematic review and meta-analysis.</w:t>
+      </w:r>
+      <w:r>
+        <w:t xml:space="preserve"> </w:t>
+      </w:r>
+      <w:r>
+        <w:rPr>
+          <w:i/>
+          <w:iCs/>
+        </w:rPr>
+        <w:t xml:space="preserve">Frontiers in Neurology</w:t>
+      </w:r>
+      <w:r>
+        <w:t xml:space="preserve">. 2018;9. doi:</w:t>
+      </w:r>
+      <w:r>
+        <w:t xml:space="preserve"> </w:t>
+      </w:r>
+      <w:hyperlink r:id="rId98">
+        <w:r>
+          <w:rPr>
+            <w:rStyle w:val="Hyperlink"/>
+          </w:rPr>
+          <w:t xml:space="preserve">10.3389/fneur.2018.00073</w:t>
+        </w:r>
+      </w:hyperlink>
+    </w:p>
+    <w:bookmarkEnd w:id="99"/>
+    <w:bookmarkStart w:id="101" w:name="ref-rubio-ariasEffectExerciseSleep2017"/>
+    <w:p>
+      <w:pPr>
+        <w:pStyle w:val="Literaturverzeichnis"/>
+      </w:pPr>
+      <w:r>
+        <w:t xml:space="preserve">24</w:t>
+      </w:r>
+      <w:r>
+        <w:t xml:space="preserve"> </w:t>
+      </w:r>
+      <w:r>
+        <w:t xml:space="preserve">	</w:t>
+      </w:r>
+      <w:r>
+        <w:t xml:space="preserve">Rubio-Arias JÁ, Marín-Cascales E, Ramos-Campo DJ,</w:t>
+      </w:r>
+      <w:r>
+        <w:t xml:space="preserve"> </w:t>
+      </w:r>
+      <w:r>
+        <w:rPr>
+          <w:i/>
+          <w:iCs/>
+        </w:rPr>
+        <w:t xml:space="preserve">et al.</w:t>
+      </w:r>
+      <w:r>
+        <w:t xml:space="preserve"> Effect of exercise on sleep quality and insomnia in middle-aged women:</w:t>
+      </w:r>
+      <w:r>
+        <w:t xml:space="preserve"> </w:t>
+      </w:r>
+      <w:r>
+        <w:t xml:space="preserve">A</w:t>
+      </w:r>
+      <w:r>
+        <w:t xml:space="preserve"> </w:t>
+      </w:r>
+      <w:r>
+        <w:t xml:space="preserve">systematic review and meta-analysis of randomized controlled trials.</w:t>
+      </w:r>
+      <w:r>
+        <w:t xml:space="preserve"> </w:t>
+      </w:r>
+      <w:r>
+        <w:rPr>
+          <w:i/>
+          <w:iCs/>
+        </w:rPr>
+        <w:t xml:space="preserve">Maturitas</w:t>
+      </w:r>
+      <w:r>
+        <w:t xml:space="preserve">. 2017;100:49–56. doi:</w:t>
+      </w:r>
+      <w:r>
+        <w:t xml:space="preserve"> </w:t>
+      </w:r>
+      <w:hyperlink r:id="rId100">
+        <w:r>
+          <w:rPr>
+            <w:rStyle w:val="Hyperlink"/>
+          </w:rPr>
+          <w:t xml:space="preserve">10.1016/j.maturitas.2017.04.003</w:t>
+        </w:r>
+      </w:hyperlink>
+    </w:p>
+    <w:bookmarkEnd w:id="101"/>
+    <w:bookmarkStart w:id="103" w:name="ref-stutzEffectsEveningExercise2019"/>
+    <w:p>
+      <w:pPr>
+        <w:pStyle w:val="Literaturverzeichnis"/>
+      </w:pPr>
+      <w:r>
+        <w:t xml:space="preserve">25</w:t>
+      </w:r>
+      <w:r>
+        <w:t xml:space="preserve"> </w:t>
+      </w:r>
+      <w:r>
+        <w:t xml:space="preserve">	</w:t>
+      </w:r>
+      <w:r>
+        <w:t xml:space="preserve">Stutz J, Eiholzer R, Spengler CM. Effects of</w:t>
+      </w:r>
+      <w:r>
+        <w:t xml:space="preserve"> </w:t>
+      </w:r>
+      <w:r>
+        <w:t xml:space="preserve">Evening Exercise</w:t>
+      </w:r>
+      <w:r>
+        <w:t xml:space="preserve"> </w:t>
+      </w:r>
+      <w:r>
+        <w:t xml:space="preserve">on</w:t>
+      </w:r>
+      <w:r>
+        <w:t xml:space="preserve"> </w:t>
+      </w:r>
+      <w:r>
+        <w:t xml:space="preserve">Sleep</w:t>
+      </w:r>
+      <w:r>
+        <w:t xml:space="preserve"> </w:t>
+      </w:r>
+      <w:r>
+        <w:t xml:space="preserve">in</w:t>
+      </w:r>
+      <w:r>
+        <w:t xml:space="preserve"> </w:t>
+      </w:r>
+      <w:r>
+        <w:t xml:space="preserve">Healthy Participants</w:t>
+      </w:r>
+      <w:r>
+        <w:t xml:space="preserve">:</w:t>
+      </w:r>
+      <w:r>
+        <w:t xml:space="preserve"> </w:t>
+      </w:r>
+      <w:r>
+        <w:t xml:space="preserve">A Systematic Review</w:t>
+      </w:r>
+      <w:r>
+        <w:t xml:space="preserve"> </w:t>
+      </w:r>
+      <w:r>
+        <w:t xml:space="preserve">and</w:t>
+      </w:r>
+      <w:r>
+        <w:t xml:space="preserve"> </w:t>
+      </w:r>
+      <w:r>
+        <w:t xml:space="preserve">Meta-Analysis</w:t>
+      </w:r>
+      <w:r>
+        <w:t xml:space="preserve">.</w:t>
+      </w:r>
+      <w:r>
+        <w:t xml:space="preserve"> </w:t>
+      </w:r>
+      <w:r>
+        <w:rPr>
+          <w:i/>
+          <w:iCs/>
+        </w:rPr>
+        <w:t xml:space="preserve">Sports Medicine</w:t>
+      </w:r>
+      <w:r>
+        <w:t xml:space="preserve">. 2019;49:269–87. doi:</w:t>
+      </w:r>
+      <w:r>
+        <w:t xml:space="preserve"> </w:t>
+      </w:r>
+      <w:hyperlink r:id="rId102">
+        <w:r>
+          <w:rPr>
+            <w:rStyle w:val="Hyperlink"/>
+          </w:rPr>
+          <w:t xml:space="preserve">10.1007/s40279-018-1015-0</w:t>
+        </w:r>
+      </w:hyperlink>
+    </w:p>
+    <w:bookmarkEnd w:id="103"/>
+    <w:bookmarkStart w:id="105" w:name="ref-yangEffectsExerciseSleep2020"/>
+    <w:p>
+      <w:pPr>
+        <w:pStyle w:val="Literaturverzeichnis"/>
+      </w:pPr>
+      <w:r>
+        <w:t xml:space="preserve">26</w:t>
+      </w:r>
+      <w:r>
+        <w:t xml:space="preserve"> </w:t>
+      </w:r>
+      <w:r>
+        <w:t xml:space="preserve">	</w:t>
+      </w:r>
+      <w:r>
+        <w:t xml:space="preserve">Yang S-Y, Lan S-J, Yen Y-Y,</w:t>
+      </w:r>
+      <w:r>
+        <w:t xml:space="preserve"> </w:t>
+      </w:r>
+      <w:r>
+        <w:rPr>
+          <w:i/>
+          <w:iCs/>
+        </w:rPr>
+        <w:t xml:space="preserve">et al.</w:t>
+      </w:r>
+      <w:r>
+        <w:t xml:space="preserve"> Effects of</w:t>
+      </w:r>
+      <w:r>
+        <w:t xml:space="preserve"> </w:t>
+      </w:r>
+      <w:r>
+        <w:t xml:space="preserve">Exercise</w:t>
+      </w:r>
+      <w:r>
+        <w:t xml:space="preserve"> </w:t>
+      </w:r>
+      <w:r>
+        <w:t xml:space="preserve">on</w:t>
+      </w:r>
+      <w:r>
+        <w:t xml:space="preserve"> </w:t>
+      </w:r>
+      <w:r>
+        <w:t xml:space="preserve">Sleep Quality</w:t>
+      </w:r>
+      <w:r>
+        <w:t xml:space="preserve"> </w:t>
+      </w:r>
+      <w:r>
+        <w:t xml:space="preserve">in</w:t>
+      </w:r>
+      <w:r>
+        <w:t xml:space="preserve"> </w:t>
+      </w:r>
+      <w:r>
+        <w:t xml:space="preserve">Pregnant Women</w:t>
+      </w:r>
+      <w:r>
+        <w:t xml:space="preserve">:</w:t>
+      </w:r>
+      <w:r>
+        <w:t xml:space="preserve"> </w:t>
+      </w:r>
+      <w:r>
+        <w:t xml:space="preserve">A Systematic Review</w:t>
+      </w:r>
+      <w:r>
+        <w:t xml:space="preserve"> </w:t>
+      </w:r>
+      <w:r>
+        <w:t xml:space="preserve">and</w:t>
+      </w:r>
+      <w:r>
+        <w:t xml:space="preserve"> </w:t>
+      </w:r>
+      <w:r>
+        <w:t xml:space="preserve">Meta-analysis</w:t>
+      </w:r>
+      <w:r>
+        <w:t xml:space="preserve"> </w:t>
+      </w:r>
+      <w:r>
+        <w:t xml:space="preserve">of</w:t>
+      </w:r>
+      <w:r>
+        <w:t xml:space="preserve"> </w:t>
+      </w:r>
+      <w:r>
+        <w:t xml:space="preserve">Randomized Controlled Trials</w:t>
+      </w:r>
+      <w:r>
+        <w:t xml:space="preserve">.</w:t>
+      </w:r>
+      <w:r>
+        <w:t xml:space="preserve"> </w:t>
+      </w:r>
+      <w:r>
+        <w:rPr>
+          <w:i/>
+          <w:iCs/>
+        </w:rPr>
+        <w:t xml:space="preserve">Asian Nursing Research</w:t>
+      </w:r>
+      <w:r>
+        <w:t xml:space="preserve">. 2020;14:1–10. doi:</w:t>
+      </w:r>
+      <w:r>
+        <w:t xml:space="preserve"> </w:t>
+      </w:r>
+      <w:hyperlink r:id="rId104">
+        <w:r>
+          <w:rPr>
+            <w:rStyle w:val="Hyperlink"/>
+          </w:rPr>
+          <w:t xml:space="preserve">10.1016/j.anr.2020.01.003</w:t>
+        </w:r>
+      </w:hyperlink>
+    </w:p>
+    <w:bookmarkEnd w:id="105"/>
+    <w:bookmarkStart w:id="107" w:name="ref-yangExerciseTrainingImproves2012"/>
+    <w:p>
+      <w:pPr>
+        <w:pStyle w:val="Literaturverzeichnis"/>
+      </w:pPr>
+      <w:r>
+        <w:t xml:space="preserve">27</w:t>
+      </w:r>
+      <w:r>
+        <w:t xml:space="preserve"> </w:t>
+      </w:r>
+      <w:r>
+        <w:t xml:space="preserve">	</w:t>
+      </w:r>
+      <w:r>
+        <w:t xml:space="preserve">Yang P-Y, Ho K-H, Chen H-C,</w:t>
+      </w:r>
+      <w:r>
+        <w:t xml:space="preserve"> </w:t>
+      </w:r>
+      <w:r>
+        <w:rPr>
+          <w:i/>
+          <w:iCs/>
+        </w:rPr>
+        <w:t xml:space="preserve">et al.</w:t>
+      </w:r>
+      <w:r>
+        <w:t xml:space="preserve"> Exercise training improves sleep quality in middle-aged and older adults with sleep problems:</w:t>
+      </w:r>
+      <w:r>
+        <w:t xml:space="preserve"> </w:t>
+      </w:r>
+      <w:r>
+        <w:t xml:space="preserve">A</w:t>
+      </w:r>
+      <w:r>
+        <w:t xml:space="preserve"> </w:t>
+      </w:r>
+      <w:r>
+        <w:t xml:space="preserve">systematic review.</w:t>
+      </w:r>
+      <w:r>
+        <w:t xml:space="preserve"> </w:t>
+      </w:r>
+      <w:r>
+        <w:rPr>
+          <w:i/>
+          <w:iCs/>
+        </w:rPr>
+        <w:t xml:space="preserve">Journal of Physiotherapy</w:t>
+      </w:r>
+      <w:r>
+        <w:t xml:space="preserve">. 2012;58:157–63. doi:</w:t>
+      </w:r>
+      <w:r>
+        <w:t xml:space="preserve"> </w:t>
+      </w:r>
+      <w:hyperlink r:id="rId106">
+        <w:r>
+          <w:rPr>
+            <w:rStyle w:val="Hyperlink"/>
+          </w:rPr>
+          <w:t xml:space="preserve">10.1016/S1836-9553(12)70106-6</w:t>
+        </w:r>
+      </w:hyperlink>
+    </w:p>
+    <w:bookmarkEnd w:id="107"/>
+    <w:bookmarkStart w:id="109" w:name="ref-yangSedentaryBehaviorSleep2017"/>
+    <w:p>
+      <w:pPr>
+        <w:pStyle w:val="Literaturverzeichnis"/>
+      </w:pPr>
+      <w:r>
+        <w:t xml:space="preserve">28</w:t>
+      </w:r>
+      <w:r>
+        <w:t xml:space="preserve"> </w:t>
+      </w:r>
+      <w:r>
+        <w:t xml:space="preserve">	</w:t>
+      </w:r>
+      <w:r>
+        <w:t xml:space="preserve">Yang Y, Shin JC, Li D,</w:t>
+      </w:r>
+      <w:r>
+        <w:t xml:space="preserve"> </w:t>
+      </w:r>
+      <w:r>
+        <w:rPr>
+          <w:i/>
+          <w:iCs/>
+        </w:rPr>
+        <w:t xml:space="preserve">et al.</w:t>
+      </w:r>
+      <w:r>
+        <w:t xml:space="preserve"> Sedentary</w:t>
+      </w:r>
+      <w:r>
+        <w:t xml:space="preserve"> </w:t>
+      </w:r>
+      <w:r>
+        <w:t xml:space="preserve">Behavior</w:t>
+      </w:r>
+      <w:r>
+        <w:t xml:space="preserve"> </w:t>
+      </w:r>
+      <w:r>
+        <w:t xml:space="preserve">and</w:t>
+      </w:r>
+      <w:r>
+        <w:t xml:space="preserve"> </w:t>
+      </w:r>
+      <w:r>
+        <w:t xml:space="preserve">Sleep Problems</w:t>
+      </w:r>
+      <w:r>
+        <w:t xml:space="preserve">: A</w:t>
+      </w:r>
+      <w:r>
+        <w:t xml:space="preserve"> </w:t>
+      </w:r>
+      <w:r>
+        <w:t xml:space="preserve">Systematic Review</w:t>
+      </w:r>
+      <w:r>
+        <w:t xml:space="preserve"> </w:t>
+      </w:r>
+      <w:r>
+        <w:t xml:space="preserve">and</w:t>
+      </w:r>
+      <w:r>
+        <w:t xml:space="preserve"> </w:t>
+      </w:r>
+      <w:r>
+        <w:t xml:space="preserve">Meta-Analysis</w:t>
+      </w:r>
+      <w:r>
+        <w:t xml:space="preserve">.</w:t>
+      </w:r>
+      <w:r>
+        <w:t xml:space="preserve"> </w:t>
+      </w:r>
+      <w:r>
+        <w:rPr>
+          <w:i/>
+          <w:iCs/>
+        </w:rPr>
+        <w:t xml:space="preserve">International Journal of Behavioral Medicine</w:t>
+      </w:r>
+      <w:r>
+        <w:t xml:space="preserve">. 2017;24:481–92. doi:</w:t>
+      </w:r>
+      <w:r>
+        <w:t xml:space="preserve"> </w:t>
+      </w:r>
+      <w:hyperlink r:id="rId108">
+        <w:r>
+          <w:rPr>
+            <w:rStyle w:val="Hyperlink"/>
+          </w:rPr>
+          <w:t xml:space="preserve">10.1007/s12529-016-9609-0</w:t>
+        </w:r>
+      </w:hyperlink>
+    </w:p>
+    <w:bookmarkEnd w:id="109"/>
+    <w:bookmarkStart w:id="111" w:name="ref-rileyUsingIndividualParticipant2023"/>
+    <w:p>
+      <w:pPr>
+        <w:pStyle w:val="Literaturverzeichnis"/>
+      </w:pPr>
+      <w:r>
+        <w:t xml:space="preserve">29</w:t>
+      </w:r>
+      <w:r>
+        <w:t xml:space="preserve"> </w:t>
+      </w:r>
+      <w:r>
+        <w:t xml:space="preserve">	</w:t>
+      </w:r>
+      <w:r>
+        <w:t xml:space="preserve">Riley RD, Dias S, Donegan S,</w:t>
+      </w:r>
+      <w:r>
+        <w:t xml:space="preserve"> </w:t>
+      </w:r>
+      <w:r>
+        <w:rPr>
+          <w:i/>
+          <w:iCs/>
+        </w:rPr>
+        <w:t xml:space="preserve">et al.</w:t>
+      </w:r>
+      <w:r>
+        <w:t xml:space="preserve"> Using individual participant data to improve network meta-analysis projects.</w:t>
+      </w:r>
+      <w:r>
+        <w:t xml:space="preserve"> </w:t>
+      </w:r>
+      <w:r>
+        <w:rPr>
+          <w:i/>
+          <w:iCs/>
+        </w:rPr>
+        <w:t xml:space="preserve">BMJ Evidence-Based Medicine</w:t>
+      </w:r>
+      <w:r>
+        <w:t xml:space="preserve">. 2023;28:197–203. doi:</w:t>
+      </w:r>
+      <w:r>
+        <w:t xml:space="preserve"> </w:t>
+      </w:r>
+      <w:hyperlink r:id="rId110">
+        <w:r>
+          <w:rPr>
+            <w:rStyle w:val="Hyperlink"/>
+          </w:rPr>
+          <w:t xml:space="preserve">10.1136/bmjebm-2022-111931</w:t>
+        </w:r>
+      </w:hyperlink>
+    </w:p>
+    <w:bookmarkEnd w:id="111"/>
+    <w:bookmarkStart w:id="113" w:name="Xa0cbe05eccacccf17bde02d7669b1fb01f31efd"/>
+    <w:p>
+      <w:pPr>
+        <w:pStyle w:val="Literaturverzeichnis"/>
+      </w:pPr>
+      <w:r>
+        <w:t xml:space="preserve">30</w:t>
+      </w:r>
+      <w:r>
+        <w:t xml:space="preserve"> </w:t>
+      </w:r>
+      <w:r>
+        <w:t xml:space="preserve">	</w:t>
+      </w:r>
+      <w:r>
+        <w:t xml:space="preserve">Ioannidis J. Next-generation systematic reviews: Prospective meta-analysis, individual-level data, networks and umbrella reviews.</w:t>
+      </w:r>
+      <w:r>
+        <w:t xml:space="preserve"> </w:t>
+      </w:r>
+      <w:r>
+        <w:rPr>
+          <w:i/>
+          <w:iCs/>
+        </w:rPr>
+        <w:t xml:space="preserve">British Journal of Sports Medicine</w:t>
+      </w:r>
+      <w:r>
+        <w:t xml:space="preserve">. 2017;51:1456–8. doi:</w:t>
+      </w:r>
+      <w:r>
+        <w:t xml:space="preserve"> </w:t>
+      </w:r>
+      <w:hyperlink r:id="rId112">
+        <w:r>
+          <w:rPr>
+            <w:rStyle w:val="Hyperlink"/>
+          </w:rPr>
+          <w:t xml:space="preserve">10.1136/bjsports-2017-097621</w:t>
+        </w:r>
+      </w:hyperlink>
+    </w:p>
+    <w:bookmarkEnd w:id="113"/>
+    <w:bookmarkEnd w:id="114"/>
+    <w:bookmarkEnd w:id="115"/>
+    <w:bookmarkEnd w:id="116"/>
     <w:sectPr>
       <w:headerReference r:id="rId9" w:type="even"/>
       <w:headerReference r:id="rId11" w:type="default"/>

</xml_diff>

<commit_message>
Add authors and affiliations
</commit_message>
<xml_diff>
--- a/doc/manuscript.docx
+++ b/doc/manuscript.docx
@@ -7,7 +7,7 @@
         <w:pStyle w:val="Title"/>
       </w:pPr>
       <w:r>
-        <w:t xml:space="preserve">The title</w:t>
+        <w:t xml:space="preserve">The relationship between sleep and physical activity across the lifespan</w:t>
       </w:r>
     </w:p>
     <w:p>
@@ -15,7 +15,7 @@
         <w:pStyle w:val="Author"/>
       </w:pPr>
       <w:r>
-        <w:t xml:space="preserve">First Author</w:t>
+        <w:t xml:space="preserve">Taren Sanders*</w:t>
       </w:r>
       <w:r>
         <w:rPr>
@@ -24,13 +24,85 @@
         <w:t xml:space="preserve">1</w:t>
       </w:r>
       <w:r>
-        <w:t xml:space="preserve"> &amp; Ernst-August Doelle</w:t>
+        <w:t xml:space="preserve">, Timothy Hartwig</w:t>
       </w:r>
       <w:r>
         <w:rPr>
           <w:vertAlign w:val="superscript"/>
         </w:rPr>
-        <w:t xml:space="preserve">1,2</w:t>
+        <w:t xml:space="preserve">2</w:t>
+      </w:r>
+      <w:r>
+        <w:t xml:space="preserve">, James Conigrave</w:t>
+      </w:r>
+      <w:r>
+        <w:rPr>
+          <w:vertAlign w:val="superscript"/>
+        </w:rPr>
+        <w:t xml:space="preserve">3</w:t>
+      </w:r>
+      <w:r>
+        <w:t xml:space="preserve">, Borja del Pozo-Cruz^4, 5, 6^, Philip Parker</w:t>
+      </w:r>
+      <w:r>
+        <w:rPr>
+          <w:vertAlign w:val="superscript"/>
+        </w:rPr>
+        <w:t xml:space="preserve">7</w:t>
+      </w:r>
+      <w:r>
+        <w:t xml:space="preserve">, Michael Noetel</w:t>
+      </w:r>
+      <w:r>
+        <w:rPr>
+          <w:vertAlign w:val="superscript"/>
+        </w:rPr>
+        <w:t xml:space="preserve">8</w:t>
+      </w:r>
+      <w:r>
+        <w:t xml:space="preserve">, Devan Antczak</w:t>
+      </w:r>
+      <w:r>
+        <w:rPr>
+          <w:vertAlign w:val="superscript"/>
+        </w:rPr>
+        <w:t xml:space="preserve">9</w:t>
+      </w:r>
+      <w:r>
+        <w:t xml:space="preserve">, Stuart Fairclough</w:t>
+      </w:r>
+      <w:r>
+        <w:rPr>
+          <w:vertAlign w:val="superscript"/>
+        </w:rPr>
+        <w:t xml:space="preserve">10</w:t>
+      </w:r>
+      <w:r>
+        <w:t xml:space="preserve">, Shona Halson</w:t>
+      </w:r>
+      <w:r>
+        <w:rPr>
+          <w:vertAlign w:val="superscript"/>
+        </w:rPr>
+        <w:t xml:space="preserve">11</w:t>
+      </w:r>
+      <w:r>
+        <w:t xml:space="preserve">, — DATASET PROVIDERS TBD —</w:t>
+      </w:r>
+      <w:r>
+        <w:rPr>
+          <w:vertAlign w:val="superscript"/>
+        </w:rPr>
+        <w:t xml:space="preserve">12</w:t>
+      </w:r>
+      <w:r>
+        <w:t xml:space="preserve">, &amp; Chris Londale</w:t>
+      </w:r>
+      <w:r>
+        <w:rPr>
+          <w:vertAlign w:val="superscript"/>
+        </w:rPr>
+        <w:t xml:space="preserve">13</w:t>
       </w:r>
     </w:p>
     <w:p>
@@ -47,7 +119,7 @@
         <w:t xml:space="preserve"> </w:t>
       </w:r>
       <w:r>
-        <w:t xml:space="preserve">Wilhelm-Wundt-University</w:t>
+        <w:t xml:space="preserve">Institute for Positive Psychology and Education, Australian Catholic University, North Sydney, Australia</w:t>
       </w:r>
     </w:p>
     <w:p>
@@ -64,7 +136,177 @@
         <w:t xml:space="preserve"> </w:t>
       </w:r>
       <w:r>
-        <w:t xml:space="preserve">Konstanz Business School</w:t>
+        <w:t xml:space="preserve">School of Behavioural and Health Science, Australian Catholic University, North Sydney, Australia</w:t>
+      </w:r>
+    </w:p>
+    <w:p>
+      <w:pPr>
+        <w:pStyle w:val="Author"/>
+      </w:pPr>
+      <w:r>
+        <w:rPr>
+          <w:vertAlign w:val="superscript"/>
+        </w:rPr>
+        <w:t xml:space="preserve">3</w:t>
+      </w:r>
+      <w:r>
+        <w:t xml:space="preserve"> </w:t>
+      </w:r>
+      <w:r>
+        <w:t xml:space="preserve">Centre for Alcohol Policy Research, La Trobe University, Bundoora, Australia</w:t>
+      </w:r>
+    </w:p>
+    <w:p>
+      <w:pPr>
+        <w:pStyle w:val="Author"/>
+      </w:pPr>
+      <w:r>
+        <w:rPr>
+          <w:vertAlign w:val="superscript"/>
+        </w:rPr>
+        <w:t xml:space="preserve">4</w:t>
+      </w:r>
+      <w:r>
+        <w:t xml:space="preserve"> </w:t>
+      </w:r>
+      <w:r>
+        <w:t xml:space="preserve">Department of Sport Science and Clinical Biomechanics, University of Southern Denmark, Odense, Denmark</w:t>
+      </w:r>
+    </w:p>
+    <w:p>
+      <w:pPr>
+        <w:pStyle w:val="Author"/>
+      </w:pPr>
+      <w:r>
+        <w:rPr>
+          <w:vertAlign w:val="superscript"/>
+        </w:rPr>
+        <w:t xml:space="preserve">5</w:t>
+      </w:r>
+      <w:r>
+        <w:t xml:space="preserve"> </w:t>
+      </w:r>
+      <w:r>
+        <w:t xml:space="preserve">Department of Physical Education, Faculty of Education, University of Cádiz, Cádiz, Spain</w:t>
+      </w:r>
+    </w:p>
+    <w:p>
+      <w:pPr>
+        <w:pStyle w:val="Author"/>
+      </w:pPr>
+      <w:r>
+        <w:rPr>
+          <w:vertAlign w:val="superscript"/>
+        </w:rPr>
+        <w:t xml:space="preserve">6</w:t>
+      </w:r>
+      <w:r>
+        <w:t xml:space="preserve"> </w:t>
+      </w:r>
+      <w:r>
+        <w:t xml:space="preserve">Biomedical Research and Innovation Institute of Cádiz (INiBICA) Research Unit, Puerta del Mar University Hospital, University of Cádiz, Cádiz, Spain</w:t>
+      </w:r>
+    </w:p>
+    <w:p>
+      <w:pPr>
+        <w:pStyle w:val="Author"/>
+      </w:pPr>
+      <w:r>
+        <w:rPr>
+          <w:vertAlign w:val="superscript"/>
+        </w:rPr>
+        <w:t xml:space="preserve">7</w:t>
+      </w:r>
+      <w:r>
+        <w:t xml:space="preserve"> </w:t>
+      </w:r>
+      <w:r>
+        <w:t xml:space="preserve">Office of the Deputy Vice-Chancellor (Research and Enterprise), Australian Catholic University, North Sydney, Australia</w:t>
+      </w:r>
+    </w:p>
+    <w:p>
+      <w:pPr>
+        <w:pStyle w:val="Author"/>
+      </w:pPr>
+      <w:r>
+        <w:rPr>
+          <w:vertAlign w:val="superscript"/>
+        </w:rPr>
+        <w:t xml:space="preserve">8</w:t>
+      </w:r>
+      <w:r>
+        <w:t xml:space="preserve"> </w:t>
+      </w:r>
+      <w:r>
+        <w:t xml:space="preserve">School of Psychology, University of Queensland, Brisbane, Australia</w:t>
+      </w:r>
+    </w:p>
+    <w:p>
+      <w:pPr>
+        <w:pStyle w:val="Author"/>
+      </w:pPr>
+      <w:r>
+        <w:rPr>
+          <w:vertAlign w:val="superscript"/>
+        </w:rPr>
+        <w:t xml:space="preserve">9</w:t>
+      </w:r>
+      <w:r>
+        <w:t xml:space="preserve"> </w:t>
+      </w:r>
+      <w:r>
+        <w:t xml:space="preserve">School of Education, University of Wollongong, Wollongong, Australia</w:t>
+      </w:r>
+    </w:p>
+    <w:p>
+      <w:pPr>
+        <w:pStyle w:val="Author"/>
+      </w:pPr>
+      <w:r>
+        <w:rPr>
+          <w:vertAlign w:val="superscript"/>
+        </w:rPr>
+        <w:t xml:space="preserve">10</w:t>
+      </w:r>
+      <w:r>
+        <w:t xml:space="preserve"> </w:t>
+      </w:r>
+      <w:r>
+        <w:t xml:space="preserve">Department of Sport and Physical Activity, Edge Hill University, Ormskirk, United Kingdom</w:t>
+      </w:r>
+    </w:p>
+    <w:p>
+      <w:pPr>
+        <w:pStyle w:val="Author"/>
+      </w:pPr>
+      <w:r>
+        <w:rPr>
+          <w:vertAlign w:val="superscript"/>
+        </w:rPr>
+        <w:t xml:space="preserve">11</w:t>
+      </w:r>
+      <w:r>
+        <w:t xml:space="preserve"> </w:t>
+      </w:r>
+      <w:r>
+        <w:t xml:space="preserve">— TBD —</w:t>
+      </w:r>
+    </w:p>
+    <w:p>
+      <w:pPr>
+        <w:pStyle w:val="Author"/>
+      </w:pPr>
+      <w:r>
+        <w:rPr>
+          <w:vertAlign w:val="superscript"/>
+        </w:rPr>
+        <w:t xml:space="preserve">13</w:t>
+      </w:r>
+      <w:r>
+        <w:t xml:space="preserve"> </w:t>
+      </w:r>
+      <w:r>
+        <w:t xml:space="preserve">Office of the Provost, Australian Catholic University, North Sydney, Australia</w:t>
       </w:r>
     </w:p>
     <w:p>
@@ -96,7 +338,7 @@
         <w:pStyle w:val="authornote"/>
       </w:pPr>
       <w:r>
-        <w:t xml:space="preserve">Add complete departmental affiliations for each author here. Each new line herein must be indented, like this line.</w:t>
+        <w:t xml:space="preserve">Enter author note here.</w:t>
       </w:r>
     </w:p>
     <w:p>
@@ -104,23 +346,7 @@
         <w:pStyle w:val="authornote"/>
       </w:pPr>
       <w:r>
-        <w:t xml:space="preserve">Enter author note here.</w:t>
-      </w:r>
-    </w:p>
-    <w:p>
-      <w:pPr>
-        <w:pStyle w:val="authornote"/>
-      </w:pPr>
-      <w:r>
-        <w:t xml:space="preserve">The authors made the following contributions. First Author: Conceptualization, Writing - Original Draft Preparation, Writing - Review &amp; Editing; Ernst-August Doelle: Writing - Review &amp; Editing, Supervision.</w:t>
-      </w:r>
-    </w:p>
-    <w:p>
-      <w:pPr>
-        <w:pStyle w:val="authornote"/>
-      </w:pPr>
-      <w:r>
-        <w:t xml:space="preserve">Correspondence concerning this article should be addressed to First Author, Postal address. E-mail:</w:t>
+        <w:t xml:space="preserve">Correspondence concerning this article should be addressed to Taren Sanders*, 33 Berry St, North Sydney, NSW, Australia. E-mail:</w:t>
       </w:r>
       <w:r>
         <w:t xml:space="preserve"> </w:t>
@@ -130,7 +356,7 @@
           <w:rPr>
             <w:rStyle w:val="Hyperlink"/>
           </w:rPr>
-          <w:t xml:space="preserve">my@email.com</w:t>
+          <w:t xml:space="preserve">Taren.Sanders@acu.edu.au</w:t>
         </w:r>
       </w:hyperlink>
     </w:p>
@@ -207,7 +433,7 @@
         <w:pStyle w:val="h1-pagebreak"/>
       </w:pPr>
       <w:r>
-        <w:t xml:space="preserve">The title</w:t>
+        <w:t xml:space="preserve">The relationship between sleep and physical activity across the lifespan</w:t>
       </w:r>
     </w:p>
     <w:bookmarkStart w:id="21" w:name="introduction"/>
@@ -478,7 +704,7 @@
       </w:r>
     </w:p>
     <w:bookmarkEnd w:id="21"/>
-    <w:bookmarkStart w:id="116" w:name="results"/>
+    <w:bookmarkStart w:id="55" w:name="results"/>
     <w:p>
       <w:pPr>
         <w:pStyle w:val="berschrift1"/>
@@ -11088,7 +11314,7 @@
       </w:r>
     </w:p>
     <w:bookmarkEnd w:id="49"/>
-    <w:bookmarkStart w:id="115" w:name="X5a2a01188f3a4beede9359d895f20f75d3e9c49"/>
+    <w:bookmarkStart w:id="54" w:name="X5a2a01188f3a4beede9359d895f20f75d3e9c49"/>
     <w:p>
       <w:pPr>
         <w:pStyle w:val="berschrift2"/>
@@ -11219,8 +11445,24 @@
         <w:t xml:space="preserve">Figure 6: Physical activity by sleep regularity. The panels on the left show the curvilinear relationship between sleep regularity and each of the physical activity outcomes at the ages indicated in each column. The panels on the right show the same relationships but by age continuously. The white band indicates predictions which were not significantly different from zero.</w:t>
       </w:r>
     </w:p>
-    <w:bookmarkStart w:id="114" w:name="refs"/>
-    <w:bookmarkStart w:id="55" w:name="ref-luysterSleepHealthImperative2012"/>
+    <w:p>
+      <w:r>
+        <w:br w:type="page"/>
+      </w:r>
+    </w:p>
+    <w:bookmarkEnd w:id="54"/>
+    <w:bookmarkEnd w:id="55"/>
+    <w:bookmarkStart w:id="117" w:name="references"/>
+    <w:p>
+      <w:pPr>
+        <w:pStyle w:val="berschrift1"/>
+      </w:pPr>
+      <w:r>
+        <w:t xml:space="preserve">References</w:t>
+      </w:r>
+    </w:p>
+    <w:bookmarkStart w:id="116" w:name="refs"/>
+    <w:bookmarkStart w:id="57" w:name="ref-luysterSleepHealthImperative2012"/>
     <w:p>
       <w:pPr>
         <w:pStyle w:val="Literaturverzeichnis"/>
@@ -11275,7 +11517,7 @@
       <w:r>
         <w:t xml:space="preserve"> </w:t>
       </w:r>
-      <w:hyperlink r:id="rId54">
+      <w:hyperlink r:id="rId56">
         <w:r>
           <w:rPr>
             <w:rStyle w:val="Hyperlink"/>
@@ -11284,8 +11526,8 @@
         </w:r>
       </w:hyperlink>
     </w:p>
-    <w:bookmarkEnd w:id="55"/>
-    <w:bookmarkStart w:id="57" w:name="ref-huangSleepPhysicalActivity2022"/>
+    <w:bookmarkEnd w:id="57"/>
+    <w:bookmarkStart w:id="59" w:name="ref-huangSleepPhysicalActivity2022"/>
     <w:p>
       <w:pPr>
         <w:pStyle w:val="Literaturverzeichnis"/>
@@ -11331,7 +11573,7 @@
       <w:r>
         <w:t xml:space="preserve"> </w:t>
       </w:r>
-      <w:hyperlink r:id="rId56">
+      <w:hyperlink r:id="rId58">
         <w:r>
           <w:rPr>
             <w:rStyle w:val="Hyperlink"/>
@@ -11340,8 +11582,8 @@
         </w:r>
       </w:hyperlink>
     </w:p>
-    <w:bookmarkEnd w:id="57"/>
-    <w:bookmarkStart w:id="59" w:name="ref-kwokSelfReportedSleep2018"/>
+    <w:bookmarkEnd w:id="59"/>
+    <w:bookmarkStart w:id="61" w:name="ref-kwokSelfReportedSleep2018"/>
     <w:p>
       <w:pPr>
         <w:pStyle w:val="Literaturverzeichnis"/>
@@ -11450,7 +11692,7 @@
       <w:r>
         <w:t xml:space="preserve"> </w:t>
       </w:r>
-      <w:hyperlink r:id="rId58">
+      <w:hyperlink r:id="rId60">
         <w:r>
           <w:rPr>
             <w:rStyle w:val="Hyperlink"/>
@@ -11459,8 +11701,8 @@
         </w:r>
       </w:hyperlink>
     </w:p>
-    <w:bookmarkEnd w:id="59"/>
-    <w:bookmarkStart w:id="61" w:name="ref-maSleepDurationTotal2016"/>
+    <w:bookmarkEnd w:id="61"/>
+    <w:bookmarkStart w:id="63" w:name="ref-maSleepDurationTotal2016"/>
     <w:p>
       <w:pPr>
         <w:pStyle w:val="Literaturverzeichnis"/>
@@ -11506,7 +11748,7 @@
       <w:r>
         <w:t xml:space="preserve"> </w:t>
       </w:r>
-      <w:hyperlink r:id="rId60">
+      <w:hyperlink r:id="rId62">
         <w:r>
           <w:rPr>
             <w:rStyle w:val="Hyperlink"/>
@@ -11515,8 +11757,8 @@
         </w:r>
       </w:hyperlink>
     </w:p>
-    <w:bookmarkEnd w:id="61"/>
-    <w:bookmarkStart w:id="63" w:name="X346925cdfc2f52c89d96d4a14a2ac1b330702a3"/>
+    <w:bookmarkEnd w:id="63"/>
+    <w:bookmarkStart w:id="65" w:name="X346925cdfc2f52c89d96d4a14a2ac1b330702a3"/>
     <w:p>
       <w:pPr>
         <w:pStyle w:val="Literaturverzeichnis"/>
@@ -11562,7 +11804,7 @@
       <w:r>
         <w:t xml:space="preserve"> </w:t>
       </w:r>
-      <w:hyperlink r:id="rId62">
+      <w:hyperlink r:id="rId64">
         <w:r>
           <w:rPr>
             <w:rStyle w:val="Hyperlink"/>
@@ -11571,8 +11813,8 @@
         </w:r>
       </w:hyperlink>
     </w:p>
-    <w:bookmarkEnd w:id="63"/>
-    <w:bookmarkStart w:id="65" w:name="ref-wheatonShortSleepDuration2018"/>
+    <w:bookmarkEnd w:id="65"/>
+    <w:bookmarkStart w:id="67" w:name="ref-wheatonShortSleepDuration2018"/>
     <w:p>
       <w:pPr>
         <w:pStyle w:val="Literaturverzeichnis"/>
@@ -11651,7 +11893,7 @@
       <w:r>
         <w:t xml:space="preserve"> </w:t>
       </w:r>
-      <w:hyperlink r:id="rId64">
+      <w:hyperlink r:id="rId66">
         <w:r>
           <w:rPr>
             <w:rStyle w:val="Hyperlink"/>
@@ -11660,8 +11902,8 @@
         </w:r>
       </w:hyperlink>
     </w:p>
-    <w:bookmarkEnd w:id="65"/>
-    <w:bookmarkStart w:id="67" w:name="ref-liuPrevalenceHealthySleep2016"/>
+    <w:bookmarkEnd w:id="67"/>
+    <w:bookmarkStart w:id="69" w:name="ref-liuPrevalenceHealthySleep2016"/>
     <w:p>
       <w:pPr>
         <w:pStyle w:val="Literaturverzeichnis"/>
@@ -11728,7 +11970,7 @@
       <w:r>
         <w:t xml:space="preserve"> </w:t>
       </w:r>
-      <w:hyperlink r:id="rId66">
+      <w:hyperlink r:id="rId68">
         <w:r>
           <w:rPr>
             <w:rStyle w:val="Hyperlink"/>
@@ -11737,8 +11979,8 @@
         </w:r>
       </w:hyperlink>
     </w:p>
-    <w:bookmarkEnd w:id="67"/>
-    <w:bookmarkStart w:id="69" w:name="ref-klinePhysicalActivitySleep2021"/>
+    <w:bookmarkEnd w:id="69"/>
+    <w:bookmarkStart w:id="71" w:name="ref-klinePhysicalActivitySleep2021"/>
     <w:p>
       <w:pPr>
         <w:pStyle w:val="Literaturverzeichnis"/>
@@ -11808,7 +12050,7 @@
       <w:r>
         <w:t xml:space="preserve"> </w:t>
       </w:r>
-      <w:hyperlink r:id="rId68">
+      <w:hyperlink r:id="rId70">
         <w:r>
           <w:rPr>
             <w:rStyle w:val="Hyperlink"/>
@@ -11817,8 +12059,8 @@
         </w:r>
       </w:hyperlink>
     </w:p>
-    <w:bookmarkEnd w:id="69"/>
-    <w:bookmarkStart w:id="71" w:name="ref-kredlowEffectsPhysicalActivity2015"/>
+    <w:bookmarkEnd w:id="71"/>
+    <w:bookmarkStart w:id="73" w:name="ref-kredlowEffectsPhysicalActivity2015"/>
     <w:p>
       <w:pPr>
         <w:pStyle w:val="Literaturverzeichnis"/>
@@ -11864,7 +12106,7 @@
       <w:r>
         <w:t xml:space="preserve"> </w:t>
       </w:r>
-      <w:hyperlink r:id="rId70">
+      <w:hyperlink r:id="rId72">
         <w:r>
           <w:rPr>
             <w:rStyle w:val="Hyperlink"/>
@@ -11873,8 +12115,8 @@
         </w:r>
       </w:hyperlink>
     </w:p>
-    <w:bookmarkEnd w:id="71"/>
-    <w:bookmarkStart w:id="73" w:name="ref-bullWorldHealthOrganization2020"/>
+    <w:bookmarkEnd w:id="73"/>
+    <w:bookmarkStart w:id="75" w:name="ref-bullWorldHealthOrganization2020"/>
     <w:p>
       <w:pPr>
         <w:pStyle w:val="Literaturverzeichnis"/>
@@ -11932,7 +12174,7 @@
       <w:r>
         <w:t xml:space="preserve"> </w:t>
       </w:r>
-      <w:hyperlink r:id="rId72">
+      <w:hyperlink r:id="rId74">
         <w:r>
           <w:rPr>
             <w:rStyle w:val="Hyperlink"/>
@@ -11941,8 +12183,8 @@
         </w:r>
       </w:hyperlink>
     </w:p>
-    <w:bookmarkEnd w:id="73"/>
-    <w:bookmarkStart w:id="75" w:name="ref-antczakPhysicalActivitySleep2020"/>
+    <w:bookmarkEnd w:id="75"/>
+    <w:bookmarkStart w:id="77" w:name="ref-antczakPhysicalActivitySleep2020"/>
     <w:p>
       <w:pPr>
         <w:pStyle w:val="Literaturverzeichnis"/>
@@ -12000,7 +12242,7 @@
       <w:r>
         <w:t xml:space="preserve"> </w:t>
       </w:r>
-      <w:hyperlink r:id="rId74">
+      <w:hyperlink r:id="rId76">
         <w:r>
           <w:rPr>
             <w:rStyle w:val="Hyperlink"/>
@@ -12009,8 +12251,8 @@
         </w:r>
       </w:hyperlink>
     </w:p>
-    <w:bookmarkEnd w:id="75"/>
-    <w:bookmarkStart w:id="77" w:name="ref-langRelationshipPhysicalActivity2016"/>
+    <w:bookmarkEnd w:id="77"/>
+    <w:bookmarkStart w:id="79" w:name="ref-langRelationshipPhysicalActivity2016"/>
     <w:p>
       <w:pPr>
         <w:pStyle w:val="Literaturverzeichnis"/>
@@ -12068,7 +12310,7 @@
       <w:r>
         <w:t xml:space="preserve"> </w:t>
       </w:r>
-      <w:hyperlink r:id="rId76">
+      <w:hyperlink r:id="rId78">
         <w:r>
           <w:rPr>
             <w:rStyle w:val="Hyperlink"/>
@@ -12077,8 +12319,8 @@
         </w:r>
       </w:hyperlink>
     </w:p>
-    <w:bookmarkEnd w:id="77"/>
-    <w:bookmarkStart w:id="79" w:name="ref-aielloEffectExerciseTraining2016"/>
+    <w:bookmarkEnd w:id="79"/>
+    <w:bookmarkStart w:id="81" w:name="ref-aielloEffectExerciseTraining2016"/>
     <w:p>
       <w:pPr>
         <w:pStyle w:val="Literaturverzeichnis"/>
@@ -12136,7 +12378,7 @@
       <w:r>
         <w:t xml:space="preserve"> </w:t>
       </w:r>
-      <w:hyperlink r:id="rId78">
+      <w:hyperlink r:id="rId80">
         <w:r>
           <w:rPr>
             <w:rStyle w:val="Hyperlink"/>
@@ -12145,8 +12387,8 @@
         </w:r>
       </w:hyperlink>
     </w:p>
-    <w:bookmarkEnd w:id="79"/>
-    <w:bookmarkStart w:id="81" w:name="ref-bannoExerciseCanImprove2018"/>
+    <w:bookmarkEnd w:id="81"/>
+    <w:bookmarkStart w:id="83" w:name="ref-bannoExerciseCanImprove2018"/>
     <w:p>
       <w:pPr>
         <w:pStyle w:val="Literaturverzeichnis"/>
@@ -12204,7 +12446,7 @@
       <w:r>
         <w:t xml:space="preserve"> </w:t>
       </w:r>
-      <w:hyperlink r:id="rId80">
+      <w:hyperlink r:id="rId82">
         <w:r>
           <w:rPr>
             <w:rStyle w:val="Hyperlink"/>
@@ -12213,8 +12455,8 @@
         </w:r>
       </w:hyperlink>
     </w:p>
-    <w:bookmarkEnd w:id="81"/>
-    <w:bookmarkStart w:id="83" w:name="ref-bartelProtectiveRiskFactors2015"/>
+    <w:bookmarkEnd w:id="83"/>
+    <w:bookmarkStart w:id="85" w:name="ref-bartelProtectiveRiskFactors2015"/>
     <w:p>
       <w:pPr>
         <w:pStyle w:val="Literaturverzeichnis"/>
@@ -12259,7 +12501,7 @@
       <w:r>
         <w:t xml:space="preserve"> </w:t>
       </w:r>
-      <w:hyperlink r:id="rId82">
+      <w:hyperlink r:id="rId84">
         <w:r>
           <w:rPr>
             <w:rStyle w:val="Hyperlink"/>
@@ -12268,8 +12510,8 @@
         </w:r>
       </w:hyperlink>
     </w:p>
-    <w:bookmarkEnd w:id="83"/>
-    <w:bookmarkStart w:id="85" w:name="ref-edwardsAssessingImpactDiet2019"/>
+    <w:bookmarkEnd w:id="85"/>
+    <w:bookmarkStart w:id="87" w:name="ref-edwardsAssessingImpactDiet2019"/>
     <w:p>
       <w:pPr>
         <w:pStyle w:val="Literaturverzeichnis"/>
@@ -12336,7 +12578,7 @@
       <w:r>
         <w:t xml:space="preserve"> </w:t>
       </w:r>
-      <w:hyperlink r:id="rId84">
+      <w:hyperlink r:id="rId86">
         <w:r>
           <w:rPr>
             <w:rStyle w:val="Hyperlink"/>
@@ -12345,8 +12587,8 @@
         </w:r>
       </w:hyperlink>
     </w:p>
-    <w:bookmarkEnd w:id="85"/>
-    <w:bookmarkStart w:id="87" w:name="ref-gaoShorttermEfficacyMinimally2019"/>
+    <w:bookmarkEnd w:id="87"/>
+    <w:bookmarkStart w:id="89" w:name="ref-gaoShorttermEfficacyMinimally2019"/>
     <w:p>
       <w:pPr>
         <w:pStyle w:val="Literaturverzeichnis"/>
@@ -12404,7 +12646,7 @@
       <w:r>
         <w:t xml:space="preserve"> </w:t>
       </w:r>
-      <w:hyperlink r:id="rId86">
+      <w:hyperlink r:id="rId88">
         <w:r>
           <w:rPr>
             <w:rStyle w:val="Hyperlink"/>
@@ -12413,8 +12655,8 @@
         </w:r>
       </w:hyperlink>
     </w:p>
-    <w:bookmarkEnd w:id="87"/>
-    <w:bookmarkStart w:id="89" w:name="ref-iftikharComparativeEfficacyCPAP2017"/>
+    <w:bookmarkEnd w:id="89"/>
+    <w:bookmarkStart w:id="91" w:name="ref-iftikharComparativeEfficacyCPAP2017"/>
     <w:p>
       <w:pPr>
         <w:pStyle w:val="Literaturverzeichnis"/>
@@ -12478,7 +12720,7 @@
       <w:r>
         <w:t xml:space="preserve"> </w:t>
       </w:r>
-      <w:hyperlink r:id="rId88">
+      <w:hyperlink r:id="rId90">
         <w:r>
           <w:rPr>
             <w:rStyle w:val="Hyperlink"/>
@@ -12487,8 +12729,8 @@
         </w:r>
       </w:hyperlink>
     </w:p>
-    <w:bookmarkEnd w:id="89"/>
-    <w:bookmarkStart w:id="91" w:name="ref-iftikharEffectsExerciseTraining2014"/>
+    <w:bookmarkEnd w:id="91"/>
+    <w:bookmarkStart w:id="93" w:name="ref-iftikharEffectsExerciseTraining2014"/>
     <w:p>
       <w:pPr>
         <w:pStyle w:val="Literaturverzeichnis"/>
@@ -12533,7 +12775,7 @@
       <w:r>
         <w:t xml:space="preserve"> </w:t>
       </w:r>
-      <w:hyperlink r:id="rId90">
+      <w:hyperlink r:id="rId92">
         <w:r>
           <w:rPr>
             <w:rStyle w:val="Hyperlink"/>
@@ -12542,8 +12784,8 @@
         </w:r>
       </w:hyperlink>
     </w:p>
-    <w:bookmarkEnd w:id="91"/>
-    <w:bookmarkStart w:id="93" w:name="ref-janssenAssociationsScreenTime2020"/>
+    <w:bookmarkEnd w:id="93"/>
+    <w:bookmarkStart w:id="95" w:name="ref-janssenAssociationsScreenTime2020"/>
     <w:p>
       <w:pPr>
         <w:pStyle w:val="Literaturverzeichnis"/>
@@ -12601,7 +12843,7 @@
       <w:r>
         <w:t xml:space="preserve"> </w:t>
       </w:r>
-      <w:hyperlink r:id="rId92">
+      <w:hyperlink r:id="rId94">
         <w:r>
           <w:rPr>
             <w:rStyle w:val="Hyperlink"/>
@@ -12610,8 +12852,8 @@
         </w:r>
       </w:hyperlink>
     </w:p>
-    <w:bookmarkEnd w:id="93"/>
-    <w:bookmarkStart w:id="95" w:name="ref-ledermanDoesExerciseImprove2019"/>
+    <w:bookmarkEnd w:id="95"/>
+    <w:bookmarkStart w:id="97" w:name="ref-ledermanDoesExerciseImprove2019"/>
     <w:p>
       <w:pPr>
         <w:pStyle w:val="Literaturverzeichnis"/>
@@ -12669,7 +12911,7 @@
       <w:r>
         <w:t xml:space="preserve"> </w:t>
       </w:r>
-      <w:hyperlink r:id="rId94">
+      <w:hyperlink r:id="rId96">
         <w:r>
           <w:rPr>
             <w:rStyle w:val="Hyperlink"/>
@@ -12678,8 +12920,8 @@
         </w:r>
       </w:hyperlink>
     </w:p>
-    <w:bookmarkEnd w:id="95"/>
-    <w:bookmarkStart w:id="97" w:name="ref-lins-filhoEffectExerciseTraining2020"/>
+    <w:bookmarkEnd w:id="97"/>
+    <w:bookmarkStart w:id="99" w:name="ref-lins-filhoEffectExerciseTraining2020"/>
     <w:p>
       <w:pPr>
         <w:pStyle w:val="Literaturverzeichnis"/>
@@ -12725,7 +12967,7 @@
       <w:r>
         <w:t xml:space="preserve"> </w:t>
       </w:r>
-      <w:hyperlink r:id="rId96">
+      <w:hyperlink r:id="rId98">
         <w:r>
           <w:rPr>
             <w:rStyle w:val="Hyperlink"/>
@@ -12734,8 +12976,8 @@
         </w:r>
       </w:hyperlink>
     </w:p>
-    <w:bookmarkEnd w:id="97"/>
-    <w:bookmarkStart w:id="99" w:name="ref-mendelsonObstructiveSleepApnea2018"/>
+    <w:bookmarkEnd w:id="99"/>
+    <w:bookmarkStart w:id="101" w:name="ref-mendelsonObstructiveSleepApnea2018"/>
     <w:p>
       <w:pPr>
         <w:pStyle w:val="Literaturverzeichnis"/>
@@ -12793,7 +13035,7 @@
       <w:r>
         <w:t xml:space="preserve"> </w:t>
       </w:r>
-      <w:hyperlink r:id="rId98">
+      <w:hyperlink r:id="rId100">
         <w:r>
           <w:rPr>
             <w:rStyle w:val="Hyperlink"/>
@@ -12802,8 +13044,8 @@
         </w:r>
       </w:hyperlink>
     </w:p>
-    <w:bookmarkEnd w:id="99"/>
-    <w:bookmarkStart w:id="101" w:name="ref-rubio-ariasEffectExerciseSleep2017"/>
+    <w:bookmarkEnd w:id="101"/>
+    <w:bookmarkStart w:id="103" w:name="ref-rubio-ariasEffectExerciseSleep2017"/>
     <w:p>
       <w:pPr>
         <w:pStyle w:val="Literaturverzeichnis"/>
@@ -12861,7 +13103,7 @@
       <w:r>
         <w:t xml:space="preserve"> </w:t>
       </w:r>
-      <w:hyperlink r:id="rId100">
+      <w:hyperlink r:id="rId102">
         <w:r>
           <w:rPr>
             <w:rStyle w:val="Hyperlink"/>
@@ -12870,8 +13112,8 @@
         </w:r>
       </w:hyperlink>
     </w:p>
-    <w:bookmarkEnd w:id="101"/>
-    <w:bookmarkStart w:id="103" w:name="ref-stutzEffectsEveningExercise2019"/>
+    <w:bookmarkEnd w:id="103"/>
+    <w:bookmarkStart w:id="105" w:name="ref-stutzEffectsEveningExercise2019"/>
     <w:p>
       <w:pPr>
         <w:pStyle w:val="Literaturverzeichnis"/>
@@ -12958,7 +13200,7 @@
       <w:r>
         <w:t xml:space="preserve"> </w:t>
       </w:r>
-      <w:hyperlink r:id="rId102">
+      <w:hyperlink r:id="rId104">
         <w:r>
           <w:rPr>
             <w:rStyle w:val="Hyperlink"/>
@@ -12967,8 +13209,8 @@
         </w:r>
       </w:hyperlink>
     </w:p>
-    <w:bookmarkEnd w:id="103"/>
-    <w:bookmarkStart w:id="105" w:name="ref-yangEffectsExerciseSleep2020"/>
+    <w:bookmarkEnd w:id="105"/>
+    <w:bookmarkStart w:id="107" w:name="ref-yangEffectsExerciseSleep2020"/>
     <w:p>
       <w:pPr>
         <w:pStyle w:val="Literaturverzeichnis"/>
@@ -13080,7 +13322,7 @@
       <w:r>
         <w:t xml:space="preserve"> </w:t>
       </w:r>
-      <w:hyperlink r:id="rId104">
+      <w:hyperlink r:id="rId106">
         <w:r>
           <w:rPr>
             <w:rStyle w:val="Hyperlink"/>
@@ -13089,8 +13331,8 @@
         </w:r>
       </w:hyperlink>
     </w:p>
-    <w:bookmarkEnd w:id="105"/>
-    <w:bookmarkStart w:id="107" w:name="ref-yangExerciseTrainingImproves2012"/>
+    <w:bookmarkEnd w:id="107"/>
+    <w:bookmarkStart w:id="109" w:name="ref-yangExerciseTrainingImproves2012"/>
     <w:p>
       <w:pPr>
         <w:pStyle w:val="Literaturverzeichnis"/>
@@ -13148,7 +13390,7 @@
       <w:r>
         <w:t xml:space="preserve"> </w:t>
       </w:r>
-      <w:hyperlink r:id="rId106">
+      <w:hyperlink r:id="rId108">
         <w:r>
           <w:rPr>
             <w:rStyle w:val="Hyperlink"/>
@@ -13157,8 +13399,8 @@
         </w:r>
       </w:hyperlink>
     </w:p>
-    <w:bookmarkEnd w:id="107"/>
-    <w:bookmarkStart w:id="109" w:name="ref-yangSedentaryBehaviorSleep2017"/>
+    <w:bookmarkEnd w:id="109"/>
+    <w:bookmarkStart w:id="111" w:name="ref-yangSedentaryBehaviorSleep2017"/>
     <w:p>
       <w:pPr>
         <w:pStyle w:val="Literaturverzeichnis"/>
@@ -13246,7 +13488,7 @@
       <w:r>
         <w:t xml:space="preserve"> </w:t>
       </w:r>
-      <w:hyperlink r:id="rId108">
+      <w:hyperlink r:id="rId110">
         <w:r>
           <w:rPr>
             <w:rStyle w:val="Hyperlink"/>
@@ -13255,8 +13497,8 @@
         </w:r>
       </w:hyperlink>
     </w:p>
-    <w:bookmarkEnd w:id="109"/>
-    <w:bookmarkStart w:id="111" w:name="ref-rileyUsingIndividualParticipant2023"/>
+    <w:bookmarkEnd w:id="111"/>
+    <w:bookmarkStart w:id="113" w:name="ref-rileyUsingIndividualParticipant2023"/>
     <w:p>
       <w:pPr>
         <w:pStyle w:val="Literaturverzeichnis"/>
@@ -13302,7 +13544,7 @@
       <w:r>
         <w:t xml:space="preserve"> </w:t>
       </w:r>
-      <w:hyperlink r:id="rId110">
+      <w:hyperlink r:id="rId112">
         <w:r>
           <w:rPr>
             <w:rStyle w:val="Hyperlink"/>
@@ -13311,8 +13553,8 @@
         </w:r>
       </w:hyperlink>
     </w:p>
-    <w:bookmarkEnd w:id="111"/>
-    <w:bookmarkStart w:id="113" w:name="Xa0cbe05eccacccf17bde02d7669b1fb01f31efd"/>
+    <w:bookmarkEnd w:id="113"/>
+    <w:bookmarkStart w:id="115" w:name="Xa0cbe05eccacccf17bde02d7669b1fb01f31efd"/>
     <w:p>
       <w:pPr>
         <w:pStyle w:val="Literaturverzeichnis"/>
@@ -13345,7 +13587,7 @@
       <w:r>
         <w:t xml:space="preserve"> </w:t>
       </w:r>
-      <w:hyperlink r:id="rId112">
+      <w:hyperlink r:id="rId114">
         <w:r>
           <w:rPr>
             <w:rStyle w:val="Hyperlink"/>
@@ -13354,10 +13596,14 @@
         </w:r>
       </w:hyperlink>
     </w:p>
-    <w:bookmarkEnd w:id="113"/>
-    <w:bookmarkEnd w:id="114"/>
     <w:bookmarkEnd w:id="115"/>
     <w:bookmarkEnd w:id="116"/>
+    <w:p>
+      <w:r>
+        <w:br w:type="page"/>
+      </w:r>
+    </w:p>
+    <w:bookmarkEnd w:id="117"/>
     <w:sectPr>
       <w:headerReference r:id="rId9" w:type="even"/>
       <w:headerReference r:id="rId11" w:type="default"/>
@@ -13519,7 +13765,7 @@
       <w:ind w:right="360"/>
     </w:pPr>
     <w:r>
-      <w:t>TITLE</w:t>
+      <w:t>SLEEP AND PHYSICAL ACTIVITY ACROSS THE LIFESPAN</w:t>
     </w:r>
   </w:p>
 </w:hdr>
@@ -13595,7 +13841,7 @@
       <w:t xml:space="preserve">Running head: </w:t>
     </w:r>
     <w:r>
-      <w:t>TITLE</w:t>
+      <w:t>SLEEP AND PHYSICAL ACTIVITY ACROSS THE LIFESPAN</w:t>
     </w:r>
   </w:p>
 </w:hdr>

</xml_diff>

<commit_message>
Update discussion for new results
</commit_message>
<xml_diff>
--- a/doc/manuscript.docx
+++ b/doc/manuscript.docx
@@ -4582,7 +4582,7 @@
         <w:t xml:space="preserve"> </w:t>
       </w:r>
       <w:r>
-        <w:t xml:space="preserve">We estimated the effect of physical activity volume on sleep by age, and the results are presented in Table</w:t>
+        <w:t xml:space="preserve">The effect of physical activity volume on sleep by age are presented in Table</w:t>
       </w:r>
       <w:r>
         <w:t xml:space="preserve"> </w:t>
@@ -4609,25 +4609,19 @@
         <w:t xml:space="preserve"> </w:t>
       </w:r>
       <w:r>
-        <w:t xml:space="preserve">There was no meaningful relationship between physical activity volume and sleep duration or sleep efficiency.</w:t>
-      </w:r>
-      <w:r>
-        <w:t xml:space="preserve"> </w:t>
-      </w:r>
-      <w:r>
-        <w:t xml:space="preserve">Physical activity volume and sleep onset had a very weak positive association for younger individuals, but a negative association for older individuals, where sleep onset was reduced among those with the highest physical activity.</w:t>
-      </w:r>
-      <w:r>
-        <w:t xml:space="preserve"> </w:t>
-      </w:r>
-      <w:r>
-        <w:t xml:space="preserve">There was a strong positive association between physical activity volume and sleep regularity, which was strongest among older participants.</w:t>
-      </w:r>
-      <w:r>
-        <w:t xml:space="preserve"> </w:t>
-      </w:r>
-      <w:r>
-        <w:t xml:space="preserve">For participants aged 35 years and above, this link weakened among those with a physical activity volume greater than two standard deviations.</w:t>
+        <w:t xml:space="preserve">Higher physical activity volume was associated with longer sleep duration, higher sleep efficiency, earlier sleep onset, and more regular sleep.</w:t>
+      </w:r>
+      <w:r>
+        <w:t xml:space="preserve"> </w:t>
+      </w:r>
+      <w:r>
+        <w:t xml:space="preserve">While we observed statistically significant curvilinear relationships, these did not appear to meaningfully change the effect.</w:t>
+      </w:r>
+      <w:r>
+        <w:t xml:space="preserve"> </w:t>
+      </w:r>
+      <w:r>
+        <w:t xml:space="preserve">The relationship between physical activity volume and sleep duration, efficiency, and onset was consistent across the age groups, with some very weak evidence that the relationship with sleep regularity grew stronger with age.</w:t>
       </w:r>
     </w:p>
     <w:p>
@@ -8229,13 +8223,7 @@
         <w:pStyle w:val="FirstParagraph"/>
       </w:pPr>
       <w:r>
-        <w:t xml:space="preserve">We estimated how physical activity intensity affects sleep across different age groups.</w:t>
-      </w:r>
-      <w:r>
-        <w:t xml:space="preserve"> </w:t>
-      </w:r>
-      <w:r>
-        <w:t xml:space="preserve">We present the results controlling for sex, SES, and BMI, in Table</w:t>
+        <w:t xml:space="preserve">We estimated how physical activity intensity affects sleep across different age groups and present the results controlling for sex, SES, and BMI, in Table</w:t>
       </w:r>
       <w:r>
         <w:t xml:space="preserve"> </w:t>
@@ -8262,13 +8250,25 @@
         <w:t xml:space="preserve"> </w:t>
       </w:r>
       <w:r>
-        <w:t xml:space="preserve">We found no evidence that physical activity intensity is related to sleep duration, sleep efficiency, or sleep onset.</w:t>
-      </w:r>
-      <w:r>
-        <w:t xml:space="preserve"> </w:t>
-      </w:r>
-      <w:r>
-        <w:t xml:space="preserve">However, we did find evidence for an association between physical activity intensity and improved sleep regularity, which weakened as age increased.</w:t>
+        <w:t xml:space="preserve">We observed weak associations between physical activity intensity and sleep duration, sleep efficiency, and sleep onset, with a stronger relationship observed with sleep regularity.</w:t>
+      </w:r>
+      <w:r>
+        <w:t xml:space="preserve"> </w:t>
+      </w:r>
+      <w:r>
+        <w:t xml:space="preserve">As with physical activity volume, we observed statistically significant curvilinear relationships, but these were only meaningful for the impact of physical activity intensity on sleep regularity, in which very low levels of intensity were strongly associated with poor sleep regularity and the benefits of increasing intensity diminished past one standard deviation above the mean.</w:t>
+      </w:r>
+      <w:r>
+        <w:t xml:space="preserve"> </w:t>
+      </w:r>
+      <w:r>
+        <w:t xml:space="preserve">While age statistically significantly modified the relationship between physical activity intensity and sleep duration, efficiency, and regularity, the effect was negligible for duration and efficiency.</w:t>
+      </w:r>
+      <w:r>
+        <w:t xml:space="preserve"> </w:t>
+      </w:r>
+      <w:r>
+        <w:t xml:space="preserve">For regularity, the association weakened with age.</w:t>
       </w:r>
     </w:p>
     <w:p>
@@ -12017,13 +12017,7 @@
         <w:t xml:space="preserve"> </w:t>
       </w:r>
       <w:r>
-        <w:t xml:space="preserve">We did not find a relationship between sleep efficiency and physical activity volume.</w:t>
-      </w:r>
-      <w:r>
-        <w:t xml:space="preserve"> </w:t>
-      </w:r>
-      <w:r>
-        <w:t xml:space="preserve">However, there was a weak linear association between sleep efficiency and more intense physical activity.</w:t>
+        <w:t xml:space="preserve">There was a negligible relationship between sleep efficiency and physical activity volume and a weak linear association between sleep efficiency and more intense physical activity.</w:t>
       </w:r>
     </w:p>
     <w:p>
@@ -12131,13 +12125,7 @@
         <w:t xml:space="preserve"> </w:t>
       </w:r>
       <w:r>
-        <w:t xml:space="preserve">There were weak curvilinear relationships where average sleep onset was linked to the highest levels of physical activity volume and intensity.</w:t>
-      </w:r>
-      <w:r>
-        <w:t xml:space="preserve"> </w:t>
-      </w:r>
-      <w:r>
-        <w:t xml:space="preserve">The U-shaped relationship between sleep onset and physical activity volume attenuated for older participants.</w:t>
+        <w:t xml:space="preserve">There were weak curvilinear relationships where average sleep onset was linked to the highest levels of physical activity volume, but not intensity.</w:t>
       </w:r>
     </w:p>
     <w:p>
@@ -12245,31 +12233,13 @@
         <w:t xml:space="preserve"> </w:t>
       </w:r>
       <w:r>
-        <w:t xml:space="preserve">There was a J-shaped relationship between sleep regularity and physical activity volume.</w:t>
-      </w:r>
-      <w:r>
-        <w:t xml:space="preserve"> </w:t>
-      </w:r>
-      <w:r>
-        <w:t xml:space="preserve">Participants with below-average sleep regularity tended to have average physical activity volume.</w:t>
-      </w:r>
-      <w:r>
-        <w:t xml:space="preserve"> </w:t>
-      </w:r>
-      <w:r>
-        <w:t xml:space="preserve">Increases in regularity above the average were linked to greater physical activity volume.</w:t>
-      </w:r>
-      <w:r>
-        <w:t xml:space="preserve"> </w:t>
-      </w:r>
-      <w:r>
-        <w:t xml:space="preserve">There was a linear relationship between sleep regularity and physical activity intensity which slightly attenuated with age.</w:t>
-      </w:r>
-      <w:r>
-        <w:t xml:space="preserve"> </w:t>
-      </w:r>
-      <w:r>
-        <w:t xml:space="preserve">Greater sleep regularity was associated with greater physical activity the following day.</w:t>
+        <w:t xml:space="preserve">There was a positive linear relationship between sleep regularity and both physical activity volume and intensity.</w:t>
+      </w:r>
+      <w:r>
+        <w:t xml:space="preserve"> </w:t>
+      </w:r>
+      <w:r>
+        <w:t xml:space="preserve">These relationships were slightly attenuated with age, such that for older adults the effect was negligible.</w:t>
       </w:r>
     </w:p>
     <w:p>
@@ -12351,17 +12321,25 @@
         <w:t xml:space="preserve"> </w:t>
       </w:r>
       <w:r>
-        <w:t xml:space="preserve">We found no evidence that physical activity volume or intensity are related to sleep duration or efficiency.</w:t>
-      </w:r>
-      <w:r>
-        <w:t xml:space="preserve"> </w:t>
-      </w:r>
-      <w:r>
-        <w:t xml:space="preserve">We did, however, observe relationships between the volume of physical activity an individual accumulated, and their subsequent sleep onset and regularity.</w:t>
-      </w:r>
-      <w:r>
-        <w:t xml:space="preserve"> </w:t>
-      </w:r>
+        <w:t xml:space="preserve">We found that both the amount and the intensity of physical activity was associated with longer sleep duration, higher sleep efficiency, earlier sleep onset, and more regular sleep.</w:t>
+      </w:r>
+      <w:r>
+        <w:t xml:space="preserve"> </w:t>
+      </w:r>
+      <w:r>
+        <w:t xml:space="preserve">These relationships were the strongest for sleep regularity, although the the relationship between physical activity intensity weakened with age.</w:t>
+      </w:r>
+      <w:r>
+        <w:t xml:space="preserve"> </w:t>
+      </w:r>
+      <w:r>
+        <w:t xml:space="preserve">Many of these relationships were bi-directional.</w:t>
+      </w:r>
+    </w:p>
+    <w:p>
+      <w:pPr>
+        <w:pStyle w:val="Textkrper"/>
+      </w:pPr>
       <w:r>
         <w:t xml:space="preserve">Sleep was more regular among people who engaged in more intense physical activity.</w:t>
       </w:r>

</xml_diff>

<commit_message>
Finalise manuscript and rerun pipeline
</commit_message>
<xml_diff>
--- a/doc/manuscript.docx
+++ b/doc/manuscript.docx
@@ -459,23 +459,184 @@
         <w:pStyle w:val="Textkrper"/>
       </w:pPr>
       <w:r>
-        <w:t xml:space="preserve">One or two sentences providing a</w:t>
-      </w:r>
-      <w:r>
-        <w:t xml:space="preserve"> </w:t>
-      </w:r>
-      <w:r>
         <w:rPr>
           <w:b/>
           <w:bCs/>
         </w:rPr>
-        <w:t xml:space="preserve">basic introduction</w:t>
-      </w:r>
-      <w:r>
-        <w:t xml:space="preserve"> </w:t>
-      </w:r>
-      <w:r>
-        <w:t xml:space="preserve">to the field, comprehensible to a scientist in any discipline.</w:t>
+        <w:t xml:space="preserve">Objectives</w:t>
+      </w:r>
+      <w:r>
+        <w:t xml:space="preserve">: To examine the association between device-measured physical activity and sleep across the lifespan using individual participant data (IPD) meta-analysis.</w:t>
+      </w:r>
+      <w:r>
+        <w:t xml:space="preserve"> </w:t>
+      </w:r>
+      <w:r>
+        <w:t xml:space="preserve">We furthed aimed to examine how the association differed by age.</w:t>
+      </w:r>
+    </w:p>
+    <w:p>
+      <w:pPr>
+        <w:pStyle w:val="Textkrper"/>
+      </w:pPr>
+      <w:r>
+        <w:rPr>
+          <w:b/>
+          <w:bCs/>
+        </w:rPr>
+        <w:t xml:space="preserve">Design</w:t>
+      </w:r>
+      <w:r>
+        <w:t xml:space="preserve">: Pooled IPD analysis of accelerometer-based physical activity and sleep data from multiple observational studies.</w:t>
+      </w:r>
+    </w:p>
+    <w:p>
+      <w:pPr>
+        <w:pStyle w:val="Textkrper"/>
+      </w:pPr>
+      <w:r>
+        <w:rPr>
+          <w:b/>
+          <w:bCs/>
+        </w:rPr>
+        <w:t xml:space="preserve">Setting</w:t>
+      </w:r>
+      <w:r>
+        <w:t xml:space="preserve">: We sourced data from 20 observational studies conducted multiple geographical regions and across the lifespan.</w:t>
+      </w:r>
+    </w:p>
+    <w:p>
+      <w:pPr>
+        <w:pStyle w:val="Textkrper"/>
+      </w:pPr>
+      <w:r>
+        <w:rPr>
+          <w:b/>
+          <w:bCs/>
+        </w:rPr>
+        <w:t xml:space="preserve">Participants</w:t>
+      </w:r>
+      <w:r>
+        <w:t xml:space="preserve">: The dataset included 220,612 observations from 28,823 participants aged 2 to 94 years.</w:t>
+      </w:r>
+      <w:r>
+        <w:t xml:space="preserve"> </w:t>
+      </w:r>
+      <w:r>
+        <w:t xml:space="preserve">Participants were selected from studies that used research-grade accelerometers with at least four valid days of wear time, including at least one weekend day.</w:t>
+      </w:r>
+      <w:r>
+        <w:t xml:space="preserve"> </w:t>
+      </w:r>
+      <w:r>
+        <w:t xml:space="preserve">Exclusion criteria included insufficient wear time and missing key covariate data.</w:t>
+      </w:r>
+    </w:p>
+    <w:p>
+      <w:pPr>
+        <w:pStyle w:val="Textkrper"/>
+      </w:pPr>
+      <w:r>
+        <w:rPr>
+          <w:b/>
+          <w:bCs/>
+        </w:rPr>
+        <w:t xml:space="preserve">Main Outcome Measures</w:t>
+      </w:r>
+      <w:r>
+        <w:t xml:space="preserve">: Sleep outcomes included total sleep time, sleep efficiency, sleep onset timing, and sleep regularity.</w:t>
+      </w:r>
+      <w:r>
+        <w:t xml:space="preserve"> </w:t>
+      </w:r>
+      <w:r>
+        <w:t xml:space="preserve">Physical activity was assessed in terms of volume (average acceleration) and intensity (intensity gradient).</w:t>
+      </w:r>
+      <w:r>
+        <w:t xml:space="preserve"> </w:t>
+      </w:r>
+      <w:r>
+        <w:t xml:space="preserve">Mixed-effects models were used to examine associations, adjusting for age, sex, body mass index, and socioeconomic status.</w:t>
+      </w:r>
+    </w:p>
+    <w:p>
+      <w:pPr>
+        <w:pStyle w:val="Textkrper"/>
+      </w:pPr>
+      <w:r>
+        <w:rPr>
+          <w:b/>
+          <w:bCs/>
+        </w:rPr>
+        <w:t xml:space="preserve">Results</w:t>
+      </w:r>
+      <w:r>
+        <w:t xml:space="preserve">: Higher physical activity volume was associated with longer sleep duration, greater sleep efficiency, earlier sleep onset, and more regular sleep.</w:t>
+      </w:r>
+      <w:r>
+        <w:t xml:space="preserve"> </w:t>
+      </w:r>
+      <w:r>
+        <w:t xml:space="preserve">The effect of physical activity on sleep regularity was particularly strong, with minimal variation across age groups.</w:t>
+      </w:r>
+      <w:r>
+        <w:t xml:space="preserve"> </w:t>
+      </w:r>
+      <w:r>
+        <w:t xml:space="preserve">Conversely, individuals with more regular sleep patterns and earlier sleep onset exhibited higher levels of physical activity the following day, though these effects were modest.</w:t>
+      </w:r>
+    </w:p>
+    <w:p>
+      <w:pPr>
+        <w:pStyle w:val="Textkrper"/>
+      </w:pPr>
+      <w:r>
+        <w:rPr>
+          <w:b/>
+          <w:bCs/>
+        </w:rPr>
+        <w:t xml:space="preserve">Conclusions</w:t>
+      </w:r>
+      <w:r>
+        <w:t xml:space="preserve">: Physical activity is positively associated with sleep regularity across the lifespan, supporting its role as a non-pharmacological intervention for maintaining consistent sleep patterns.</w:t>
+      </w:r>
+      <w:r>
+        <w:t xml:space="preserve"> </w:t>
+      </w:r>
+      <w:r>
+        <w:t xml:space="preserve">Public health recommendations should emphasize the importance of regular physical activity for sleep health.</w:t>
+      </w:r>
+      <w:r>
+        <w:t xml:space="preserve"> </w:t>
+      </w:r>
+      <w:r>
+        <w:t xml:space="preserve">Future research should investigate mechanisms underlying these associations and assess targeted intervention strategies.</w:t>
+      </w:r>
+    </w:p>
+    <w:p>
+      <w:pPr>
+        <w:pStyle w:val="Textkrper"/>
+      </w:pPr>
+      <w:r>
+        <w:rPr>
+          <w:b/>
+          <w:bCs/>
+        </w:rPr>
+        <w:t xml:space="preserve">Trial Registration</w:t>
+      </w:r>
+      <w:r>
+        <w:t xml:space="preserve">: The study protocol was pre-registered on the Open Science Framework (</w:t>
+      </w:r>
+      <w:hyperlink r:id="rId21">
+        <w:r>
+          <w:rPr>
+            <w:rStyle w:val="Hyperlink"/>
+          </w:rPr>
+          <w:t xml:space="preserve">https://osf.io/ahd96</w:t>
+        </w:r>
+      </w:hyperlink>
+      <w:r>
+        <w:t xml:space="preserve">).</w:t>
       </w:r>
     </w:p>
     <w:p>
@@ -522,7 +683,7 @@
         <w:t xml:space="preserve">The relationship between sleep and physical activity across the lifespan</w:t>
       </w:r>
     </w:p>
-    <w:bookmarkStart w:id="21" w:name="introduction"/>
+    <w:bookmarkStart w:id="22" w:name="introduction"/>
     <w:p>
       <w:pPr>
         <w:pStyle w:val="berschrift1"/>
@@ -789,7 +950,7 @@
         <w:t xml:space="preserve">We examined whether individuals who are more physically active have better sleep, whether age, sex, and socio-cultural factors moderate the association between physical activity and sleep, and whether there is a bidirectional association between physical activity and sleep.</w:t>
       </w:r>
     </w:p>
-    <w:bookmarkEnd w:id="21"/>
+    <w:bookmarkEnd w:id="22"/>
     <w:bookmarkStart w:id="32" w:name="methods"/>
     <w:p>
       <w:pPr>
@@ -806,7 +967,7 @@
       <w:r>
         <w:t xml:space="preserve">We pre-registered all methods and analyses on the Open Science Framework (OSF) before data acquisition began (</w:t>
       </w:r>
-      <w:hyperlink r:id="rId22">
+      <w:hyperlink r:id="rId21">
         <w:r>
           <w:rPr>
             <w:rStyle w:val="Hyperlink"/>
@@ -1599,7 +1760,13 @@
         <w:pStyle w:val="FirstParagraph"/>
       </w:pPr>
       <w:r>
-        <w:t xml:space="preserve">The aggregated data-set describes 220,612 observations of daily physical activity and sleep from 28,823 unique participants.</w:t>
+        <w:t xml:space="preserve">The aggregated dataset describes 220,612 observations of daily physical activity and sleep from 28,823 unique participants.</w:t>
+      </w:r>
+      <w:r>
+        <w:t xml:space="preserve"> </w:t>
+      </w:r>
+      <w:r>
+        <w:t xml:space="preserve">Of these, 71,451 days were excluded as they had insufficient wear time, which also resulted in the exclusion of 4,214 participants.</w:t>
       </w:r>
       <w:r>
         <w:t xml:space="preserve"> </w:t>
@@ -1617,16 +1784,27 @@
         <w:t xml:space="preserve"> </w:t>
       </w:r>
       <w:r>
-        <w:t xml:space="preserve">shows demographic information for all participants.</w:t>
-      </w:r>
-      <w:r>
-        <w:t xml:space="preserve"> </w:t>
-      </w:r>
-      <w:r>
-        <w:t xml:space="preserve">Observations were not uniform across the days of the week</w:t>
-      </w:r>
-      <w:r>
-        <w:t xml:space="preserve"> </w:t>
+        <w:t xml:space="preserve">shows demographic information for the included participants.</w:t>
+      </w:r>
+      <w:r>
+        <w:t xml:space="preserve"> </w:t>
+      </w:r>
+      <w:r>
+        <w:t xml:space="preserve">The majority of participants came from Europe, Oceania, and South America, with limited data from other regions.</w:t>
+      </w:r>
+      <w:r>
+        <w:t xml:space="preserve"> </w:t>
+      </w:r>
+      <w:r>
+        <w:t xml:space="preserve">There was a near-even split by sex (50.5%), but age skewed towards both younger children (2-11 years, 39.8%) and older adults (66+ years, 26.8%).</w:t>
+      </w:r>
+    </w:p>
+    <w:p>
+      <w:pPr>
+        <w:pStyle w:val="Textkrper"/>
+      </w:pPr>
+      <w:r>
+        <w:t xml:space="preserve">Valid observations were not uniform across the days of the week (</w:t>
       </w:r>
       <m:oMath>
         <m:sSubSup>
@@ -1661,13 +1839,13 @@
         <w:t xml:space="preserve"> </w:t>
       </w:r>
       <w:r>
-        <w:t xml:space="preserve">= 80.75, p = &lt; .001.</w:t>
-      </w:r>
-      <w:r>
-        <w:t xml:space="preserve"> </w:t>
-      </w:r>
-      <w:r>
-        <w:t xml:space="preserve">There were fewer observations on Monday (z = -7.80) and Sunday (z = -3.01); and more on Wednesday (z = 2.98).</w:t>
+        <w:t xml:space="preserve">= 298.93, p = &lt; .001).</w:t>
+      </w:r>
+      <w:r>
+        <w:t xml:space="preserve"> </w:t>
+      </w:r>
+      <w:r>
+        <w:t xml:space="preserve">Weekends were over-represented (Saturday: z = 6.09; Sunday: z = 11.44), while Wednesdays (z = -9.77) and Thursdays (z = -8.54) were under-represented.</w:t>
       </w:r>
       <w:r>
         <w:t xml:space="preserve"> </w:t>
@@ -2094,67 +2272,67 @@
               <w:jc w:val="left"/>
             </w:pPr>
             <w:r>
-              <w:t xml:space="preserve">   Valid weartime hours</w:t>
-            </w:r>
-          </w:p>
-        </w:tc>
-        <w:tc>
-          <w:tcPr/>
-          <w:p>
-            <w:pPr>
-              <w:pStyle w:val="Compact"/>
-              <w:jc w:val="left"/>
-            </w:pPr>
-            <w:r>
-              <w:t xml:space="preserve">22.18 (2.35)</w:t>
-            </w:r>
-          </w:p>
-        </w:tc>
-        <w:tc>
-          <w:tcPr/>
-          <w:p>
-            <w:pPr>
-              <w:pStyle w:val="Compact"/>
-              <w:jc w:val="left"/>
-            </w:pPr>
-            <w:r>
-              <w:t xml:space="preserve">22.18 (2.67)</w:t>
-            </w:r>
-          </w:p>
-        </w:tc>
-        <w:tc>
-          <w:tcPr/>
-          <w:p>
-            <w:pPr>
-              <w:pStyle w:val="Compact"/>
-              <w:jc w:val="left"/>
-            </w:pPr>
-            <w:r>
-              <w:t xml:space="preserve">22.15 (2.63)</w:t>
-            </w:r>
-          </w:p>
-        </w:tc>
-        <w:tc>
-          <w:tcPr/>
-          <w:p>
-            <w:pPr>
-              <w:pStyle w:val="Compact"/>
-              <w:jc w:val="left"/>
-            </w:pPr>
-            <w:r>
-              <w:t xml:space="preserve">22.75 (2.23)</w:t>
-            </w:r>
-          </w:p>
-        </w:tc>
-        <w:tc>
-          <w:tcPr/>
-          <w:p>
-            <w:pPr>
-              <w:pStyle w:val="Compact"/>
-              <w:jc w:val="left"/>
-            </w:pPr>
-            <w:r>
-              <w:t xml:space="preserve">23.82 (0.75)</w:t>
+              <w:t xml:space="preserve">   Valid Weartime Hours</w:t>
+            </w:r>
+          </w:p>
+        </w:tc>
+        <w:tc>
+          <w:tcPr/>
+          <w:p>
+            <w:pPr>
+              <w:pStyle w:val="Compact"/>
+              <w:jc w:val="left"/>
+            </w:pPr>
+            <w:r>
+              <w:t xml:space="preserve">23.11 (1.67)</w:t>
+            </w:r>
+          </w:p>
+        </w:tc>
+        <w:tc>
+          <w:tcPr/>
+          <w:p>
+            <w:pPr>
+              <w:pStyle w:val="Compact"/>
+              <w:jc w:val="left"/>
+            </w:pPr>
+            <w:r>
+              <w:t xml:space="preserve">23.07 (1.75)</w:t>
+            </w:r>
+          </w:p>
+        </w:tc>
+        <w:tc>
+          <w:tcPr/>
+          <w:p>
+            <w:pPr>
+              <w:pStyle w:val="Compact"/>
+              <w:jc w:val="left"/>
+            </w:pPr>
+            <w:r>
+              <w:t xml:space="preserve">23.35 (1.53)</w:t>
+            </w:r>
+          </w:p>
+        </w:tc>
+        <w:tc>
+          <w:tcPr/>
+          <w:p>
+            <w:pPr>
+              <w:pStyle w:val="Compact"/>
+              <w:jc w:val="left"/>
+            </w:pPr>
+            <w:r>
+              <w:t xml:space="preserve">23.72 (0.87)</w:t>
+            </w:r>
+          </w:p>
+        </w:tc>
+        <w:tc>
+          <w:tcPr/>
+          <w:p>
+            <w:pPr>
+              <w:pStyle w:val="Compact"/>
+              <w:jc w:val="left"/>
+            </w:pPr>
+            <w:r>
+              <w:t xml:space="preserve">23.87 (0.60)</w:t>
             </w:r>
           </w:p>
         </w:tc>
@@ -2168,67 +2346,67 @@
               <w:jc w:val="left"/>
             </w:pPr>
             <w:r>
-              <w:t xml:space="preserve">   PA intensity</w:t>
-            </w:r>
-          </w:p>
-        </w:tc>
-        <w:tc>
-          <w:tcPr/>
-          <w:p>
-            <w:pPr>
-              <w:pStyle w:val="Compact"/>
-              <w:jc w:val="left"/>
-            </w:pPr>
-            <w:r>
-              <w:t xml:space="preserve">-2.12 (0.19)</w:t>
-            </w:r>
-          </w:p>
-        </w:tc>
-        <w:tc>
-          <w:tcPr/>
-          <w:p>
-            <w:pPr>
-              <w:pStyle w:val="Compact"/>
-              <w:jc w:val="left"/>
-            </w:pPr>
-            <w:r>
-              <w:t xml:space="preserve">-2.20 (0.19)</w:t>
-            </w:r>
-          </w:p>
-        </w:tc>
-        <w:tc>
-          <w:tcPr/>
-          <w:p>
-            <w:pPr>
-              <w:pStyle w:val="Compact"/>
-              <w:jc w:val="left"/>
-            </w:pPr>
-            <w:r>
-              <w:t xml:space="preserve">-2.37 (0.19)</w:t>
-            </w:r>
-          </w:p>
-        </w:tc>
-        <w:tc>
-          <w:tcPr/>
-          <w:p>
-            <w:pPr>
-              <w:pStyle w:val="Compact"/>
-              <w:jc w:val="left"/>
-            </w:pPr>
-            <w:r>
-              <w:t xml:space="preserve">-2.49 (0.20)</w:t>
-            </w:r>
-          </w:p>
-        </w:tc>
-        <w:tc>
-          <w:tcPr/>
-          <w:p>
-            <w:pPr>
-              <w:pStyle w:val="Compact"/>
-              <w:jc w:val="left"/>
-            </w:pPr>
-            <w:r>
-              <w:t xml:space="preserve">-2.67 (0.22)</w:t>
+              <w:t xml:space="preserve">   Valid Weatime Days</w:t>
+            </w:r>
+          </w:p>
+        </w:tc>
+        <w:tc>
+          <w:tcPr/>
+          <w:p>
+            <w:pPr>
+              <w:pStyle w:val="Compact"/>
+              <w:jc w:val="left"/>
+            </w:pPr>
+            <w:r>
+              <w:t xml:space="preserve">5.56 (1.93)</w:t>
+            </w:r>
+          </w:p>
+        </w:tc>
+        <w:tc>
+          <w:tcPr/>
+          <w:p>
+            <w:pPr>
+              <w:pStyle w:val="Compact"/>
+              <w:jc w:val="left"/>
+            </w:pPr>
+            <w:r>
+              <w:t xml:space="preserve">5.14 (1.78)</w:t>
+            </w:r>
+          </w:p>
+        </w:tc>
+        <w:tc>
+          <w:tcPr/>
+          <w:p>
+            <w:pPr>
+              <w:pStyle w:val="Compact"/>
+              <w:jc w:val="left"/>
+            </w:pPr>
+            <w:r>
+              <w:t xml:space="preserve">4.64 (1.36)</w:t>
+            </w:r>
+          </w:p>
+        </w:tc>
+        <w:tc>
+          <w:tcPr/>
+          <w:p>
+            <w:pPr>
+              <w:pStyle w:val="Compact"/>
+              <w:jc w:val="left"/>
+            </w:pPr>
+            <w:r>
+              <w:t xml:space="preserve">7.27 (2.60)</w:t>
+            </w:r>
+          </w:p>
+        </w:tc>
+        <w:tc>
+          <w:tcPr/>
+          <w:p>
+            <w:pPr>
+              <w:pStyle w:val="Compact"/>
+              <w:jc w:val="left"/>
+            </w:pPr>
+            <w:r>
+              <w:t xml:space="preserve">6.49 (2.12)</w:t>
             </w:r>
           </w:p>
         </w:tc>
@@ -2242,67 +2420,67 @@
               <w:jc w:val="left"/>
             </w:pPr>
             <w:r>
-              <w:t xml:space="preserve">   PA volume</w:t>
-            </w:r>
-          </w:p>
-        </w:tc>
-        <w:tc>
-          <w:tcPr/>
-          <w:p>
-            <w:pPr>
-              <w:pStyle w:val="Compact"/>
-              <w:jc w:val="left"/>
-            </w:pPr>
-            <w:r>
-              <w:t xml:space="preserve">43.68 (25.61)</w:t>
-            </w:r>
-          </w:p>
-        </w:tc>
-        <w:tc>
-          <w:tcPr/>
-          <w:p>
-            <w:pPr>
-              <w:pStyle w:val="Compact"/>
-              <w:jc w:val="left"/>
-            </w:pPr>
-            <w:r>
-              <w:t xml:space="preserve">42.87 (16.63)</w:t>
-            </w:r>
-          </w:p>
-        </w:tc>
-        <w:tc>
-          <w:tcPr/>
-          <w:p>
-            <w:pPr>
-              <w:pStyle w:val="Compact"/>
-              <w:jc w:val="left"/>
-            </w:pPr>
-            <w:r>
-              <w:t xml:space="preserve">40.64 (11.15)</w:t>
-            </w:r>
-          </w:p>
-        </w:tc>
-        <w:tc>
-          <w:tcPr/>
-          <w:p>
-            <w:pPr>
-              <w:pStyle w:val="Compact"/>
-              <w:jc w:val="left"/>
-            </w:pPr>
-            <w:r>
-              <w:t xml:space="preserve">39.56 (13.10)</w:t>
-            </w:r>
-          </w:p>
-        </w:tc>
-        <w:tc>
-          <w:tcPr/>
-          <w:p>
-            <w:pPr>
-              <w:pStyle w:val="Compact"/>
-              <w:jc w:val="left"/>
-            </w:pPr>
-            <w:r>
-              <w:t xml:space="preserve">31.27 (10.38)</w:t>
+              <w:t xml:space="preserve">   PA Intensity</w:t>
+            </w:r>
+          </w:p>
+        </w:tc>
+        <w:tc>
+          <w:tcPr/>
+          <w:p>
+            <w:pPr>
+              <w:pStyle w:val="Compact"/>
+              <w:jc w:val="left"/>
+            </w:pPr>
+            <w:r>
+              <w:t xml:space="preserve">-2.12 (0.19)</w:t>
+            </w:r>
+          </w:p>
+        </w:tc>
+        <w:tc>
+          <w:tcPr/>
+          <w:p>
+            <w:pPr>
+              <w:pStyle w:val="Compact"/>
+              <w:jc w:val="left"/>
+            </w:pPr>
+            <w:r>
+              <w:t xml:space="preserve">-2.20 (0.19)</w:t>
+            </w:r>
+          </w:p>
+        </w:tc>
+        <w:tc>
+          <w:tcPr/>
+          <w:p>
+            <w:pPr>
+              <w:pStyle w:val="Compact"/>
+              <w:jc w:val="left"/>
+            </w:pPr>
+            <w:r>
+              <w:t xml:space="preserve">-2.36 (0.20)</w:t>
+            </w:r>
+          </w:p>
+        </w:tc>
+        <w:tc>
+          <w:tcPr/>
+          <w:p>
+            <w:pPr>
+              <w:pStyle w:val="Compact"/>
+              <w:jc w:val="left"/>
+            </w:pPr>
+            <w:r>
+              <w:t xml:space="preserve">-2.49 (0.20)</w:t>
+            </w:r>
+          </w:p>
+        </w:tc>
+        <w:tc>
+          <w:tcPr/>
+          <w:p>
+            <w:pPr>
+              <w:pStyle w:val="Compact"/>
+              <w:jc w:val="left"/>
+            </w:pPr>
+            <w:r>
+              <w:t xml:space="preserve">-2.67 (0.22)</w:t>
             </w:r>
           </w:p>
         </w:tc>
@@ -2316,67 +2494,67 @@
               <w:jc w:val="left"/>
             </w:pPr>
             <w:r>
-              <w:t xml:space="preserve">   Sleep duration</w:t>
-            </w:r>
-          </w:p>
-        </w:tc>
-        <w:tc>
-          <w:tcPr/>
-          <w:p>
-            <w:pPr>
-              <w:pStyle w:val="Compact"/>
-              <w:jc w:val="left"/>
-            </w:pPr>
-            <w:r>
-              <w:t xml:space="preserve">446.73 (92.90)</w:t>
-            </w:r>
-          </w:p>
-        </w:tc>
-        <w:tc>
-          <w:tcPr/>
-          <w:p>
-            <w:pPr>
-              <w:pStyle w:val="Compact"/>
-              <w:jc w:val="left"/>
-            </w:pPr>
-            <w:r>
-              <w:t xml:space="preserve">403.02 (96.97)</w:t>
-            </w:r>
-          </w:p>
-        </w:tc>
-        <w:tc>
-          <w:tcPr/>
-          <w:p>
-            <w:pPr>
-              <w:pStyle w:val="Compact"/>
-              <w:jc w:val="left"/>
-            </w:pPr>
-            <w:r>
-              <w:t xml:space="preserve">365.62 (79.72)</w:t>
-            </w:r>
-          </w:p>
-        </w:tc>
-        <w:tc>
-          <w:tcPr/>
-          <w:p>
-            <w:pPr>
-              <w:pStyle w:val="Compact"/>
-              <w:jc w:val="left"/>
-            </w:pPr>
-            <w:r>
-              <w:t xml:space="preserve">400.68 (63.47)</w:t>
-            </w:r>
-          </w:p>
-        </w:tc>
-        <w:tc>
-          <w:tcPr/>
-          <w:p>
-            <w:pPr>
-              <w:pStyle w:val="Compact"/>
-              <w:jc w:val="left"/>
-            </w:pPr>
-            <w:r>
-              <w:t xml:space="preserve">398.74 (71.46)</w:t>
+              <w:t xml:space="preserve">   PA Volume</w:t>
+            </w:r>
+          </w:p>
+        </w:tc>
+        <w:tc>
+          <w:tcPr/>
+          <w:p>
+            <w:pPr>
+              <w:pStyle w:val="Compact"/>
+              <w:jc w:val="left"/>
+            </w:pPr>
+            <w:r>
+              <w:t xml:space="preserve">43.79 (25.80)</w:t>
+            </w:r>
+          </w:p>
+        </w:tc>
+        <w:tc>
+          <w:tcPr/>
+          <w:p>
+            <w:pPr>
+              <w:pStyle w:val="Compact"/>
+              <w:jc w:val="left"/>
+            </w:pPr>
+            <w:r>
+              <w:t xml:space="preserve">43.13 (17.26)</w:t>
+            </w:r>
+          </w:p>
+        </w:tc>
+        <w:tc>
+          <w:tcPr/>
+          <w:p>
+            <w:pPr>
+              <w:pStyle w:val="Compact"/>
+              <w:jc w:val="left"/>
+            </w:pPr>
+            <w:r>
+              <w:t xml:space="preserve">41.12 (11.59)</w:t>
+            </w:r>
+          </w:p>
+        </w:tc>
+        <w:tc>
+          <w:tcPr/>
+          <w:p>
+            <w:pPr>
+              <w:pStyle w:val="Compact"/>
+              <w:jc w:val="left"/>
+            </w:pPr>
+            <w:r>
+              <w:t xml:space="preserve">39.60 (13.14)</w:t>
+            </w:r>
+          </w:p>
+        </w:tc>
+        <w:tc>
+          <w:tcPr/>
+          <w:p>
+            <w:pPr>
+              <w:pStyle w:val="Compact"/>
+              <w:jc w:val="left"/>
+            </w:pPr>
+            <w:r>
+              <w:t xml:space="preserve">31.30 (10.41)</w:t>
             </w:r>
           </w:p>
         </w:tc>
@@ -2390,67 +2568,67 @@
               <w:jc w:val="left"/>
             </w:pPr>
             <w:r>
-              <w:t xml:space="preserve">   Sleep efficiency</w:t>
-            </w:r>
-          </w:p>
-        </w:tc>
-        <w:tc>
-          <w:tcPr/>
-          <w:p>
-            <w:pPr>
-              <w:pStyle w:val="Compact"/>
-              <w:jc w:val="left"/>
-            </w:pPr>
-            <w:r>
-              <w:t xml:space="preserve">0.79 (0.10)</w:t>
-            </w:r>
-          </w:p>
-        </w:tc>
-        <w:tc>
-          <w:tcPr/>
-          <w:p>
-            <w:pPr>
-              <w:pStyle w:val="Compact"/>
-              <w:jc w:val="left"/>
-            </w:pPr>
-            <w:r>
-              <w:t xml:space="preserve">0.83 (0.10)</w:t>
-            </w:r>
-          </w:p>
-        </w:tc>
-        <w:tc>
-          <w:tcPr/>
-          <w:p>
-            <w:pPr>
-              <w:pStyle w:val="Compact"/>
-              <w:jc w:val="left"/>
-            </w:pPr>
-            <w:r>
-              <w:t xml:space="preserve">0.87 (0.07)</w:t>
-            </w:r>
-          </w:p>
-        </w:tc>
-        <w:tc>
-          <w:tcPr/>
-          <w:p>
-            <w:pPr>
-              <w:pStyle w:val="Compact"/>
-              <w:jc w:val="left"/>
-            </w:pPr>
-            <w:r>
-              <w:t xml:space="preserve">0.88 (0.06)</w:t>
-            </w:r>
-          </w:p>
-        </w:tc>
-        <w:tc>
-          <w:tcPr/>
-          <w:p>
-            <w:pPr>
-              <w:pStyle w:val="Compact"/>
-              <w:jc w:val="left"/>
-            </w:pPr>
-            <w:r>
-              <w:t xml:space="preserve">0.86 (0.06)</w:t>
+              <w:t xml:space="preserve">   Sleep Duration (min)</w:t>
+            </w:r>
+          </w:p>
+        </w:tc>
+        <w:tc>
+          <w:tcPr/>
+          <w:p>
+            <w:pPr>
+              <w:pStyle w:val="Compact"/>
+              <w:jc w:val="left"/>
+            </w:pPr>
+            <w:r>
+              <w:t xml:space="preserve">485.41 (54.44)</w:t>
+            </w:r>
+          </w:p>
+        </w:tc>
+        <w:tc>
+          <w:tcPr/>
+          <w:p>
+            <w:pPr>
+              <w:pStyle w:val="Compact"/>
+              <w:jc w:val="left"/>
+            </w:pPr>
+            <w:r>
+              <w:t xml:space="preserve">449.68 (66.67)</w:t>
+            </w:r>
+          </w:p>
+        </w:tc>
+        <w:tc>
+          <w:tcPr/>
+          <w:p>
+            <w:pPr>
+              <w:pStyle w:val="Compact"/>
+              <w:jc w:val="left"/>
+            </w:pPr>
+            <w:r>
+              <w:t xml:space="preserve">412.24 (57.99)</w:t>
+            </w:r>
+          </w:p>
+        </w:tc>
+        <w:tc>
+          <w:tcPr/>
+          <w:p>
+            <w:pPr>
+              <w:pStyle w:val="Compact"/>
+              <w:jc w:val="left"/>
+            </w:pPr>
+            <w:r>
+              <w:t xml:space="preserve">408.17 (56.56)</w:t>
+            </w:r>
+          </w:p>
+        </w:tc>
+        <w:tc>
+          <w:tcPr/>
+          <w:p>
+            <w:pPr>
+              <w:pStyle w:val="Compact"/>
+              <w:jc w:val="left"/>
+            </w:pPr>
+            <w:r>
+              <w:t xml:space="preserve">405.08 (63.91)</w:t>
             </w:r>
           </w:p>
         </w:tc>
@@ -2464,67 +2642,67 @@
               <w:jc w:val="left"/>
             </w:pPr>
             <w:r>
-              <w:t xml:space="preserve">   Sleep onset</w:t>
-            </w:r>
-          </w:p>
-        </w:tc>
-        <w:tc>
-          <w:tcPr/>
-          <w:p>
-            <w:pPr>
-              <w:pStyle w:val="Compact"/>
-              <w:jc w:val="left"/>
-            </w:pPr>
-            <w:r>
-              <w:t xml:space="preserve">20.96 (1.17)</w:t>
-            </w:r>
-          </w:p>
-        </w:tc>
-        <w:tc>
-          <w:tcPr/>
-          <w:p>
-            <w:pPr>
-              <w:pStyle w:val="Compact"/>
-              <w:jc w:val="left"/>
-            </w:pPr>
-            <w:r>
-              <w:t xml:space="preserve">22.30 (1.96)</w:t>
-            </w:r>
-          </w:p>
-        </w:tc>
-        <w:tc>
-          <w:tcPr/>
-          <w:p>
-            <w:pPr>
-              <w:pStyle w:val="Compact"/>
-              <w:jc w:val="left"/>
-            </w:pPr>
-            <w:r>
-              <w:t xml:space="preserve">24.00 (1.47)</w:t>
-            </w:r>
-          </w:p>
-        </w:tc>
-        <w:tc>
-          <w:tcPr/>
-          <w:p>
-            <w:pPr>
-              <w:pStyle w:val="Compact"/>
-              <w:jc w:val="left"/>
-            </w:pPr>
-            <w:r>
-              <w:t xml:space="preserve">23.65 (1.35)</w:t>
-            </w:r>
-          </w:p>
-        </w:tc>
-        <w:tc>
-          <w:tcPr/>
-          <w:p>
-            <w:pPr>
-              <w:pStyle w:val="Compact"/>
-              <w:jc w:val="left"/>
-            </w:pPr>
-            <w:r>
-              <w:t xml:space="preserve">24.41 (1.30)</w:t>
+              <w:t xml:space="preserve">   Sleep Efficiency (%)</w:t>
+            </w:r>
+          </w:p>
+        </w:tc>
+        <w:tc>
+          <w:tcPr/>
+          <w:p>
+            <w:pPr>
+              <w:pStyle w:val="Compact"/>
+              <w:jc w:val="left"/>
+            </w:pPr>
+            <w:r>
+              <w:t xml:space="preserve">80.88 (7.56)</w:t>
+            </w:r>
+          </w:p>
+        </w:tc>
+        <w:tc>
+          <w:tcPr/>
+          <w:p>
+            <w:pPr>
+              <w:pStyle w:val="Compact"/>
+              <w:jc w:val="left"/>
+            </w:pPr>
+            <w:r>
+              <w:t xml:space="preserve">83.92 (7.90)</w:t>
+            </w:r>
+          </w:p>
+        </w:tc>
+        <w:tc>
+          <w:tcPr/>
+          <w:p>
+            <w:pPr>
+              <w:pStyle w:val="Compact"/>
+              <w:jc w:val="left"/>
+            </w:pPr>
+            <w:r>
+              <w:t xml:space="preserve">87.47 (6.26)</w:t>
+            </w:r>
+          </w:p>
+        </w:tc>
+        <w:tc>
+          <w:tcPr/>
+          <w:p>
+            <w:pPr>
+              <w:pStyle w:val="Compact"/>
+              <w:jc w:val="left"/>
+            </w:pPr>
+            <w:r>
+              <w:t xml:space="preserve">87.81 (5.55)</w:t>
+            </w:r>
+          </w:p>
+        </w:tc>
+        <w:tc>
+          <w:tcPr/>
+          <w:p>
+            <w:pPr>
+              <w:pStyle w:val="Compact"/>
+              <w:jc w:val="left"/>
+            </w:pPr>
+            <w:r>
+              <w:t xml:space="preserve">86.46 (6.31)</w:t>
             </w:r>
           </w:p>
         </w:tc>
@@ -2538,67 +2716,67 @@
               <w:jc w:val="left"/>
             </w:pPr>
             <w:r>
-              <w:t xml:space="preserve">   Sleep regularity</w:t>
-            </w:r>
-          </w:p>
-        </w:tc>
-        <w:tc>
-          <w:tcPr/>
-          <w:p>
-            <w:pPr>
-              <w:pStyle w:val="Compact"/>
-              <w:jc w:val="left"/>
-            </w:pPr>
-            <w:r>
-              <w:t xml:space="preserve">54.54 (12.67)</w:t>
-            </w:r>
-          </w:p>
-        </w:tc>
-        <w:tc>
-          <w:tcPr/>
-          <w:p>
-            <w:pPr>
-              <w:pStyle w:val="Compact"/>
-              <w:jc w:val="left"/>
-            </w:pPr>
-            <w:r>
-              <w:t xml:space="preserve">54.12 (13.05)</w:t>
-            </w:r>
-          </w:p>
-        </w:tc>
-        <w:tc>
-          <w:tcPr/>
-          <w:p>
-            <w:pPr>
-              <w:pStyle w:val="Compact"/>
-              <w:jc w:val="left"/>
-            </w:pPr>
-            <w:r>
-              <w:t xml:space="preserve">54.75 (12.83)</w:t>
-            </w:r>
-          </w:p>
-        </w:tc>
-        <w:tc>
-          <w:tcPr/>
-          <w:p>
-            <w:pPr>
-              <w:pStyle w:val="Compact"/>
-              <w:jc w:val="left"/>
-            </w:pPr>
-            <w:r>
-              <w:t xml:space="preserve">59.41 (11.52)</w:t>
-            </w:r>
-          </w:p>
-        </w:tc>
-        <w:tc>
-          <w:tcPr/>
-          <w:p>
-            <w:pPr>
-              <w:pStyle w:val="Compact"/>
-              <w:jc w:val="left"/>
-            </w:pPr>
-            <w:r>
-              <w:t xml:space="preserve">54.73 (12.55)</w:t>
+              <w:t xml:space="preserve">   Sleep Onset (HH:MM clock time)</w:t>
+            </w:r>
+          </w:p>
+        </w:tc>
+        <w:tc>
+          <w:tcPr/>
+          <w:p>
+            <w:pPr>
+              <w:pStyle w:val="Compact"/>
+              <w:jc w:val="left"/>
+            </w:pPr>
+            <w:r>
+              <w:t xml:space="preserve">20:59 (01:12)</w:t>
+            </w:r>
+          </w:p>
+        </w:tc>
+        <w:tc>
+          <w:tcPr/>
+          <w:p>
+            <w:pPr>
+              <w:pStyle w:val="Compact"/>
+              <w:jc w:val="left"/>
+            </w:pPr>
+            <w:r>
+              <w:t xml:space="preserve">22:13 (01:52)</w:t>
+            </w:r>
+          </w:p>
+        </w:tc>
+        <w:tc>
+          <w:tcPr/>
+          <w:p>
+            <w:pPr>
+              <w:pStyle w:val="Compact"/>
+              <w:jc w:val="left"/>
+            </w:pPr>
+            <w:r>
+              <w:t xml:space="preserve">23:50 (01:25)</w:t>
+            </w:r>
+          </w:p>
+        </w:tc>
+        <w:tc>
+          <w:tcPr/>
+          <w:p>
+            <w:pPr>
+              <w:pStyle w:val="Compact"/>
+              <w:jc w:val="left"/>
+            </w:pPr>
+            <w:r>
+              <w:t xml:space="preserve">23:37 (01:21)</w:t>
+            </w:r>
+          </w:p>
+        </w:tc>
+        <w:tc>
+          <w:tcPr/>
+          <w:p>
+            <w:pPr>
+              <w:pStyle w:val="Compact"/>
+              <w:jc w:val="left"/>
+            </w:pPr>
+            <w:r>
+              <w:t xml:space="preserve">24:22 (01:17)</w:t>
             </w:r>
           </w:p>
         </w:tc>
@@ -2612,48 +2790,68 @@
               <w:jc w:val="left"/>
             </w:pPr>
             <w:r>
-              <w:t xml:space="preserve">Accelerometer Wear Location</w:t>
-            </w:r>
-          </w:p>
-        </w:tc>
-        <w:tc>
-          <w:tcPr/>
-          <w:p>
-            <w:pPr>
-              <w:pStyle w:val="Compact"/>
-            </w:pPr>
-          </w:p>
-        </w:tc>
-        <w:tc>
-          <w:tcPr/>
-          <w:p>
-            <w:pPr>
-              <w:pStyle w:val="Compact"/>
-            </w:pPr>
-          </w:p>
-        </w:tc>
-        <w:tc>
-          <w:tcPr/>
-          <w:p>
-            <w:pPr>
-              <w:pStyle w:val="Compact"/>
-            </w:pPr>
-          </w:p>
-        </w:tc>
-        <w:tc>
-          <w:tcPr/>
-          <w:p>
-            <w:pPr>
-              <w:pStyle w:val="Compact"/>
-            </w:pPr>
-          </w:p>
-        </w:tc>
-        <w:tc>
-          <w:tcPr/>
-          <w:p>
-            <w:pPr>
-              <w:pStyle w:val="Compact"/>
-            </w:pPr>
+              <w:t xml:space="preserve">   Sleep Regularity</w:t>
+            </w:r>
+          </w:p>
+        </w:tc>
+        <w:tc>
+          <w:tcPr/>
+          <w:p>
+            <w:pPr>
+              <w:pStyle w:val="Compact"/>
+              <w:jc w:val="left"/>
+            </w:pPr>
+            <w:r>
+              <w:t xml:space="preserve">54.53 (12.67)</w:t>
+            </w:r>
+          </w:p>
+        </w:tc>
+        <w:tc>
+          <w:tcPr/>
+          <w:p>
+            <w:pPr>
+              <w:pStyle w:val="Compact"/>
+              <w:jc w:val="left"/>
+            </w:pPr>
+            <w:r>
+              <w:t xml:space="preserve">54.22 (13.10)</w:t>
+            </w:r>
+          </w:p>
+        </w:tc>
+        <w:tc>
+          <w:tcPr/>
+          <w:p>
+            <w:pPr>
+              <w:pStyle w:val="Compact"/>
+              <w:jc w:val="left"/>
+            </w:pPr>
+            <w:r>
+              <w:t xml:space="preserve">54.98 (12.51)</w:t>
+            </w:r>
+          </w:p>
+        </w:tc>
+        <w:tc>
+          <w:tcPr/>
+          <w:p>
+            <w:pPr>
+              <w:pStyle w:val="Compact"/>
+              <w:jc w:val="left"/>
+            </w:pPr>
+            <w:r>
+              <w:t xml:space="preserve">59.50 (11.44)</w:t>
+            </w:r>
+          </w:p>
+        </w:tc>
+        <w:tc>
+          <w:tcPr/>
+          <w:p>
+            <w:pPr>
+              <w:pStyle w:val="Compact"/>
+              <w:jc w:val="left"/>
+            </w:pPr>
+            <w:r>
+              <w:t xml:space="preserve">54.83 (12.53)</w:t>
+            </w:r>
           </w:p>
         </w:tc>
       </w:tr>
@@ -2666,68 +2864,48 @@
               <w:jc w:val="left"/>
             </w:pPr>
             <w:r>
-              <w:t xml:space="preserve">   Wrist</w:t>
-            </w:r>
-          </w:p>
-        </w:tc>
-        <w:tc>
-          <w:tcPr/>
-          <w:p>
-            <w:pPr>
-              <w:pStyle w:val="Compact"/>
-              <w:jc w:val="left"/>
-            </w:pPr>
-            <w:r>
-              <w:t xml:space="preserve">2,479 (25.40%)</w:t>
-            </w:r>
-          </w:p>
-        </w:tc>
-        <w:tc>
-          <w:tcPr/>
-          <w:p>
-            <w:pPr>
-              <w:pStyle w:val="Compact"/>
-              <w:jc w:val="left"/>
-            </w:pPr>
-            <w:r>
-              <w:t xml:space="preserve">1,928 (62.97%)</w:t>
-            </w:r>
-          </w:p>
-        </w:tc>
-        <w:tc>
-          <w:tcPr/>
-          <w:p>
-            <w:pPr>
-              <w:pStyle w:val="Compact"/>
-              <w:jc w:val="left"/>
-            </w:pPr>
-            <w:r>
-              <w:t xml:space="preserve">473 (100.00%)</w:t>
-            </w:r>
-          </w:p>
-        </w:tc>
-        <w:tc>
-          <w:tcPr/>
-          <w:p>
-            <w:pPr>
-              <w:pStyle w:val="Compact"/>
-              <w:jc w:val="left"/>
-            </w:pPr>
-            <w:r>
-              <w:t xml:space="preserve">4,675 (100.00%)</w:t>
-            </w:r>
-          </w:p>
-        </w:tc>
-        <w:tc>
-          <w:tcPr/>
-          <w:p>
-            <w:pPr>
-              <w:pStyle w:val="Compact"/>
-              <w:jc w:val="left"/>
-            </w:pPr>
-            <w:r>
-              <w:t xml:space="preserve">6,563 (100.00%)</w:t>
-            </w:r>
+              <w:t xml:space="preserve">Accelerometer Wear Location</w:t>
+            </w:r>
+          </w:p>
+        </w:tc>
+        <w:tc>
+          <w:tcPr/>
+          <w:p>
+            <w:pPr>
+              <w:pStyle w:val="Compact"/>
+            </w:pPr>
+          </w:p>
+        </w:tc>
+        <w:tc>
+          <w:tcPr/>
+          <w:p>
+            <w:pPr>
+              <w:pStyle w:val="Compact"/>
+            </w:pPr>
+          </w:p>
+        </w:tc>
+        <w:tc>
+          <w:tcPr/>
+          <w:p>
+            <w:pPr>
+              <w:pStyle w:val="Compact"/>
+            </w:pPr>
+          </w:p>
+        </w:tc>
+        <w:tc>
+          <w:tcPr/>
+          <w:p>
+            <w:pPr>
+              <w:pStyle w:val="Compact"/>
+            </w:pPr>
+          </w:p>
+        </w:tc>
+        <w:tc>
+          <w:tcPr/>
+          <w:p>
+            <w:pPr>
+              <w:pStyle w:val="Compact"/>
+            </w:pPr>
           </w:p>
         </w:tc>
       </w:tr>
@@ -2740,67 +2918,67 @@
               <w:jc w:val="left"/>
             </w:pPr>
             <w:r>
-              <w:t xml:space="preserve">   Hip</w:t>
-            </w:r>
-          </w:p>
-        </w:tc>
-        <w:tc>
-          <w:tcPr/>
-          <w:p>
-            <w:pPr>
-              <w:pStyle w:val="Compact"/>
-              <w:jc w:val="left"/>
-            </w:pPr>
-            <w:r>
-              <w:t xml:space="preserve">7,279 (74.60%)</w:t>
-            </w:r>
-          </w:p>
-        </w:tc>
-        <w:tc>
-          <w:tcPr/>
-          <w:p>
-            <w:pPr>
-              <w:pStyle w:val="Compact"/>
-              <w:jc w:val="left"/>
-            </w:pPr>
-            <w:r>
-              <w:t xml:space="preserve">1,134 (37.03%)</w:t>
-            </w:r>
-          </w:p>
-        </w:tc>
-        <w:tc>
-          <w:tcPr/>
-          <w:p>
-            <w:pPr>
-              <w:pStyle w:val="Compact"/>
-              <w:jc w:val="left"/>
-            </w:pPr>
-            <w:r>
-              <w:t xml:space="preserve">-</w:t>
-            </w:r>
-          </w:p>
-        </w:tc>
-        <w:tc>
-          <w:tcPr/>
-          <w:p>
-            <w:pPr>
-              <w:pStyle w:val="Compact"/>
-              <w:jc w:val="left"/>
-            </w:pPr>
-            <w:r>
-              <w:t xml:space="preserve">-</w:t>
-            </w:r>
-          </w:p>
-        </w:tc>
-        <w:tc>
-          <w:tcPr/>
-          <w:p>
-            <w:pPr>
-              <w:pStyle w:val="Compact"/>
-              <w:jc w:val="left"/>
-            </w:pPr>
-            <w:r>
-              <w:t xml:space="preserve">-</w:t>
+              <w:t xml:space="preserve">   Wrist</w:t>
+            </w:r>
+          </w:p>
+        </w:tc>
+        <w:tc>
+          <w:tcPr/>
+          <w:p>
+            <w:pPr>
+              <w:pStyle w:val="Compact"/>
+              <w:jc w:val="left"/>
+            </w:pPr>
+            <w:r>
+              <w:t xml:space="preserve">2,479 (25.40%)</w:t>
+            </w:r>
+          </w:p>
+        </w:tc>
+        <w:tc>
+          <w:tcPr/>
+          <w:p>
+            <w:pPr>
+              <w:pStyle w:val="Compact"/>
+              <w:jc w:val="left"/>
+            </w:pPr>
+            <w:r>
+              <w:t xml:space="preserve">1,928 (62.97%)</w:t>
+            </w:r>
+          </w:p>
+        </w:tc>
+        <w:tc>
+          <w:tcPr/>
+          <w:p>
+            <w:pPr>
+              <w:pStyle w:val="Compact"/>
+              <w:jc w:val="left"/>
+            </w:pPr>
+            <w:r>
+              <w:t xml:space="preserve">473 (100.00%)</w:t>
+            </w:r>
+          </w:p>
+        </w:tc>
+        <w:tc>
+          <w:tcPr/>
+          <w:p>
+            <w:pPr>
+              <w:pStyle w:val="Compact"/>
+              <w:jc w:val="left"/>
+            </w:pPr>
+            <w:r>
+              <w:t xml:space="preserve">4,675 (100.00%)</w:t>
+            </w:r>
+          </w:p>
+        </w:tc>
+        <w:tc>
+          <w:tcPr/>
+          <w:p>
+            <w:pPr>
+              <w:pStyle w:val="Compact"/>
+              <w:jc w:val="left"/>
+            </w:pPr>
+            <w:r>
+              <w:t xml:space="preserve">6,563 (100.00%)</w:t>
             </w:r>
           </w:p>
         </w:tc>
@@ -2814,48 +2992,68 @@
               <w:jc w:val="left"/>
             </w:pPr>
             <w:r>
-              <w:t xml:space="preserve">Ethnicity</w:t>
-            </w:r>
-          </w:p>
-        </w:tc>
-        <w:tc>
-          <w:tcPr/>
-          <w:p>
-            <w:pPr>
-              <w:pStyle w:val="Compact"/>
-            </w:pPr>
-          </w:p>
-        </w:tc>
-        <w:tc>
-          <w:tcPr/>
-          <w:p>
-            <w:pPr>
-              <w:pStyle w:val="Compact"/>
-            </w:pPr>
-          </w:p>
-        </w:tc>
-        <w:tc>
-          <w:tcPr/>
-          <w:p>
-            <w:pPr>
-              <w:pStyle w:val="Compact"/>
-            </w:pPr>
-          </w:p>
-        </w:tc>
-        <w:tc>
-          <w:tcPr/>
-          <w:p>
-            <w:pPr>
-              <w:pStyle w:val="Compact"/>
-            </w:pPr>
-          </w:p>
-        </w:tc>
-        <w:tc>
-          <w:tcPr/>
-          <w:p>
-            <w:pPr>
-              <w:pStyle w:val="Compact"/>
-            </w:pPr>
+              <w:t xml:space="preserve">   Hip</w:t>
+            </w:r>
+          </w:p>
+        </w:tc>
+        <w:tc>
+          <w:tcPr/>
+          <w:p>
+            <w:pPr>
+              <w:pStyle w:val="Compact"/>
+              <w:jc w:val="left"/>
+            </w:pPr>
+            <w:r>
+              <w:t xml:space="preserve">7,279 (74.60%)</w:t>
+            </w:r>
+          </w:p>
+        </w:tc>
+        <w:tc>
+          <w:tcPr/>
+          <w:p>
+            <w:pPr>
+              <w:pStyle w:val="Compact"/>
+              <w:jc w:val="left"/>
+            </w:pPr>
+            <w:r>
+              <w:t xml:space="preserve">1,134 (37.03%)</w:t>
+            </w:r>
+          </w:p>
+        </w:tc>
+        <w:tc>
+          <w:tcPr/>
+          <w:p>
+            <w:pPr>
+              <w:pStyle w:val="Compact"/>
+              <w:jc w:val="left"/>
+            </w:pPr>
+            <w:r>
+              <w:t xml:space="preserve">-</w:t>
+            </w:r>
+          </w:p>
+        </w:tc>
+        <w:tc>
+          <w:tcPr/>
+          <w:p>
+            <w:pPr>
+              <w:pStyle w:val="Compact"/>
+              <w:jc w:val="left"/>
+            </w:pPr>
+            <w:r>
+              <w:t xml:space="preserve">-</w:t>
+            </w:r>
+          </w:p>
+        </w:tc>
+        <w:tc>
+          <w:tcPr/>
+          <w:p>
+            <w:pPr>
+              <w:pStyle w:val="Compact"/>
+              <w:jc w:val="left"/>
+            </w:pPr>
+            <w:r>
+              <w:t xml:space="preserve">-</w:t>
+            </w:r>
           </w:p>
         </w:tc>
       </w:tr>
@@ -2868,68 +3066,48 @@
               <w:jc w:val="left"/>
             </w:pPr>
             <w:r>
-              <w:t xml:space="preserve">   Non-white</w:t>
-            </w:r>
-          </w:p>
-        </w:tc>
-        <w:tc>
-          <w:tcPr/>
-          <w:p>
-            <w:pPr>
-              <w:pStyle w:val="Compact"/>
-              <w:jc w:val="left"/>
-            </w:pPr>
-            <w:r>
-              <w:t xml:space="preserve">1,830 (18.75%)</w:t>
-            </w:r>
-          </w:p>
-        </w:tc>
-        <w:tc>
-          <w:tcPr/>
-          <w:p>
-            <w:pPr>
-              <w:pStyle w:val="Compact"/>
-              <w:jc w:val="left"/>
-            </w:pPr>
-            <w:r>
-              <w:t xml:space="preserve">  469 (15.32%)</w:t>
-            </w:r>
-          </w:p>
-        </w:tc>
-        <w:tc>
-          <w:tcPr/>
-          <w:p>
-            <w:pPr>
-              <w:pStyle w:val="Compact"/>
-              <w:jc w:val="left"/>
-            </w:pPr>
-            <w:r>
-              <w:t xml:space="preserve">34 (7.19%)</w:t>
-            </w:r>
-          </w:p>
-        </w:tc>
-        <w:tc>
-          <w:tcPr/>
-          <w:p>
-            <w:pPr>
-              <w:pStyle w:val="Compact"/>
-              <w:jc w:val="left"/>
-            </w:pPr>
-            <w:r>
-              <w:t xml:space="preserve">   87 (1.86%)</w:t>
-            </w:r>
-          </w:p>
-        </w:tc>
-        <w:tc>
-          <w:tcPr/>
-          <w:p>
-            <w:pPr>
-              <w:pStyle w:val="Compact"/>
-              <w:jc w:val="left"/>
-            </w:pPr>
-            <w:r>
-              <w:t xml:space="preserve">  263 (4.01%)</w:t>
-            </w:r>
+              <w:t xml:space="preserve">Ethnicity</w:t>
+            </w:r>
+          </w:p>
+        </w:tc>
+        <w:tc>
+          <w:tcPr/>
+          <w:p>
+            <w:pPr>
+              <w:pStyle w:val="Compact"/>
+            </w:pPr>
+          </w:p>
+        </w:tc>
+        <w:tc>
+          <w:tcPr/>
+          <w:p>
+            <w:pPr>
+              <w:pStyle w:val="Compact"/>
+            </w:pPr>
+          </w:p>
+        </w:tc>
+        <w:tc>
+          <w:tcPr/>
+          <w:p>
+            <w:pPr>
+              <w:pStyle w:val="Compact"/>
+            </w:pPr>
+          </w:p>
+        </w:tc>
+        <w:tc>
+          <w:tcPr/>
+          <w:p>
+            <w:pPr>
+              <w:pStyle w:val="Compact"/>
+            </w:pPr>
+          </w:p>
+        </w:tc>
+        <w:tc>
+          <w:tcPr/>
+          <w:p>
+            <w:pPr>
+              <w:pStyle w:val="Compact"/>
+            </w:pPr>
           </w:p>
         </w:tc>
       </w:tr>
@@ -2942,67 +3120,67 @@
               <w:jc w:val="left"/>
             </w:pPr>
             <w:r>
-              <w:t xml:space="preserve">   Unclear</w:t>
-            </w:r>
-          </w:p>
-        </w:tc>
-        <w:tc>
-          <w:tcPr/>
-          <w:p>
-            <w:pPr>
-              <w:pStyle w:val="Compact"/>
-              <w:jc w:val="left"/>
-            </w:pPr>
-            <w:r>
-              <w:t xml:space="preserve">4,016 (41.16%)</w:t>
-            </w:r>
-          </w:p>
-        </w:tc>
-        <w:tc>
-          <w:tcPr/>
-          <w:p>
-            <w:pPr>
-              <w:pStyle w:val="Compact"/>
-              <w:jc w:val="left"/>
-            </w:pPr>
-            <w:r>
-              <w:t xml:space="preserve">1,620 (52.91%)</w:t>
-            </w:r>
-          </w:p>
-        </w:tc>
-        <w:tc>
-          <w:tcPr/>
-          <w:p>
-            <w:pPr>
-              <w:pStyle w:val="Compact"/>
-              <w:jc w:val="left"/>
-            </w:pPr>
-            <w:r>
-              <w:t xml:space="preserve">235 (49.68%)</w:t>
-            </w:r>
-          </w:p>
-        </w:tc>
-        <w:tc>
-          <w:tcPr/>
-          <w:p>
-            <w:pPr>
-              <w:pStyle w:val="Compact"/>
-              <w:jc w:val="left"/>
-            </w:pPr>
-            <w:r>
-              <w:t xml:space="preserve">1,317 (28.17%)</w:t>
-            </w:r>
-          </w:p>
-        </w:tc>
-        <w:tc>
-          <w:tcPr/>
-          <w:p>
-            <w:pPr>
-              <w:pStyle w:val="Compact"/>
-              <w:jc w:val="left"/>
-            </w:pPr>
-            <w:r>
-              <w:t xml:space="preserve">2,475 (37.71%)</w:t>
+              <w:t xml:space="preserve">   Non-White</w:t>
+            </w:r>
+          </w:p>
+        </w:tc>
+        <w:tc>
+          <w:tcPr/>
+          <w:p>
+            <w:pPr>
+              <w:pStyle w:val="Compact"/>
+              <w:jc w:val="left"/>
+            </w:pPr>
+            <w:r>
+              <w:t xml:space="preserve">1,830 (18.75%)</w:t>
+            </w:r>
+          </w:p>
+        </w:tc>
+        <w:tc>
+          <w:tcPr/>
+          <w:p>
+            <w:pPr>
+              <w:pStyle w:val="Compact"/>
+              <w:jc w:val="left"/>
+            </w:pPr>
+            <w:r>
+              <w:t xml:space="preserve">  469 (15.32%)</w:t>
+            </w:r>
+          </w:p>
+        </w:tc>
+        <w:tc>
+          <w:tcPr/>
+          <w:p>
+            <w:pPr>
+              <w:pStyle w:val="Compact"/>
+              <w:jc w:val="left"/>
+            </w:pPr>
+            <w:r>
+              <w:t xml:space="preserve">34 (7.19%)</w:t>
+            </w:r>
+          </w:p>
+        </w:tc>
+        <w:tc>
+          <w:tcPr/>
+          <w:p>
+            <w:pPr>
+              <w:pStyle w:val="Compact"/>
+              <w:jc w:val="left"/>
+            </w:pPr>
+            <w:r>
+              <w:t xml:space="preserve">   87 (1.86%)</w:t>
+            </w:r>
+          </w:p>
+        </w:tc>
+        <w:tc>
+          <w:tcPr/>
+          <w:p>
+            <w:pPr>
+              <w:pStyle w:val="Compact"/>
+              <w:jc w:val="left"/>
+            </w:pPr>
+            <w:r>
+              <w:t xml:space="preserve">  263 (4.01%)</w:t>
             </w:r>
           </w:p>
         </w:tc>
@@ -3016,67 +3194,67 @@
               <w:jc w:val="left"/>
             </w:pPr>
             <w:r>
-              <w:t xml:space="preserve">   White</w:t>
-            </w:r>
-          </w:p>
-        </w:tc>
-        <w:tc>
-          <w:tcPr/>
-          <w:p>
-            <w:pPr>
-              <w:pStyle w:val="Compact"/>
-              <w:jc w:val="left"/>
-            </w:pPr>
-            <w:r>
-              <w:t xml:space="preserve">3,912 (40.09%)</w:t>
-            </w:r>
-          </w:p>
-        </w:tc>
-        <w:tc>
-          <w:tcPr/>
-          <w:p>
-            <w:pPr>
-              <w:pStyle w:val="Compact"/>
-              <w:jc w:val="left"/>
-            </w:pPr>
-            <w:r>
-              <w:t xml:space="preserve">  973 (31.78%)</w:t>
-            </w:r>
-          </w:p>
-        </w:tc>
-        <w:tc>
-          <w:tcPr/>
-          <w:p>
-            <w:pPr>
-              <w:pStyle w:val="Compact"/>
-              <w:jc w:val="left"/>
-            </w:pPr>
-            <w:r>
-              <w:t xml:space="preserve">204 (43.13%)</w:t>
-            </w:r>
-          </w:p>
-        </w:tc>
-        <w:tc>
-          <w:tcPr/>
-          <w:p>
-            <w:pPr>
-              <w:pStyle w:val="Compact"/>
-              <w:jc w:val="left"/>
-            </w:pPr>
-            <w:r>
-              <w:t xml:space="preserve">3,271 (69.97%)</w:t>
-            </w:r>
-          </w:p>
-        </w:tc>
-        <w:tc>
-          <w:tcPr/>
-          <w:p>
-            <w:pPr>
-              <w:pStyle w:val="Compact"/>
-              <w:jc w:val="left"/>
-            </w:pPr>
-            <w:r>
-              <w:t xml:space="preserve">3,825 (58.28%)</w:t>
+              <w:t xml:space="preserve">   Unclear</w:t>
+            </w:r>
+          </w:p>
+        </w:tc>
+        <w:tc>
+          <w:tcPr/>
+          <w:p>
+            <w:pPr>
+              <w:pStyle w:val="Compact"/>
+              <w:jc w:val="left"/>
+            </w:pPr>
+            <w:r>
+              <w:t xml:space="preserve">4,016 (41.16%)</w:t>
+            </w:r>
+          </w:p>
+        </w:tc>
+        <w:tc>
+          <w:tcPr/>
+          <w:p>
+            <w:pPr>
+              <w:pStyle w:val="Compact"/>
+              <w:jc w:val="left"/>
+            </w:pPr>
+            <w:r>
+              <w:t xml:space="preserve">1,620 (52.91%)</w:t>
+            </w:r>
+          </w:p>
+        </w:tc>
+        <w:tc>
+          <w:tcPr/>
+          <w:p>
+            <w:pPr>
+              <w:pStyle w:val="Compact"/>
+              <w:jc w:val="left"/>
+            </w:pPr>
+            <w:r>
+              <w:t xml:space="preserve">235 (49.68%)</w:t>
+            </w:r>
+          </w:p>
+        </w:tc>
+        <w:tc>
+          <w:tcPr/>
+          <w:p>
+            <w:pPr>
+              <w:pStyle w:val="Compact"/>
+              <w:jc w:val="left"/>
+            </w:pPr>
+            <w:r>
+              <w:t xml:space="preserve">1,317 (28.17%)</w:t>
+            </w:r>
+          </w:p>
+        </w:tc>
+        <w:tc>
+          <w:tcPr/>
+          <w:p>
+            <w:pPr>
+              <w:pStyle w:val="Compact"/>
+              <w:jc w:val="left"/>
+            </w:pPr>
+            <w:r>
+              <w:t xml:space="preserve">2,475 (37.71%)</w:t>
             </w:r>
           </w:p>
         </w:tc>
@@ -3090,48 +3268,68 @@
               <w:jc w:val="left"/>
             </w:pPr>
             <w:r>
-              <w:t xml:space="preserve">Region</w:t>
-            </w:r>
-          </w:p>
-        </w:tc>
-        <w:tc>
-          <w:tcPr/>
-          <w:p>
-            <w:pPr>
-              <w:pStyle w:val="Compact"/>
-            </w:pPr>
-          </w:p>
-        </w:tc>
-        <w:tc>
-          <w:tcPr/>
-          <w:p>
-            <w:pPr>
-              <w:pStyle w:val="Compact"/>
-            </w:pPr>
-          </w:p>
-        </w:tc>
-        <w:tc>
-          <w:tcPr/>
-          <w:p>
-            <w:pPr>
-              <w:pStyle w:val="Compact"/>
-            </w:pPr>
-          </w:p>
-        </w:tc>
-        <w:tc>
-          <w:tcPr/>
-          <w:p>
-            <w:pPr>
-              <w:pStyle w:val="Compact"/>
-            </w:pPr>
-          </w:p>
-        </w:tc>
-        <w:tc>
-          <w:tcPr/>
-          <w:p>
-            <w:pPr>
-              <w:pStyle w:val="Compact"/>
-            </w:pPr>
+              <w:t xml:space="preserve">   White</w:t>
+            </w:r>
+          </w:p>
+        </w:tc>
+        <w:tc>
+          <w:tcPr/>
+          <w:p>
+            <w:pPr>
+              <w:pStyle w:val="Compact"/>
+              <w:jc w:val="left"/>
+            </w:pPr>
+            <w:r>
+              <w:t xml:space="preserve">3,912 (40.09%)</w:t>
+            </w:r>
+          </w:p>
+        </w:tc>
+        <w:tc>
+          <w:tcPr/>
+          <w:p>
+            <w:pPr>
+              <w:pStyle w:val="Compact"/>
+              <w:jc w:val="left"/>
+            </w:pPr>
+            <w:r>
+              <w:t xml:space="preserve">  973 (31.78%)</w:t>
+            </w:r>
+          </w:p>
+        </w:tc>
+        <w:tc>
+          <w:tcPr/>
+          <w:p>
+            <w:pPr>
+              <w:pStyle w:val="Compact"/>
+              <w:jc w:val="left"/>
+            </w:pPr>
+            <w:r>
+              <w:t xml:space="preserve">204 (43.13%)</w:t>
+            </w:r>
+          </w:p>
+        </w:tc>
+        <w:tc>
+          <w:tcPr/>
+          <w:p>
+            <w:pPr>
+              <w:pStyle w:val="Compact"/>
+              <w:jc w:val="left"/>
+            </w:pPr>
+            <w:r>
+              <w:t xml:space="preserve">3,271 (69.97%)</w:t>
+            </w:r>
+          </w:p>
+        </w:tc>
+        <w:tc>
+          <w:tcPr/>
+          <w:p>
+            <w:pPr>
+              <w:pStyle w:val="Compact"/>
+              <w:jc w:val="left"/>
+            </w:pPr>
+            <w:r>
+              <w:t xml:space="preserve">3,825 (58.28%)</w:t>
+            </w:r>
           </w:p>
         </w:tc>
       </w:tr>
@@ -3144,68 +3342,48 @@
               <w:jc w:val="left"/>
             </w:pPr>
             <w:r>
-              <w:t xml:space="preserve">   Europe</w:t>
-            </w:r>
-          </w:p>
-        </w:tc>
-        <w:tc>
-          <w:tcPr/>
-          <w:p>
-            <w:pPr>
-              <w:pStyle w:val="Compact"/>
-              <w:jc w:val="left"/>
-            </w:pPr>
-            <w:r>
-              <w:t xml:space="preserve">3,203 (32.82%)</w:t>
-            </w:r>
-          </w:p>
-        </w:tc>
-        <w:tc>
-          <w:tcPr/>
-          <w:p>
-            <w:pPr>
-              <w:pStyle w:val="Compact"/>
-              <w:jc w:val="left"/>
-            </w:pPr>
-            <w:r>
-              <w:t xml:space="preserve">1,189 (38.83%)</w:t>
-            </w:r>
-          </w:p>
-        </w:tc>
-        <w:tc>
-          <w:tcPr/>
-          <w:p>
-            <w:pPr>
-              <w:pStyle w:val="Compact"/>
-              <w:jc w:val="left"/>
-            </w:pPr>
-            <w:r>
-              <w:t xml:space="preserve">234 (49.47%)</w:t>
-            </w:r>
-          </w:p>
-        </w:tc>
-        <w:tc>
-          <w:tcPr/>
-          <w:p>
-            <w:pPr>
-              <w:pStyle w:val="Compact"/>
-              <w:jc w:val="left"/>
-            </w:pPr>
-            <w:r>
-              <w:t xml:space="preserve">4,305 (92.09%)</w:t>
-            </w:r>
-          </w:p>
-        </w:tc>
-        <w:tc>
-          <w:tcPr/>
-          <w:p>
-            <w:pPr>
-              <w:pStyle w:val="Compact"/>
-              <w:jc w:val="left"/>
-            </w:pPr>
-            <w:r>
-              <w:t xml:space="preserve">6,560 (99.95%)</w:t>
-            </w:r>
+              <w:t xml:space="preserve">Region</w:t>
+            </w:r>
+          </w:p>
+        </w:tc>
+        <w:tc>
+          <w:tcPr/>
+          <w:p>
+            <w:pPr>
+              <w:pStyle w:val="Compact"/>
+            </w:pPr>
+          </w:p>
+        </w:tc>
+        <w:tc>
+          <w:tcPr/>
+          <w:p>
+            <w:pPr>
+              <w:pStyle w:val="Compact"/>
+            </w:pPr>
+          </w:p>
+        </w:tc>
+        <w:tc>
+          <w:tcPr/>
+          <w:p>
+            <w:pPr>
+              <w:pStyle w:val="Compact"/>
+            </w:pPr>
+          </w:p>
+        </w:tc>
+        <w:tc>
+          <w:tcPr/>
+          <w:p>
+            <w:pPr>
+              <w:pStyle w:val="Compact"/>
+            </w:pPr>
+          </w:p>
+        </w:tc>
+        <w:tc>
+          <w:tcPr/>
+          <w:p>
+            <w:pPr>
+              <w:pStyle w:val="Compact"/>
+            </w:pPr>
           </w:p>
         </w:tc>
       </w:tr>
@@ -3218,67 +3396,67 @@
               <w:jc w:val="left"/>
             </w:pPr>
             <w:r>
-              <w:t xml:space="preserve">   Oceania</w:t>
-            </w:r>
-          </w:p>
-        </w:tc>
-        <w:tc>
-          <w:tcPr/>
-          <w:p>
-            <w:pPr>
-              <w:pStyle w:val="Compact"/>
-              <w:jc w:val="left"/>
-            </w:pPr>
-            <w:r>
-              <w:t xml:space="preserve">1,761 (18.05%)</w:t>
-            </w:r>
-          </w:p>
-        </w:tc>
-        <w:tc>
-          <w:tcPr/>
-          <w:p>
-            <w:pPr>
-              <w:pStyle w:val="Compact"/>
-              <w:jc w:val="left"/>
-            </w:pPr>
-            <w:r>
-              <w:t xml:space="preserve">  552 (18.03%)</w:t>
-            </w:r>
-          </w:p>
-        </w:tc>
-        <w:tc>
-          <w:tcPr/>
-          <w:p>
-            <w:pPr>
-              <w:pStyle w:val="Compact"/>
-              <w:jc w:val="left"/>
-            </w:pPr>
-            <w:r>
-              <w:t xml:space="preserve">123 (26.00%)</w:t>
-            </w:r>
-          </w:p>
-        </w:tc>
-        <w:tc>
-          <w:tcPr/>
-          <w:p>
-            <w:pPr>
-              <w:pStyle w:val="Compact"/>
-              <w:jc w:val="left"/>
-            </w:pPr>
-            <w:r>
-              <w:t xml:space="preserve">  370 (7.91%)</w:t>
-            </w:r>
-          </w:p>
-        </w:tc>
-        <w:tc>
-          <w:tcPr/>
-          <w:p>
-            <w:pPr>
-              <w:pStyle w:val="Compact"/>
-              <w:jc w:val="left"/>
-            </w:pPr>
-            <w:r>
-              <w:t xml:space="preserve">    3 (0.05%)</w:t>
+              <w:t xml:space="preserve">   Europe</w:t>
+            </w:r>
+          </w:p>
+        </w:tc>
+        <w:tc>
+          <w:tcPr/>
+          <w:p>
+            <w:pPr>
+              <w:pStyle w:val="Compact"/>
+              <w:jc w:val="left"/>
+            </w:pPr>
+            <w:r>
+              <w:t xml:space="preserve">3,203 (32.82%)</w:t>
+            </w:r>
+          </w:p>
+        </w:tc>
+        <w:tc>
+          <w:tcPr/>
+          <w:p>
+            <w:pPr>
+              <w:pStyle w:val="Compact"/>
+              <w:jc w:val="left"/>
+            </w:pPr>
+            <w:r>
+              <w:t xml:space="preserve">1,189 (38.83%)</w:t>
+            </w:r>
+          </w:p>
+        </w:tc>
+        <w:tc>
+          <w:tcPr/>
+          <w:p>
+            <w:pPr>
+              <w:pStyle w:val="Compact"/>
+              <w:jc w:val="left"/>
+            </w:pPr>
+            <w:r>
+              <w:t xml:space="preserve">234 (49.47%)</w:t>
+            </w:r>
+          </w:p>
+        </w:tc>
+        <w:tc>
+          <w:tcPr/>
+          <w:p>
+            <w:pPr>
+              <w:pStyle w:val="Compact"/>
+              <w:jc w:val="left"/>
+            </w:pPr>
+            <w:r>
+              <w:t xml:space="preserve">4,305 (92.09%)</w:t>
+            </w:r>
+          </w:p>
+        </w:tc>
+        <w:tc>
+          <w:tcPr/>
+          <w:p>
+            <w:pPr>
+              <w:pStyle w:val="Compact"/>
+              <w:jc w:val="left"/>
+            </w:pPr>
+            <w:r>
+              <w:t xml:space="preserve">6,560 (99.95%)</w:t>
             </w:r>
           </w:p>
         </w:tc>
@@ -3292,67 +3470,67 @@
               <w:jc w:val="left"/>
             </w:pPr>
             <w:r>
-              <w:t xml:space="preserve">   South america</w:t>
-            </w:r>
-          </w:p>
-        </w:tc>
-        <w:tc>
-          <w:tcPr/>
-          <w:p>
-            <w:pPr>
-              <w:pStyle w:val="Compact"/>
-              <w:jc w:val="left"/>
-            </w:pPr>
-            <w:r>
-              <w:t xml:space="preserve">2,074 (21.25%)</w:t>
-            </w:r>
-          </w:p>
-        </w:tc>
-        <w:tc>
-          <w:tcPr/>
-          <w:p>
-            <w:pPr>
-              <w:pStyle w:val="Compact"/>
-              <w:jc w:val="left"/>
-            </w:pPr>
-            <w:r>
-              <w:t xml:space="preserve">  984 (32.14%)</w:t>
-            </w:r>
-          </w:p>
-        </w:tc>
-        <w:tc>
-          <w:tcPr/>
-          <w:p>
-            <w:pPr>
-              <w:pStyle w:val="Compact"/>
-              <w:jc w:val="left"/>
-            </w:pPr>
-            <w:r>
-              <w:t xml:space="preserve">116 (24.52%)</w:t>
-            </w:r>
-          </w:p>
-        </w:tc>
-        <w:tc>
-          <w:tcPr/>
-          <w:p>
-            <w:pPr>
-              <w:pStyle w:val="Compact"/>
-              <w:jc w:val="left"/>
-            </w:pPr>
-            <w:r>
-              <w:t xml:space="preserve">-</w:t>
-            </w:r>
-          </w:p>
-        </w:tc>
-        <w:tc>
-          <w:tcPr/>
-          <w:p>
-            <w:pPr>
-              <w:pStyle w:val="Compact"/>
-              <w:jc w:val="left"/>
-            </w:pPr>
-            <w:r>
-              <w:t xml:space="preserve">-</w:t>
+              <w:t xml:space="preserve">   Oceania</w:t>
+            </w:r>
+          </w:p>
+        </w:tc>
+        <w:tc>
+          <w:tcPr/>
+          <w:p>
+            <w:pPr>
+              <w:pStyle w:val="Compact"/>
+              <w:jc w:val="left"/>
+            </w:pPr>
+            <w:r>
+              <w:t xml:space="preserve">1,761 (18.05%)</w:t>
+            </w:r>
+          </w:p>
+        </w:tc>
+        <w:tc>
+          <w:tcPr/>
+          <w:p>
+            <w:pPr>
+              <w:pStyle w:val="Compact"/>
+              <w:jc w:val="left"/>
+            </w:pPr>
+            <w:r>
+              <w:t xml:space="preserve">  552 (18.03%)</w:t>
+            </w:r>
+          </w:p>
+        </w:tc>
+        <w:tc>
+          <w:tcPr/>
+          <w:p>
+            <w:pPr>
+              <w:pStyle w:val="Compact"/>
+              <w:jc w:val="left"/>
+            </w:pPr>
+            <w:r>
+              <w:t xml:space="preserve">123 (26.00%)</w:t>
+            </w:r>
+          </w:p>
+        </w:tc>
+        <w:tc>
+          <w:tcPr/>
+          <w:p>
+            <w:pPr>
+              <w:pStyle w:val="Compact"/>
+              <w:jc w:val="left"/>
+            </w:pPr>
+            <w:r>
+              <w:t xml:space="preserve">  370 (7.91%)</w:t>
+            </w:r>
+          </w:p>
+        </w:tc>
+        <w:tc>
+          <w:tcPr/>
+          <w:p>
+            <w:pPr>
+              <w:pStyle w:val="Compact"/>
+              <w:jc w:val="left"/>
+            </w:pPr>
+            <w:r>
+              <w:t xml:space="preserve">    3 (0.05%)</w:t>
             </w:r>
           </w:p>
         </w:tc>
@@ -3366,43 +3544,43 @@
               <w:jc w:val="left"/>
             </w:pPr>
             <w:r>
-              <w:t xml:space="preserve">   Africa</w:t>
-            </w:r>
-          </w:p>
-        </w:tc>
-        <w:tc>
-          <w:tcPr/>
-          <w:p>
-            <w:pPr>
-              <w:pStyle w:val="Compact"/>
-              <w:jc w:val="left"/>
-            </w:pPr>
-            <w:r>
-              <w:t xml:space="preserve">  876 (8.98%)</w:t>
-            </w:r>
-          </w:p>
-        </w:tc>
-        <w:tc>
-          <w:tcPr/>
-          <w:p>
-            <w:pPr>
-              <w:pStyle w:val="Compact"/>
-              <w:jc w:val="left"/>
-            </w:pPr>
-            <w:r>
-              <w:t xml:space="preserve">  167 (5.45%)</w:t>
-            </w:r>
-          </w:p>
-        </w:tc>
-        <w:tc>
-          <w:tcPr/>
-          <w:p>
-            <w:pPr>
-              <w:pStyle w:val="Compact"/>
-              <w:jc w:val="left"/>
-            </w:pPr>
-            <w:r>
-              <w:t xml:space="preserve">-</w:t>
+              <w:t xml:space="preserve">   South America</w:t>
+            </w:r>
+          </w:p>
+        </w:tc>
+        <w:tc>
+          <w:tcPr/>
+          <w:p>
+            <w:pPr>
+              <w:pStyle w:val="Compact"/>
+              <w:jc w:val="left"/>
+            </w:pPr>
+            <w:r>
+              <w:t xml:space="preserve">2,074 (21.25%)</w:t>
+            </w:r>
+          </w:p>
+        </w:tc>
+        <w:tc>
+          <w:tcPr/>
+          <w:p>
+            <w:pPr>
+              <w:pStyle w:val="Compact"/>
+              <w:jc w:val="left"/>
+            </w:pPr>
+            <w:r>
+              <w:t xml:space="preserve">  984 (32.14%)</w:t>
+            </w:r>
+          </w:p>
+        </w:tc>
+        <w:tc>
+          <w:tcPr/>
+          <w:p>
+            <w:pPr>
+              <w:pStyle w:val="Compact"/>
+              <w:jc w:val="left"/>
+            </w:pPr>
+            <w:r>
+              <w:t xml:space="preserve">116 (24.52%)</w:t>
             </w:r>
           </w:p>
         </w:tc>
@@ -3440,31 +3618,31 @@
               <w:jc w:val="left"/>
             </w:pPr>
             <w:r>
-              <w:t xml:space="preserve">   Asia</w:t>
-            </w:r>
-          </w:p>
-        </w:tc>
-        <w:tc>
-          <w:tcPr/>
-          <w:p>
-            <w:pPr>
-              <w:pStyle w:val="Compact"/>
-              <w:jc w:val="left"/>
-            </w:pPr>
-            <w:r>
-              <w:t xml:space="preserve">  610 (6.25%)</w:t>
-            </w:r>
-          </w:p>
-        </w:tc>
-        <w:tc>
-          <w:tcPr/>
-          <w:p>
-            <w:pPr>
-              <w:pStyle w:val="Compact"/>
-              <w:jc w:val="left"/>
-            </w:pPr>
-            <w:r>
-              <w:t xml:space="preserve">   90 (2.94%)</w:t>
+              <w:t xml:space="preserve">   Africa</w:t>
+            </w:r>
+          </w:p>
+        </w:tc>
+        <w:tc>
+          <w:tcPr/>
+          <w:p>
+            <w:pPr>
+              <w:pStyle w:val="Compact"/>
+              <w:jc w:val="left"/>
+            </w:pPr>
+            <w:r>
+              <w:t xml:space="preserve">  876 (8.98%)</w:t>
+            </w:r>
+          </w:p>
+        </w:tc>
+        <w:tc>
+          <w:tcPr/>
+          <w:p>
+            <w:pPr>
+              <w:pStyle w:val="Compact"/>
+              <w:jc w:val="left"/>
+            </w:pPr>
+            <w:r>
+              <w:t xml:space="preserve">  167 (5.45%)</w:t>
             </w:r>
           </w:p>
         </w:tc>
@@ -3514,31 +3692,31 @@
               <w:jc w:val="left"/>
             </w:pPr>
             <w:r>
-              <w:t xml:space="preserve">   North america</w:t>
-            </w:r>
-          </w:p>
-        </w:tc>
-        <w:tc>
-          <w:tcPr/>
-          <w:p>
-            <w:pPr>
-              <w:pStyle w:val="Compact"/>
-              <w:jc w:val="left"/>
-            </w:pPr>
-            <w:r>
-              <w:t xml:space="preserve">1,234 (12.65%)</w:t>
-            </w:r>
-          </w:p>
-        </w:tc>
-        <w:tc>
-          <w:tcPr/>
-          <w:p>
-            <w:pPr>
-              <w:pStyle w:val="Compact"/>
-              <w:jc w:val="left"/>
-            </w:pPr>
-            <w:r>
-              <w:t xml:space="preserve">   80 (2.61%)</w:t>
+              <w:t xml:space="preserve">   Asia</w:t>
+            </w:r>
+          </w:p>
+        </w:tc>
+        <w:tc>
+          <w:tcPr/>
+          <w:p>
+            <w:pPr>
+              <w:pStyle w:val="Compact"/>
+              <w:jc w:val="left"/>
+            </w:pPr>
+            <w:r>
+              <w:t xml:space="preserve">  610 (6.25%)</w:t>
+            </w:r>
+          </w:p>
+        </w:tc>
+        <w:tc>
+          <w:tcPr/>
+          <w:p>
+            <w:pPr>
+              <w:pStyle w:val="Compact"/>
+              <w:jc w:val="left"/>
+            </w:pPr>
+            <w:r>
+              <w:t xml:space="preserve">   90 (2.94%)</w:t>
             </w:r>
           </w:p>
         </w:tc>
@@ -3588,48 +3766,68 @@
               <w:jc w:val="left"/>
             </w:pPr>
             <w:r>
-              <w:t xml:space="preserve">Season</w:t>
-            </w:r>
-          </w:p>
-        </w:tc>
-        <w:tc>
-          <w:tcPr/>
-          <w:p>
-            <w:pPr>
-              <w:pStyle w:val="Compact"/>
-            </w:pPr>
-          </w:p>
-        </w:tc>
-        <w:tc>
-          <w:tcPr/>
-          <w:p>
-            <w:pPr>
-              <w:pStyle w:val="Compact"/>
-            </w:pPr>
-          </w:p>
-        </w:tc>
-        <w:tc>
-          <w:tcPr/>
-          <w:p>
-            <w:pPr>
-              <w:pStyle w:val="Compact"/>
-            </w:pPr>
-          </w:p>
-        </w:tc>
-        <w:tc>
-          <w:tcPr/>
-          <w:p>
-            <w:pPr>
-              <w:pStyle w:val="Compact"/>
-            </w:pPr>
-          </w:p>
-        </w:tc>
-        <w:tc>
-          <w:tcPr/>
-          <w:p>
-            <w:pPr>
-              <w:pStyle w:val="Compact"/>
-            </w:pPr>
+              <w:t xml:space="preserve">   North America</w:t>
+            </w:r>
+          </w:p>
+        </w:tc>
+        <w:tc>
+          <w:tcPr/>
+          <w:p>
+            <w:pPr>
+              <w:pStyle w:val="Compact"/>
+              <w:jc w:val="left"/>
+            </w:pPr>
+            <w:r>
+              <w:t xml:space="preserve">1,234 (12.65%)</w:t>
+            </w:r>
+          </w:p>
+        </w:tc>
+        <w:tc>
+          <w:tcPr/>
+          <w:p>
+            <w:pPr>
+              <w:pStyle w:val="Compact"/>
+              <w:jc w:val="left"/>
+            </w:pPr>
+            <w:r>
+              <w:t xml:space="preserve">   80 (2.61%)</w:t>
+            </w:r>
+          </w:p>
+        </w:tc>
+        <w:tc>
+          <w:tcPr/>
+          <w:p>
+            <w:pPr>
+              <w:pStyle w:val="Compact"/>
+              <w:jc w:val="left"/>
+            </w:pPr>
+            <w:r>
+              <w:t xml:space="preserve">-</w:t>
+            </w:r>
+          </w:p>
+        </w:tc>
+        <w:tc>
+          <w:tcPr/>
+          <w:p>
+            <w:pPr>
+              <w:pStyle w:val="Compact"/>
+              <w:jc w:val="left"/>
+            </w:pPr>
+            <w:r>
+              <w:t xml:space="preserve">-</w:t>
+            </w:r>
+          </w:p>
+        </w:tc>
+        <w:tc>
+          <w:tcPr/>
+          <w:p>
+            <w:pPr>
+              <w:pStyle w:val="Compact"/>
+              <w:jc w:val="left"/>
+            </w:pPr>
+            <w:r>
+              <w:t xml:space="preserve">-</w:t>
+            </w:r>
           </w:p>
         </w:tc>
       </w:tr>
@@ -3642,68 +3840,48 @@
               <w:jc w:val="left"/>
             </w:pPr>
             <w:r>
-              <w:t xml:space="preserve">   Autumn</w:t>
-            </w:r>
-          </w:p>
-        </w:tc>
-        <w:tc>
-          <w:tcPr/>
-          <w:p>
-            <w:pPr>
-              <w:pStyle w:val="Compact"/>
-              <w:jc w:val="left"/>
-            </w:pPr>
-            <w:r>
-              <w:t xml:space="preserve">3,183 (32.62%)</w:t>
-            </w:r>
-          </w:p>
-        </w:tc>
-        <w:tc>
-          <w:tcPr/>
-          <w:p>
-            <w:pPr>
-              <w:pStyle w:val="Compact"/>
-              <w:jc w:val="left"/>
-            </w:pPr>
-            <w:r>
-              <w:t xml:space="preserve">  663 (21.65%)</w:t>
-            </w:r>
-          </w:p>
-        </w:tc>
-        <w:tc>
-          <w:tcPr/>
-          <w:p>
-            <w:pPr>
-              <w:pStyle w:val="Compact"/>
-              <w:jc w:val="left"/>
-            </w:pPr>
-            <w:r>
-              <w:t xml:space="preserve">54 (11.42%)</w:t>
-            </w:r>
-          </w:p>
-        </w:tc>
-        <w:tc>
-          <w:tcPr/>
-          <w:p>
-            <w:pPr>
-              <w:pStyle w:val="Compact"/>
-              <w:jc w:val="left"/>
-            </w:pPr>
-            <w:r>
-              <w:t xml:space="preserve">1,149 (24.58%)</w:t>
-            </w:r>
-          </w:p>
-        </w:tc>
-        <w:tc>
-          <w:tcPr/>
-          <w:p>
-            <w:pPr>
-              <w:pStyle w:val="Compact"/>
-              <w:jc w:val="left"/>
-            </w:pPr>
-            <w:r>
-              <w:t xml:space="preserve">1,404 (21.39%)</w:t>
-            </w:r>
+              <w:t xml:space="preserve">Season</w:t>
+            </w:r>
+          </w:p>
+        </w:tc>
+        <w:tc>
+          <w:tcPr/>
+          <w:p>
+            <w:pPr>
+              <w:pStyle w:val="Compact"/>
+            </w:pPr>
+          </w:p>
+        </w:tc>
+        <w:tc>
+          <w:tcPr/>
+          <w:p>
+            <w:pPr>
+              <w:pStyle w:val="Compact"/>
+            </w:pPr>
+          </w:p>
+        </w:tc>
+        <w:tc>
+          <w:tcPr/>
+          <w:p>
+            <w:pPr>
+              <w:pStyle w:val="Compact"/>
+            </w:pPr>
+          </w:p>
+        </w:tc>
+        <w:tc>
+          <w:tcPr/>
+          <w:p>
+            <w:pPr>
+              <w:pStyle w:val="Compact"/>
+            </w:pPr>
+          </w:p>
+        </w:tc>
+        <w:tc>
+          <w:tcPr/>
+          <w:p>
+            <w:pPr>
+              <w:pStyle w:val="Compact"/>
+            </w:pPr>
           </w:p>
         </w:tc>
       </w:tr>
@@ -3716,67 +3894,67 @@
               <w:jc w:val="left"/>
             </w:pPr>
             <w:r>
-              <w:t xml:space="preserve">   Spring</w:t>
-            </w:r>
-          </w:p>
-        </w:tc>
-        <w:tc>
-          <w:tcPr/>
-          <w:p>
-            <w:pPr>
-              <w:pStyle w:val="Compact"/>
-              <w:jc w:val="left"/>
-            </w:pPr>
-            <w:r>
-              <w:t xml:space="preserve">2,263 (23.19%)</w:t>
-            </w:r>
-          </w:p>
-        </w:tc>
-        <w:tc>
-          <w:tcPr/>
-          <w:p>
-            <w:pPr>
-              <w:pStyle w:val="Compact"/>
-              <w:jc w:val="left"/>
-            </w:pPr>
-            <w:r>
-              <w:t xml:space="preserve">1,599 (52.22%)</w:t>
-            </w:r>
-          </w:p>
-        </w:tc>
-        <w:tc>
-          <w:tcPr/>
-          <w:p>
-            <w:pPr>
-              <w:pStyle w:val="Compact"/>
-              <w:jc w:val="left"/>
-            </w:pPr>
-            <w:r>
-              <w:t xml:space="preserve">264 (55.81%)</w:t>
-            </w:r>
-          </w:p>
-        </w:tc>
-        <w:tc>
-          <w:tcPr/>
-          <w:p>
-            <w:pPr>
-              <w:pStyle w:val="Compact"/>
-              <w:jc w:val="left"/>
-            </w:pPr>
-            <w:r>
-              <w:t xml:space="preserve">1,156 (24.73%)</w:t>
-            </w:r>
-          </w:p>
-        </w:tc>
-        <w:tc>
-          <w:tcPr/>
-          <w:p>
-            <w:pPr>
-              <w:pStyle w:val="Compact"/>
-              <w:jc w:val="left"/>
-            </w:pPr>
-            <w:r>
-              <w:t xml:space="preserve">2,128 (32.42%)</w:t>
+              <w:t xml:space="preserve">   Autumn</w:t>
+            </w:r>
+          </w:p>
+        </w:tc>
+        <w:tc>
+          <w:tcPr/>
+          <w:p>
+            <w:pPr>
+              <w:pStyle w:val="Compact"/>
+              <w:jc w:val="left"/>
+            </w:pPr>
+            <w:r>
+              <w:t xml:space="preserve">3,213 (32.93%)</w:t>
+            </w:r>
+          </w:p>
+        </w:tc>
+        <w:tc>
+          <w:tcPr/>
+          <w:p>
+            <w:pPr>
+              <w:pStyle w:val="Compact"/>
+              <w:jc w:val="left"/>
+            </w:pPr>
+            <w:r>
+              <w:t xml:space="preserve">  668 (21.82%)</w:t>
+            </w:r>
+          </w:p>
+        </w:tc>
+        <w:tc>
+          <w:tcPr/>
+          <w:p>
+            <w:pPr>
+              <w:pStyle w:val="Compact"/>
+              <w:jc w:val="left"/>
+            </w:pPr>
+            <w:r>
+              <w:t xml:space="preserve">55 (11.63%)</w:t>
+            </w:r>
+          </w:p>
+        </w:tc>
+        <w:tc>
+          <w:tcPr/>
+          <w:p>
+            <w:pPr>
+              <w:pStyle w:val="Compact"/>
+              <w:jc w:val="left"/>
+            </w:pPr>
+            <w:r>
+              <w:t xml:space="preserve">1,154 (24.68%)</w:t>
+            </w:r>
+          </w:p>
+        </w:tc>
+        <w:tc>
+          <w:tcPr/>
+          <w:p>
+            <w:pPr>
+              <w:pStyle w:val="Compact"/>
+              <w:jc w:val="left"/>
+            </w:pPr>
+            <w:r>
+              <w:t xml:space="preserve">1,380 (21.03%)</w:t>
             </w:r>
           </w:p>
         </w:tc>
@@ -3790,67 +3968,67 @@
               <w:jc w:val="left"/>
             </w:pPr>
             <w:r>
-              <w:t xml:space="preserve">   Summer</w:t>
-            </w:r>
-          </w:p>
-        </w:tc>
-        <w:tc>
-          <w:tcPr/>
-          <w:p>
-            <w:pPr>
-              <w:pStyle w:val="Compact"/>
-              <w:jc w:val="left"/>
-            </w:pPr>
-            <w:r>
-              <w:t xml:space="preserve">1,223 (12.53%)</w:t>
-            </w:r>
-          </w:p>
-        </w:tc>
-        <w:tc>
-          <w:tcPr/>
-          <w:p>
-            <w:pPr>
-              <w:pStyle w:val="Compact"/>
-              <w:jc w:val="left"/>
-            </w:pPr>
-            <w:r>
-              <w:t xml:space="preserve">  314 (10.25%)</w:t>
-            </w:r>
-          </w:p>
-        </w:tc>
-        <w:tc>
-          <w:tcPr/>
-          <w:p>
-            <w:pPr>
-              <w:pStyle w:val="Compact"/>
-              <w:jc w:val="left"/>
-            </w:pPr>
-            <w:r>
-              <w:t xml:space="preserve">86 (18.18%)</w:t>
-            </w:r>
-          </w:p>
-        </w:tc>
-        <w:tc>
-          <w:tcPr/>
-          <w:p>
-            <w:pPr>
-              <w:pStyle w:val="Compact"/>
-              <w:jc w:val="left"/>
-            </w:pPr>
-            <w:r>
-              <w:t xml:space="preserve">1,175 (25.13%)</w:t>
-            </w:r>
-          </w:p>
-        </w:tc>
-        <w:tc>
-          <w:tcPr/>
-          <w:p>
-            <w:pPr>
-              <w:pStyle w:val="Compact"/>
-              <w:jc w:val="left"/>
-            </w:pPr>
-            <w:r>
-              <w:t xml:space="preserve">1,358 (20.69%)</w:t>
+              <w:t xml:space="preserve">   Spring</w:t>
+            </w:r>
+          </w:p>
+        </w:tc>
+        <w:tc>
+          <w:tcPr/>
+          <w:p>
+            <w:pPr>
+              <w:pStyle w:val="Compact"/>
+              <w:jc w:val="left"/>
+            </w:pPr>
+            <w:r>
+              <w:t xml:space="preserve">2,268 (23.24%)</w:t>
+            </w:r>
+          </w:p>
+        </w:tc>
+        <w:tc>
+          <w:tcPr/>
+          <w:p>
+            <w:pPr>
+              <w:pStyle w:val="Compact"/>
+              <w:jc w:val="left"/>
+            </w:pPr>
+            <w:r>
+              <w:t xml:space="preserve">1,588 (51.86%)</w:t>
+            </w:r>
+          </w:p>
+        </w:tc>
+        <w:tc>
+          <w:tcPr/>
+          <w:p>
+            <w:pPr>
+              <w:pStyle w:val="Compact"/>
+              <w:jc w:val="left"/>
+            </w:pPr>
+            <w:r>
+              <w:t xml:space="preserve">265 (56.03%)</w:t>
+            </w:r>
+          </w:p>
+        </w:tc>
+        <w:tc>
+          <w:tcPr/>
+          <w:p>
+            <w:pPr>
+              <w:pStyle w:val="Compact"/>
+              <w:jc w:val="left"/>
+            </w:pPr>
+            <w:r>
+              <w:t xml:space="preserve">1,152 (24.64%)</w:t>
+            </w:r>
+          </w:p>
+        </w:tc>
+        <w:tc>
+          <w:tcPr/>
+          <w:p>
+            <w:pPr>
+              <w:pStyle w:val="Compact"/>
+              <w:jc w:val="left"/>
+            </w:pPr>
+            <w:r>
+              <w:t xml:space="preserve">2,107 (32.10%)</w:t>
             </w:r>
           </w:p>
         </w:tc>
@@ -3864,6 +4042,80 @@
               <w:jc w:val="left"/>
             </w:pPr>
             <w:r>
+              <w:t xml:space="preserve">   Summer</w:t>
+            </w:r>
+          </w:p>
+        </w:tc>
+        <w:tc>
+          <w:tcPr/>
+          <w:p>
+            <w:pPr>
+              <w:pStyle w:val="Compact"/>
+              <w:jc w:val="left"/>
+            </w:pPr>
+            <w:r>
+              <w:t xml:space="preserve">1,169 (11.98%)</w:t>
+            </w:r>
+          </w:p>
+        </w:tc>
+        <w:tc>
+          <w:tcPr/>
+          <w:p>
+            <w:pPr>
+              <w:pStyle w:val="Compact"/>
+              <w:jc w:val="left"/>
+            </w:pPr>
+            <w:r>
+              <w:t xml:space="preserve">  311 (10.16%)</w:t>
+            </w:r>
+          </w:p>
+        </w:tc>
+        <w:tc>
+          <w:tcPr/>
+          <w:p>
+            <w:pPr>
+              <w:pStyle w:val="Compact"/>
+              <w:jc w:val="left"/>
+            </w:pPr>
+            <w:r>
+              <w:t xml:space="preserve">84 (17.76%)</w:t>
+            </w:r>
+          </w:p>
+        </w:tc>
+        <w:tc>
+          <w:tcPr/>
+          <w:p>
+            <w:pPr>
+              <w:pStyle w:val="Compact"/>
+              <w:jc w:val="left"/>
+            </w:pPr>
+            <w:r>
+              <w:t xml:space="preserve">1,172 (25.07%)</w:t>
+            </w:r>
+          </w:p>
+        </w:tc>
+        <w:tc>
+          <w:tcPr/>
+          <w:p>
+            <w:pPr>
+              <w:pStyle w:val="Compact"/>
+              <w:jc w:val="left"/>
+            </w:pPr>
+            <w:r>
+              <w:t xml:space="preserve">1,378 (21.00%)</w:t>
+            </w:r>
+          </w:p>
+        </w:tc>
+      </w:tr>
+      <w:tr>
+        <w:tc>
+          <w:tcPr/>
+          <w:p>
+            <w:pPr>
+              <w:pStyle w:val="Compact"/>
+              <w:jc w:val="left"/>
+            </w:pPr>
+            <w:r>
               <w:t xml:space="preserve">   Winter</w:t>
             </w:r>
           </w:p>
@@ -3876,19 +4128,19 @@
               <w:jc w:val="left"/>
             </w:pPr>
             <w:r>
-              <w:t xml:space="preserve">3,089 (31.66%)</w:t>
-            </w:r>
-          </w:p>
-        </w:tc>
-        <w:tc>
-          <w:tcPr/>
-          <w:p>
-            <w:pPr>
-              <w:pStyle w:val="Compact"/>
-              <w:jc w:val="left"/>
-            </w:pPr>
-            <w:r>
-              <w:t xml:space="preserve">  486 (15.87%)</w:t>
+              <w:t xml:space="preserve">3,108 (31.85%)</w:t>
+            </w:r>
+          </w:p>
+        </w:tc>
+        <w:tc>
+          <w:tcPr/>
+          <w:p>
+            <w:pPr>
+              <w:pStyle w:val="Compact"/>
+              <w:jc w:val="left"/>
+            </w:pPr>
+            <w:r>
+              <w:t xml:space="preserve">  495 (16.17%)</w:t>
             </w:r>
           </w:p>
         </w:tc>
@@ -3912,19 +4164,19 @@
               <w:jc w:val="left"/>
             </w:pPr>
             <w:r>
-              <w:t xml:space="preserve">1,195 (25.56%)</w:t>
-            </w:r>
-          </w:p>
-        </w:tc>
-        <w:tc>
-          <w:tcPr/>
-          <w:p>
-            <w:pPr>
-              <w:pStyle w:val="Compact"/>
-              <w:jc w:val="left"/>
-            </w:pPr>
-            <w:r>
-              <w:t xml:space="preserve">1,673 (25.49%)</w:t>
+              <w:t xml:space="preserve">1,197 (25.60%)</w:t>
+            </w:r>
+          </w:p>
+        </w:tc>
+        <w:tc>
+          <w:tcPr/>
+          <w:p>
+            <w:pPr>
+              <w:pStyle w:val="Compact"/>
+              <w:jc w:val="left"/>
+            </w:pPr>
+            <w:r>
+              <w:t xml:space="preserve">1,698 (25.87%)</w:t>
             </w:r>
           </w:p>
         </w:tc>
@@ -4551,7 +4803,7 @@
         <w:t xml:space="preserve"> </w:t>
       </w:r>
       <w:r>
-        <w:t xml:space="preserve">88 participants had missing age data. For categorical variables the value is the count, and percentage. For numeric variables the value is the Mean and SD. N = 28,823</w:t>
+        <w:t xml:space="preserve">78 participants had missing age data. For categorical variables the value is the count, and percentage. For numeric variables the value is the Mean and SD. Total N = 24,609</w:t>
       </w:r>
     </w:p>
     <w:p>
@@ -4621,7 +4873,7 @@
         <w:t xml:space="preserve"> </w:t>
       </w:r>
       <w:r>
-        <w:t xml:space="preserve">The relationship between physical activity volume and sleep duration, efficiency, and onset was consistent across the age groups, with some very weak evidence that the relationship with sleep regularity grew stronger with age.</w:t>
+        <w:t xml:space="preserve">The relationship between physical activity volume and sleep duration, efficiency, and onset was consistent across the age groups, with some negligible evidence that the relationship with sleep regularity grew stronger with age.</w:t>
       </w:r>
     </w:p>
     <w:p>
@@ -8160,7 +8412,7 @@
           <wp:inline>
             <wp:extent cx="3810000" cy="2540000"/>
             <wp:effectExtent b="0" l="0" r="0" t="0"/>
-            <wp:docPr descr="Figure 1: Sleep metrics on physical activity volume. The panels on the left show the curvilinear relationship between PA volume and each of the sleep outcomes at the ages indicated in each column. The panels on the right show the same relationships but by age continuously. The white band indicates predictions which were not significantly different from zero. These plots demonstrate exact turning points where the effects of PA volume change by age." title="" id="36" name="Picture"/>
+            <wp:docPr descr="Figure 1: Sleep metrics predicted by physical activity volume. The panels on the left show the curvilinear relationship between PA volume and each of the sleep outcomes at the ages indicated in each column. The panels on the right show the same relationships but by age continuously. The white band indicates predictions which were not significantly different from zero. These plots demonstrate exact turning points where the effects of PA volume change by age." title="" id="36" name="Picture"/>
             <a:graphic>
               <a:graphicData uri="http://schemas.openxmlformats.org/drawingml/2006/picture">
                 <pic:pic>
@@ -8205,7 +8457,7 @@
       <w:bookmarkStart w:id="38" w:name="fig:sleep-by-volume-fig"/>
       <w:bookmarkEnd w:id="38"/>
       <w:r>
-        <w:t xml:space="preserve">Figure 1: Sleep metrics on physical activity volume. The panels on the left show the curvilinear relationship between PA volume and each of the sleep outcomes at the ages indicated in each column. The panels on the right show the same relationships but by age continuously. The white band indicates predictions which were not significantly different from zero. These plots demonstrate exact turning points where the effects of PA volume change by age.</w:t>
+        <w:t xml:space="preserve">Figure 1: Sleep metrics predicted by physical activity volume. The panels on the left show the curvilinear relationship between PA volume and each of the sleep outcomes at the ages indicated in each column. The panels on the right show the same relationships but by age continuously. The white band indicates predictions which were not significantly different from zero. These plots demonstrate exact turning points where the effects of PA volume change by age.</w:t>
       </w:r>
     </w:p>
     <w:bookmarkEnd w:id="39"/>
@@ -8262,13 +8514,7 @@
         <w:t xml:space="preserve"> </w:t>
       </w:r>
       <w:r>
-        <w:t xml:space="preserve">While age statistically significantly modified the relationship between physical activity intensity and sleep duration, efficiency, and regularity, the effect was negligible for duration and efficiency.</w:t>
-      </w:r>
-      <w:r>
-        <w:t xml:space="preserve"> </w:t>
-      </w:r>
-      <w:r>
-        <w:t xml:space="preserve">For regularity, the association weakened with age.</w:t>
+        <w:t xml:space="preserve">While age statistically significantly modified the relationship between physical activity intensity and sleep duration, efficiency, and regularity, the effect was negligible.</w:t>
       </w:r>
     </w:p>
     <w:p>
@@ -8280,7 +8526,7 @@
           <wp:inline>
             <wp:extent cx="3810000" cy="2540000"/>
             <wp:effectExtent b="0" l="0" r="0" t="0"/>
-            <wp:docPr descr="Figure 2: Sleep metrics on physical activity intensity. The panels on the left show the curvilinear relationship between PA intensity and each of the sleep outcomes at the ages indicated in each column. The panels on the right show the same relationships but by age continuously. The white band indicates predictions which were not significantly different from zero." title="" id="41" name="Picture"/>
+            <wp:docPr descr="Figure 2: Sleep metrics predicted by physical activity intensity. The panels on the left show the curvilinear relationship between PA intensity and each of the sleep outcomes at the ages indicated in each column. The panels on the right show the same relationships but by age continuously. The white band indicates predictions which were not significantly different from zero." title="" id="41" name="Picture"/>
             <a:graphic>
               <a:graphicData uri="http://schemas.openxmlformats.org/drawingml/2006/picture">
                 <pic:pic>
@@ -8325,7 +8571,7 @@
       <w:bookmarkStart w:id="43" w:name="fig:sleep-by-intensity-fig"/>
       <w:bookmarkEnd w:id="43"/>
       <w:r>
-        <w:t xml:space="preserve">Figure 2: Sleep metrics on physical activity intensity. The panels on the left show the curvilinear relationship between PA intensity and each of the sleep outcomes at the ages indicated in each column. The panels on the right show the same relationships but by age continuously. The white band indicates predictions which were not significantly different from zero.</w:t>
+        <w:t xml:space="preserve">Figure 2: Sleep metrics predicted by physical activity intensity. The panels on the left show the curvilinear relationship between PA intensity and each of the sleep outcomes at the ages indicated in each column. The panels on the right show the same relationships but by age continuously. The white band indicates predictions which were not significantly different from zero.</w:t>
       </w:r>
     </w:p>
     <w:bookmarkEnd w:id="44"/>
@@ -8382,7 +8628,7 @@
         <w:t xml:space="preserve"> </w:t>
       </w:r>
       <w:r>
-        <w:t xml:space="preserve">We found no evidence for an association between average sleep duration and physical activity volume.</w:t>
+        <w:t xml:space="preserve">We found no evidence for an association between average sleep duration and physical activity volume or intensity.</w:t>
       </w:r>
     </w:p>
     <w:p>
@@ -11921,7 +12167,7 @@
           <wp:inline>
             <wp:extent cx="3810000" cy="2540000"/>
             <wp:effectExtent b="0" l="0" r="0" t="0"/>
-            <wp:docPr descr="Figure 3: Physical activity by sleep duration. The panels on the left show the curvilinear relationship between sleep duration and each of the physical activity outcomes at the ages indicated in each column. The panels on the right show the same relationships but by age continuously. The white band indicates predictions which were not significantly different from zero." title="" id="47" name="Picture"/>
+            <wp:docPr descr="Figure 3: Physical activity predicted by previous night sleep duration. The panels on the left show the curvilinear relationship between sleep duration and each of the physical activity outcomes at the ages indicated in each column. The panels on the right show the same relationships but by age continuously. The white band indicates predictions which were not significantly different from zero." title="" id="47" name="Picture"/>
             <a:graphic>
               <a:graphicData uri="http://schemas.openxmlformats.org/drawingml/2006/picture">
                 <pic:pic>
@@ -11966,7 +12212,7 @@
       <w:bookmarkStart w:id="49" w:name="fig:PA-by-sleep-duration-fig"/>
       <w:bookmarkEnd w:id="49"/>
       <w:r>
-        <w:t xml:space="preserve">Figure 3: Physical activity by sleep duration. The panels on the left show the curvilinear relationship between sleep duration and each of the physical activity outcomes at the ages indicated in each column. The panels on the right show the same relationships but by age continuously. The white band indicates predictions which were not significantly different from zero.</w:t>
+        <w:t xml:space="preserve">Figure 3: Physical activity predicted by previous night sleep duration. The panels on the left show the curvilinear relationship between sleep duration and each of the physical activity outcomes at the ages indicated in each column. The panels on the right show the same relationships but by age continuously. The white band indicates predictions which were not significantly different from zero.</w:t>
       </w:r>
     </w:p>
     <w:bookmarkEnd w:id="50"/>
@@ -12029,7 +12275,7 @@
           <wp:inline>
             <wp:extent cx="3810000" cy="2540000"/>
             <wp:effectExtent b="0" l="0" r="0" t="0"/>
-            <wp:docPr descr="Figure 4: Physical activity by sleep efficiency. The panels on the left show the curvilinear relationship between sleep efficiency and each of the physical activity outcomes at the ages indicated in each column. The panels on the right show the same relationships but by age continuously. The white band indicates predictions which were not significantly different from zero." title="" id="52" name="Picture"/>
+            <wp:docPr descr="Figure 4: Physical activity predicted by previous night sleep efficiency. The panels on the left show the curvilinear relationship between sleep efficiency and each of the physical activity outcomes at the ages indicated in each column. The panels on the right show the same relationships but by age continuously. The white band indicates predictions which were not significantly different from zero." title="" id="52" name="Picture"/>
             <a:graphic>
               <a:graphicData uri="http://schemas.openxmlformats.org/drawingml/2006/picture">
                 <pic:pic>
@@ -12074,7 +12320,7 @@
       <w:bookmarkStart w:id="54" w:name="fig:PA-by-sleep-efficiency-fig"/>
       <w:bookmarkEnd w:id="54"/>
       <w:r>
-        <w:t xml:space="preserve">Figure 4: Physical activity by sleep efficiency. The panels on the left show the curvilinear relationship between sleep efficiency and each of the physical activity outcomes at the ages indicated in each column. The panels on the right show the same relationships but by age continuously. The white band indicates predictions which were not significantly different from zero.</w:t>
+        <w:t xml:space="preserve">Figure 4: Physical activity predicted by previous night sleep efficiency. The panels on the left show the curvilinear relationship between sleep efficiency and each of the physical activity outcomes at the ages indicated in each column. The panels on the right show the same relationships but by age continuously. The white band indicates predictions which were not significantly different from zero.</w:t>
       </w:r>
     </w:p>
     <w:bookmarkEnd w:id="55"/>
@@ -12137,7 +12383,7 @@
           <wp:inline>
             <wp:extent cx="3810000" cy="2540000"/>
             <wp:effectExtent b="0" l="0" r="0" t="0"/>
-            <wp:docPr descr="Figure 5: Physical activity by sleep onset. The panels on the left show the curvilinear relationship between sleep onset and each of the physical activity outcomes at the ages indicated in each column. The panels on the right show the same relationships but by age continuously. The white band indicates predictions which were not significantly different from zero." title="" id="57" name="Picture"/>
+            <wp:docPr descr="Figure 5: Physical activity predicted by previous night sleep onset. The panels on the left show the curvilinear relationship between sleep onset and each of the physical activity outcomes at the ages indicated in each column. The panels on the right show the same relationships but by age continuously. The white band indicates predictions which were not significantly different from zero." title="" id="57" name="Picture"/>
             <a:graphic>
               <a:graphicData uri="http://schemas.openxmlformats.org/drawingml/2006/picture">
                 <pic:pic>
@@ -12182,7 +12428,7 @@
       <w:bookmarkStart w:id="59" w:name="fig:PA-by-sleep-onset-fig"/>
       <w:bookmarkEnd w:id="59"/>
       <w:r>
-        <w:t xml:space="preserve">Figure 5: Physical activity by sleep onset. The panels on the left show the curvilinear relationship between sleep onset and each of the physical activity outcomes at the ages indicated in each column. The panels on the right show the same relationships but by age continuously. The white band indicates predictions which were not significantly different from zero.</w:t>
+        <w:t xml:space="preserve">Figure 5: Physical activity predicted by previous night sleep onset. The panels on the left show the curvilinear relationship between sleep onset and each of the physical activity outcomes at the ages indicated in each column. The panels on the right show the same relationships but by age continuously. The white band indicates predictions which were not significantly different from zero.</w:t>
       </w:r>
     </w:p>
     <w:bookmarkEnd w:id="60"/>
@@ -12251,7 +12497,7 @@
           <wp:inline>
             <wp:extent cx="3810000" cy="2540000"/>
             <wp:effectExtent b="0" l="0" r="0" t="0"/>
-            <wp:docPr descr="Figure 6: Physical activity by sleep regularity. The panels on the left show the curvilinear relationship between sleep regularity and each of the physical activity outcomes at the ages indicated in each column. The panels on the right show the same relationships but by age continuously. The white band indicates predictions which were not significantly different from zero." title="" id="62" name="Picture"/>
+            <wp:docPr descr="Figure 6: Physical activity predicted by previous night sleep regularity. The panels on the left show the curvilinear relationship between sleep regularity and each of the physical activity outcomes at the ages indicated in each column. The panels on the right show the same relationships but by age continuously. The white band indicates predictions which were not significantly different from zero." title="" id="62" name="Picture"/>
             <a:graphic>
               <a:graphicData uri="http://schemas.openxmlformats.org/drawingml/2006/picture">
                 <pic:pic>
@@ -12296,7 +12542,7 @@
       <w:bookmarkStart w:id="64" w:name="fig:PA-by-sleep-regularity-fig"/>
       <w:bookmarkEnd w:id="64"/>
       <w:r>
-        <w:t xml:space="preserve">Figure 6: Physical activity by sleep regularity. The panels on the left show the curvilinear relationship between sleep regularity and each of the physical activity outcomes at the ages indicated in each column. The panels on the right show the same relationships but by age continuously. The white band indicates predictions which were not significantly different from zero.</w:t>
+        <w:t xml:space="preserve">Figure 6: Physical activity predicted by previous night sleep regularity. The panels on the left show the curvilinear relationship between sleep regularity and each of the physical activity outcomes at the ages indicated in each column. The panels on the right show the same relationships but by age continuously. The white band indicates predictions which were not significantly different from zero.</w:t>
       </w:r>
     </w:p>
     <w:bookmarkEnd w:id="65"/>
@@ -12321,19 +12567,13 @@
         <w:t xml:space="preserve"> </w:t>
       </w:r>
       <w:r>
-        <w:t xml:space="preserve">We found that both the amount and the intensity of physical activity was associated with longer sleep duration, higher sleep efficiency, earlier sleep onset, and more regular sleep.</w:t>
+        <w:t xml:space="preserve">We found that both the volume and intensity of physical activity was associated with longer sleep duration, higher sleep efficiency, earlier sleep onset, and more regular sleep.</w:t>
       </w:r>
       <w:r>
         <w:t xml:space="preserve"> </w:t>
       </w:r>
       <w:r>
         <w:t xml:space="preserve">These relationships were the strongest for sleep regularity, although the the relationship between physical activity intensity weakened with age.</w:t>
-      </w:r>
-      <w:r>
-        <w:t xml:space="preserve"> </w:t>
-      </w:r>
-      <w:r>
-        <w:t xml:space="preserve">Many of these relationships were bi-directional.</w:t>
       </w:r>
     </w:p>
     <w:p>
@@ -12341,25 +12581,13 @@
         <w:pStyle w:val="Textkrper"/>
       </w:pPr>
       <w:r>
-        <w:t xml:space="preserve">Sleep was more regular among people who engaged in more intense physical activity.</w:t>
-      </w:r>
-      <w:r>
-        <w:t xml:space="preserve"> </w:t>
-      </w:r>
-      <w:r>
-        <w:t xml:space="preserve">Further, we found no evidence that sleep duration or efficiency were associated with physical activity volume.</w:t>
-      </w:r>
-      <w:r>
-        <w:t xml:space="preserve"> </w:t>
-      </w:r>
-      <w:r>
-        <w:t xml:space="preserve">Those who slept more efficiently engaged in more intense physical activity the following day.</w:t>
-      </w:r>
-      <w:r>
-        <w:t xml:space="preserve"> </w:t>
-      </w:r>
-      <w:r>
-        <w:t xml:space="preserve">Those who fell asleep earlier and at a more regular time also engaged in more intense physical activity, and engaged in more total physical activity.</w:t>
+        <w:t xml:space="preserve">When examining the reverse direction, we observed those who fell asleep earlier and at a more regular time engaged in more total physical activity, with an additional negligible benefit for those who slept more efficiently.</w:t>
+      </w:r>
+      <w:r>
+        <w:t xml:space="preserve"> </w:t>
+      </w:r>
+      <w:r>
+        <w:t xml:space="preserve">Similarly, those who slept at a more regular time and with more efficiency engaged in more intense physical activity.</w:t>
       </w:r>
       <w:r>
         <w:t xml:space="preserve"> </w:t>
@@ -12373,13 +12601,13 @@
         <w:pStyle w:val="Textkrper"/>
       </w:pPr>
       <w:r>
-        <w:t xml:space="preserve">The lack of association between physical activity and sleep duration or efficiency is particularly notable, as a relationship between these variables has been observed in meta-analyses</w:t>
-      </w:r>
-      <w:r>
-        <w:t xml:space="preserve"> </w:t>
-      </w:r>
-      <w:r>
-        <w:t xml:space="preserve">[8]</w:t>
+        <w:t xml:space="preserve">Our findings broadly align with meta-analyses of experimental research, although the strengths of the relationships we observed were much weaker</w:t>
+      </w:r>
+      <w:r>
+        <w:t xml:space="preserve"> </w:t>
+      </w:r>
+      <w:r>
+        <w:t xml:space="preserve">[9]</w:t>
       </w:r>
       <w:r>
         <w:t xml:space="preserve">.</w:t>
@@ -12432,19 +12660,19 @@
         <w:t xml:space="preserve"> </w:t>
       </w:r>
       <w:r>
-        <w:t xml:space="preserve">This discrepancy could be due to the design of the studies, as the majority of studies which have found a relationship were experimental.</w:t>
-      </w:r>
-      <w:r>
-        <w:t xml:space="preserve"> </w:t>
-      </w:r>
-      <w:r>
-        <w:t xml:space="preserve">That is, physical activity was manipulated and it may be that the routine nature of individuals’ physical activity makes associations more difficult to detect.</w:t>
-      </w:r>
-      <w:r>
-        <w:t xml:space="preserve"> </w:t>
-      </w:r>
-      <w:r>
-        <w:t xml:space="preserve">Similarly, most of the studies which examined acute changes to physical activity were conducted in laboratory settings.</w:t>
+        <w:t xml:space="preserve">It is difficult to directly compare these effect sizes, however, as the experimental studies directly manipulated physical activity, whereas our study examined the relationship between habitual physical activity and sleep.</w:t>
+      </w:r>
+      <w:r>
+        <w:t xml:space="preserve"> </w:t>
+      </w:r>
+      <w:r>
+        <w:t xml:space="preserve">It may be that the routine nature of individuals’ physical activity makes associations more difficult to detect.</w:t>
+      </w:r>
+      <w:r>
+        <w:t xml:space="preserve"> </w:t>
+      </w:r>
+      <w:r>
+        <w:t xml:space="preserve">Similarly, most of the previous studies which have examined acute changes to physical activity were conducted in laboratory settings.</w:t>
       </w:r>
       <w:r>
         <w:t xml:space="preserve"> </w:t>
@@ -12470,7 +12698,7 @@
         <w:pStyle w:val="Textkrper"/>
       </w:pPr>
       <w:r>
-        <w:t xml:space="preserve">We found the most consistent evidence for relationships between sleep onset and regularity with physical activity volume and intensity.</w:t>
+        <w:t xml:space="preserve">We found the most evidence for relationships between sleep regularity with physical activity volume and intensity.</w:t>
       </w:r>
       <w:r>
         <w:t xml:space="preserve"> </w:t>
@@ -12514,19 +12742,43 @@
         <w:pStyle w:val="Textkrper"/>
       </w:pPr>
       <w:r>
-        <w:t xml:space="preserve">Interestingly, the effects of physical activity on sleep regularity were stronger in older adults compared to younger individuals.</w:t>
-      </w:r>
-      <w:r>
-        <w:t xml:space="preserve"> </w:t>
-      </w:r>
-      <w:r>
-        <w:t xml:space="preserve">This age-dependent association suggests that promoting physical activity in older adults could be a particularly effective strategy for improving sleep health, which may contribute to better overall health outcomes</w:t>
-      </w:r>
-      <w:r>
-        <w:t xml:space="preserve"> </w:t>
-      </w:r>
-      <w:r>
-        <w:t xml:space="preserve">[2,3]</w:t>
+        <w:t xml:space="preserve">Contrary to expectations, we found little evidence to suggest that the associations between physical activity and sleep differed by age.</w:t>
+      </w:r>
+      <w:r>
+        <w:t xml:space="preserve"> </w:t>
+      </w:r>
+      <w:r>
+        <w:t xml:space="preserve">While several of the analyses suggested statistically significant interactions between age and physical activity, these were too small to be clinically meaningful.</w:t>
+      </w:r>
+      <w:r>
+        <w:t xml:space="preserve"> </w:t>
+      </w:r>
+      <w:r>
+        <w:t xml:space="preserve">This suggests that the benefits of physical activity and sleep are consistent across the lifespan, which is inconsistent with previous meta-analyses conducted on different ages.</w:t>
+      </w:r>
+      <w:r>
+        <w:t xml:space="preserve"> </w:t>
+      </w:r>
+      <w:r>
+        <w:t xml:space="preserve">More specifically, meta-analyses in adult populations have generally found associations</w:t>
+      </w:r>
+      <w:r>
+        <w:t xml:space="preserve"> </w:t>
+      </w:r>
+      <w:r>
+        <w:t xml:space="preserve">[9]</w:t>
+      </w:r>
+      <w:r>
+        <w:t xml:space="preserve"> </w:t>
+      </w:r>
+      <w:r>
+        <w:t xml:space="preserve">while those conducted in children and adolescents are less clear</w:t>
+      </w:r>
+      <w:r>
+        <w:t xml:space="preserve"> </w:t>
+      </w:r>
+      <w:r>
+        <w:t xml:space="preserve">[8,11,12]</w:t>
       </w:r>
       <w:r>
         <w:t xml:space="preserve">.</w:t>
@@ -12535,31 +12787,13 @@
         <w:t xml:space="preserve"> </w:t>
       </w:r>
       <w:r>
-        <w:t xml:space="preserve">Alternatively, it could mean that older adults have fewer of the external constraints (e.g., work schedules, parenting duties) that younger adults have, and so are more able to benefit from the effects of physical activity on sleep.</w:t>
-      </w:r>
-      <w:r>
-        <w:t xml:space="preserve"> </w:t>
-      </w:r>
-      <w:r>
-        <w:t xml:space="preserve">Furthermore, the age-related weakening of the positive effects of physical activity volume beyond a certain threshold implies that moderate rather than high levels of physical activity may be sufficient for promoting sleep in older populations.</w:t>
-      </w:r>
-      <w:r>
-        <w:t xml:space="preserve"> </w:t>
-      </w:r>
-      <w:r>
-        <w:t xml:space="preserve">For younger individuals, physical activity was associated with earlier sleep onset, whereas for older participants, physical activity was linked to later sleep onset.</w:t>
-      </w:r>
-      <w:r>
-        <w:t xml:space="preserve"> </w:t>
-      </w:r>
-      <w:r>
-        <w:t xml:space="preserve">This suggests a nuanced relationship, where age-specific factors (such as changes in circadian rhythm, or age-varying commitments such as work or school) might mediate how physical activity impacts sleep timing.</w:t>
-      </w:r>
-      <w:r>
-        <w:t xml:space="preserve"> </w:t>
-      </w:r>
-      <w:r>
-        <w:t xml:space="preserve">Future public health recommendations could consider tailoring activity guidelines to different age groups to optimise sleep benefits.</w:t>
+        <w:t xml:space="preserve">This would seem to suggest that the differences in findings across these meta-analyses are due to differences beyond just the age of the populations, such as the type of study designs used or the measures of physical activity and sleep.</w:t>
+      </w:r>
+      <w:r>
+        <w:t xml:space="preserve"> </w:t>
+      </w:r>
+      <w:r>
+        <w:t xml:space="preserve">It also demonstrates the importance of using individual participant data meta-analyses to examine these types of questions.</w:t>
       </w:r>
     </w:p>
     <w:p>
@@ -12567,19 +12801,28 @@
         <w:pStyle w:val="Textkrper"/>
       </w:pPr>
       <w:r>
-        <w:t xml:space="preserve">These findings have other important implications for public health recommendations.</w:t>
-      </w:r>
-      <w:r>
-        <w:t xml:space="preserve"> </w:t>
-      </w:r>
-      <w:r>
-        <w:t xml:space="preserve">Our results support encouraging physical activity for maintaining regular sleep patterns, especially in older adults.</w:t>
-      </w:r>
-      <w:r>
-        <w:t xml:space="preserve"> </w:t>
-      </w:r>
-      <w:r>
-        <w:t xml:space="preserve">However, the data suggest that focusing solely on increasing physical activity volume or intensity may not necessarily improve other aspects of sleep quality, such as duration or efficiency.</w:t>
+        <w:t xml:space="preserve">These findings have implications for public health recommendations.</w:t>
+      </w:r>
+      <w:r>
+        <w:t xml:space="preserve"> </w:t>
+      </w:r>
+      <w:r>
+        <w:t xml:space="preserve">Our results support encouraging physical activity for maintaining regular sleep patterns across the lifespan.</w:t>
+      </w:r>
+      <w:r>
+        <w:t xml:space="preserve"> </w:t>
+      </w:r>
+      <w:r>
+        <w:t xml:space="preserve">Sleep health may contribute to overall better health outcomes</w:t>
+      </w:r>
+      <w:r>
+        <w:t xml:space="preserve"> </w:t>
+      </w:r>
+      <w:r>
+        <w:t xml:space="preserve">[2,3]</w:t>
+      </w:r>
+      <w:r>
+        <w:t xml:space="preserve">, and so promoting physical activity may be a useful strategy for improving population health.</w:t>
       </w:r>
       <w:r>
         <w:t xml:space="preserve"> </w:t>
@@ -12591,13 +12834,19 @@
         <w:t xml:space="preserve"> </w:t>
       </w:r>
       <w:r>
-        <w:t xml:space="preserve">We note, however, that we did not examine the effects of physical activity on sleep in individuals with sleep disorders or other health conditions.</w:t>
-      </w:r>
-      <w:r>
-        <w:t xml:space="preserve"> </w:t>
-      </w:r>
-      <w:r>
-        <w:t xml:space="preserve">Physical activity interventions may still be a useful treatment for these conditions.</w:t>
+        <w:t xml:space="preserve">We note, however, that we did not examine the these relationships in individuals with sleep disorders or other health conditions.</w:t>
+      </w:r>
+      <w:r>
+        <w:t xml:space="preserve"> </w:t>
+      </w:r>
+      <w:r>
+        <w:t xml:space="preserve">Physical activity interventions may still be a useful treatment for these conditions</w:t>
+      </w:r>
+      <w:r>
+        <w:t xml:space="preserve"> </w:t>
+      </w:r>
+      <w:r>
+        <w:t xml:space="preserve">Promoting more regular sleep may also be a useful strategy for increasing physical activity, although our results suggest a limited benefit from targeting other aspects of sleep quality.</w:t>
       </w:r>
     </w:p>
     <w:p>
@@ -12611,6 +12860,12 @@
         <w:t xml:space="preserve"> </w:t>
       </w:r>
       <w:r>
+        <w:t xml:space="preserve">We also used modern methods for processing and estimating physical activity, including using the full 24 hours of data, and avoiding the use of intensity cut-points.</w:t>
+      </w:r>
+      <w:r>
+        <w:t xml:space="preserve"> </w:t>
+      </w:r>
+      <w:r>
         <w:t xml:space="preserve">However, the study is not without limitations.</w:t>
       </w:r>
       <w:r>
@@ -12618,6 +12873,42 @@
       </w:r>
       <w:r>
         <w:t xml:space="preserve">Despite our efforts to harmonise data, variability in accelerometer wear locations and slight differences in data collection protocols across studies may have introduced measurement inconsistencies.</w:t>
+      </w:r>
+      <w:r>
+        <w:t xml:space="preserve"> </w:t>
+      </w:r>
+      <w:r>
+        <w:t xml:space="preserve">We also chose to maximise the data available for analysis, at the expense of some precision in the estimates.</w:t>
+      </w:r>
+      <w:r>
+        <w:t xml:space="preserve"> </w:t>
+      </w:r>
+      <w:r>
+        <w:t xml:space="preserve">Specifically, we included participants with four or more nights of valid sleep, while some recommend at least seven nights to estimate metrics such as sleep regularity</w:t>
+      </w:r>
+      <w:r>
+        <w:t xml:space="preserve"> </w:t>
+      </w:r>
+      <w:r>
+        <w:t xml:space="preserve">[45]</w:t>
+      </w:r>
+      <w:r>
+        <w:t xml:space="preserve">.</w:t>
+      </w:r>
+      <w:r>
+        <w:t xml:space="preserve"> </w:t>
+      </w:r>
+      <w:r>
+        <w:t xml:space="preserve">However, the processing method we used specifically allows for comparisons to day-pairs and this methodology has been used by others</w:t>
+      </w:r>
+      <w:r>
+        <w:t xml:space="preserve"> </w:t>
+      </w:r>
+      <w:r>
+        <w:t xml:space="preserve">[e.g., 44]</w:t>
+      </w:r>
+      <w:r>
+        <w:t xml:space="preserve">.</w:t>
       </w:r>
       <w:r>
         <w:t xml:space="preserve"> </w:t>
@@ -12683,7 +12974,7 @@
       </w:r>
     </w:p>
     <w:bookmarkEnd w:id="68"/>
-    <w:bookmarkStart w:id="158" w:name="references"/>
+    <w:bookmarkStart w:id="160" w:name="references"/>
     <w:p>
       <w:pPr>
         <w:pStyle w:val="berschrift1"/>
@@ -12692,7 +12983,7 @@
         <w:t xml:space="preserve">References</w:t>
       </w:r>
     </w:p>
-    <w:bookmarkStart w:id="157" w:name="refs"/>
+    <w:bookmarkStart w:id="159" w:name="refs"/>
     <w:bookmarkStart w:id="70" w:name="ref-luysterSleepHealthImperative2012"/>
     <w:p>
       <w:pPr>
@@ -15955,13 +16246,67 @@
       </w:r>
     </w:p>
     <w:bookmarkEnd w:id="156"/>
-    <w:bookmarkEnd w:id="157"/>
+    <w:bookmarkStart w:id="158" w:name="ref-lokHowManyDays2024"/>
     <w:p>
-      <w:r>
-        <w:br w:type="page"/>
+      <w:pPr>
+        <w:pStyle w:val="Literaturverzeichnis"/>
+      </w:pPr>
+      <w:r>
+        <w:t xml:space="preserve">45.</w:t>
+      </w:r>
+      <w:r>
+        <w:t xml:space="preserve"> </w:t>
+      </w:r>
+      <w:r>
+        <w:t xml:space="preserve">	</w:t>
+      </w:r>
+      <w:r>
+        <w:t xml:space="preserve">Lok R, Suh S, Rue S, Weed L, Zeitzer JM.</w:t>
+      </w:r>
+      <w:r>
+        <w:t xml:space="preserve"> </w:t>
+      </w:r>
+      <w:hyperlink r:id="rId157">
+        <w:r>
+          <w:rPr>
+            <w:rStyle w:val="Hyperlink"/>
+          </w:rPr>
+          <w:t xml:space="preserve">How many days are enough?</w:t>
+        </w:r>
+        <w:r>
+          <w:rPr>
+            <w:rStyle w:val="Hyperlink"/>
+          </w:rPr>
+          <w:t xml:space="preserve"> </w:t>
+        </w:r>
+        <w:r>
+          <w:rPr>
+            <w:rStyle w:val="Hyperlink"/>
+          </w:rPr>
+          <w:t xml:space="preserve">Sleep</w:t>
+        </w:r>
+        <w:r>
+          <w:rPr>
+            <w:rStyle w:val="Hyperlink"/>
+          </w:rPr>
+          <w:t xml:space="preserve">–wake timing regularity and fragmentation scores change with the number of days included</w:t>
+        </w:r>
+      </w:hyperlink>
+      <w:r>
+        <w:t xml:space="preserve">. Journal of Sleep Research. 2024 Sep;e14332.</w:t>
+      </w:r>
+      <w:r>
+        <w:t xml:space="preserve"> </w:t>
       </w:r>
     </w:p>
     <w:bookmarkEnd w:id="158"/>
+    <w:bookmarkEnd w:id="159"/>
+    <w:p>
+      <w:r>
+        <w:br w:type="page"/>
+      </w:r>
+    </w:p>
+    <w:bookmarkEnd w:id="160"/>
     <w:sectPr>
       <w:headerReference r:id="rId9" w:type="even"/>
       <w:headerReference r:id="rId11" w:type="default"/>

</xml_diff>

<commit_message>
Move figures into folders to keep things tidy
</commit_message>
<xml_diff>
--- a/doc/manuscript.docx
+++ b/doc/manuscript.docx
@@ -4,7 +4,7 @@
   <w:body>
     <w:p>
       <w:pPr>
-        <w:pStyle w:val="Title"/>
+        <w:pStyle w:val="Titel"/>
       </w:pPr>
       <w:r>
         <w:t xml:space="preserve">The relationship between sleep and physical activity across the lifespan</w:t>
@@ -1626,7 +1626,7 @@
         <w:t xml:space="preserve"> </w:t>
       </w:r>
       <w:r>
-        <w:t xml:space="preserve">This approach allows us to account for variability between studies without fully partialing out study effects, thereby better modelling common phenomena.</w:t>
+        <w:t xml:space="preserve">This approach allows us to account for variability between studies without fully partialling out study effects, thereby better modelling common phenomena.</w:t>
       </w:r>
       <w:r>
         <w:t xml:space="preserve"> </w:t>
@@ -1796,7 +1796,7 @@
         <w:t xml:space="preserve"> </w:t>
       </w:r>
       <w:r>
-        <w:t xml:space="preserve">There was a near-even split by sex (50.5%), but age skewed towards both younger children (2-11 years, 39.8%) and older adults (66+ years, 26.8%).</w:t>
+        <w:t xml:space="preserve">There was a near-even split by sex (50.5% female), but age skewed towards both younger children (2-11 years, 39.8%) and older adults (66+ years, 26.8%).</w:t>
       </w:r>
     </w:p>
     <w:p>
@@ -1817,8 +1817,8 @@
             <m:d>
               <m:dPr>
                 <m:begChr m:val="("/>
+                <m:sepChr m:val=""/>
                 <m:endChr m:val=")"/>
-                <m:sepChr m:val=""/>
                 <m:grow/>
               </m:dPr>
               <m:e>
@@ -8417,7 +8417,7 @@
               <a:graphicData uri="http://schemas.openxmlformats.org/drawingml/2006/picture">
                 <pic:pic>
                   <pic:nvPicPr>
-                    <pic:cNvPr descr="../Figures/Sleep%20on%20scale_pa_volume%20by%20Age_nolog.jpg" id="37" name="Picture"/>
+                    <pic:cNvPr descr="../Figures/main/Sleep%20on%20scale_pa_volume%20by%20Age_nolog.jpg" id="37" name="Picture"/>
                     <pic:cNvPicPr>
                       <a:picLocks noChangeArrowheads="1" noChangeAspect="1"/>
                     </pic:cNvPicPr>
@@ -8531,7 +8531,7 @@
               <a:graphicData uri="http://schemas.openxmlformats.org/drawingml/2006/picture">
                 <pic:pic>
                   <pic:nvPicPr>
-                    <pic:cNvPr descr="../Figures/Sleep%20on%20scale_pa_intensity%20by%20Age_nolog.jpg" id="42" name="Picture"/>
+                    <pic:cNvPr descr="../Figures/main/Sleep%20on%20scale_pa_intensity%20by%20Age_nolog.jpg" id="42" name="Picture"/>
                     <pic:cNvPicPr>
                       <a:picLocks noChangeArrowheads="1" noChangeAspect="1"/>
                     </pic:cNvPicPr>
@@ -12172,7 +12172,7 @@
               <a:graphicData uri="http://schemas.openxmlformats.org/drawingml/2006/picture">
                 <pic:pic>
                   <pic:nvPicPr>
-                    <pic:cNvPr descr="../Figures/PA%20on%20scale_sleep_duration_lag%20by%20Age_nolog.jpg" id="48" name="Picture"/>
+                    <pic:cNvPr descr="../Figures/main/PA%20on%20scale_sleep_duration_lag%20by%20Age_nolog.jpg" id="48" name="Picture"/>
                     <pic:cNvPicPr>
                       <a:picLocks noChangeArrowheads="1" noChangeAspect="1"/>
                     </pic:cNvPicPr>
@@ -12280,7 +12280,7 @@
               <a:graphicData uri="http://schemas.openxmlformats.org/drawingml/2006/picture">
                 <pic:pic>
                   <pic:nvPicPr>
-                    <pic:cNvPr descr="../Figures/PA%20on%20scale_sleep_efficiency_lag%20by%20Age_nolog.jpg" id="53" name="Picture"/>
+                    <pic:cNvPr descr="../Figures/main/PA%20on%20scale_sleep_efficiency_lag%20by%20Age_nolog.jpg" id="53" name="Picture"/>
                     <pic:cNvPicPr>
                       <a:picLocks noChangeArrowheads="1" noChangeAspect="1"/>
                     </pic:cNvPicPr>
@@ -12388,7 +12388,7 @@
               <a:graphicData uri="http://schemas.openxmlformats.org/drawingml/2006/picture">
                 <pic:pic>
                   <pic:nvPicPr>
-                    <pic:cNvPr descr="../Figures/PA%20on%20scale_sleep_onset_lag%20by%20Age_nolog.jpg" id="58" name="Picture"/>
+                    <pic:cNvPr descr="../Figures/main/PA%20on%20scale_sleep_onset_lag%20by%20Age_nolog.jpg" id="58" name="Picture"/>
                     <pic:cNvPicPr>
                       <a:picLocks noChangeArrowheads="1" noChangeAspect="1"/>
                     </pic:cNvPicPr>
@@ -12502,7 +12502,7 @@
               <a:graphicData uri="http://schemas.openxmlformats.org/drawingml/2006/picture">
                 <pic:pic>
                   <pic:nvPicPr>
-                    <pic:cNvPr descr="../Figures/PA%20on%20scale_sleep_regularity_lag%20by%20Age_nolog.jpg" id="63" name="Picture"/>
+                    <pic:cNvPr descr="../Figures/main/PA%20on%20scale_sleep_regularity_lag%20by%20Age_nolog.jpg" id="63" name="Picture"/>
                     <pic:cNvPicPr>
                       <a:picLocks noChangeArrowheads="1" noChangeAspect="1"/>
                     </pic:cNvPicPr>

</xml_diff>

<commit_message>
Small update to Borja and affiliations
</commit_message>
<xml_diff>
--- a/doc/manuscript.docx
+++ b/doc/manuscript.docx
@@ -4,7 +4,7 @@
   <w:body>
     <w:p>
       <w:pPr>
-        <w:pStyle w:val="Titel"/>
+        <w:pStyle w:val="Title"/>
       </w:pPr>
       <w:r>
         <w:t xml:space="preserve">The relationship between sleep and physical activity across the lifespan</w:t>
@@ -60,7 +60,7 @@
           <w:i/>
           <w:iCs/>
         </w:rPr>
-        <w:t xml:space="preserve">, Borja del Pozo-Cruz</w:t>
+        <w:t xml:space="preserve">, Borja del Pozo Cruz</w:t>
       </w:r>
       <w:r>
         <w:rPr>
@@ -68,7 +68,7 @@
           <w:iCs/>
           <w:vertAlign w:val="superscript"/>
         </w:rPr>
-        <w:t xml:space="preserve">4-6</w:t>
+        <w:t xml:space="preserve">4</w:t>
       </w:r>
       <w:r>
         <w:rPr>
@@ -76,6 +76,36 @@
           <w:iCs/>
         </w:rPr>
         <w:t xml:space="preserve">, Philip Parker</w:t>
+      </w:r>
+      <w:r>
+        <w:rPr>
+          <w:i/>
+          <w:iCs/>
+          <w:vertAlign w:val="superscript"/>
+        </w:rPr>
+        <w:t xml:space="preserve">5</w:t>
+      </w:r>
+      <w:r>
+        <w:rPr>
+          <w:i/>
+          <w:iCs/>
+        </w:rPr>
+        <w:t xml:space="preserve">, Michael Noetel</w:t>
+      </w:r>
+      <w:r>
+        <w:rPr>
+          <w:i/>
+          <w:iCs/>
+          <w:vertAlign w:val="superscript"/>
+        </w:rPr>
+        <w:t xml:space="preserve">6</w:t>
+      </w:r>
+      <w:r>
+        <w:rPr>
+          <w:i/>
+          <w:iCs/>
+        </w:rPr>
+        <w:t xml:space="preserve">, Devan Antczak</w:t>
       </w:r>
       <w:r>
         <w:rPr>
@@ -90,7 +120,7 @@
           <w:i/>
           <w:iCs/>
         </w:rPr>
-        <w:t xml:space="preserve">, Michael Noetel</w:t>
+        <w:t xml:space="preserve">, Stuart J. Fairclough</w:t>
       </w:r>
       <w:r>
         <w:rPr>
@@ -105,36 +135,6 @@
           <w:i/>
           <w:iCs/>
         </w:rPr>
-        <w:t xml:space="preserve">, Devan Antczak</w:t>
-      </w:r>
-      <w:r>
-        <w:rPr>
-          <w:i/>
-          <w:iCs/>
-          <w:vertAlign w:val="superscript"/>
-        </w:rPr>
-        <w:t xml:space="preserve">9</w:t>
-      </w:r>
-      <w:r>
-        <w:rPr>
-          <w:i/>
-          <w:iCs/>
-        </w:rPr>
-        <w:t xml:space="preserve">, Stuart J. Fairclough</w:t>
-      </w:r>
-      <w:r>
-        <w:rPr>
-          <w:i/>
-          <w:iCs/>
-          <w:vertAlign w:val="superscript"/>
-        </w:rPr>
-        <w:t xml:space="preserve">10</w:t>
-      </w:r>
-      <w:r>
-        <w:rPr>
-          <w:i/>
-          <w:iCs/>
-        </w:rPr>
         <w:t xml:space="preserve">, Shona Halson</w:t>
       </w:r>
       <w:r>
@@ -173,7 +173,7 @@
         <w:rPr>
           <w:vertAlign w:val="superscript"/>
         </w:rPr>
-        <w:t xml:space="preserve">12</w:t>
+        <w:t xml:space="preserve">9</w:t>
       </w:r>
       <w:r>
         <w:t xml:space="preserve">, &amp; Chris Lonsdale</w:t>
@@ -182,7 +182,7 @@
         <w:rPr>
           <w:vertAlign w:val="superscript"/>
         </w:rPr>
-        <w:t xml:space="preserve">13</w:t>
+        <w:t xml:space="preserve">10</w:t>
       </w:r>
     </w:p>
     <w:p>
@@ -250,7 +250,7 @@
         <w:t xml:space="preserve"> </w:t>
       </w:r>
       <w:r>
-        <w:t xml:space="preserve">Faculty of Sport Sciences, Universidad Europea de Madrid, Madrid, Spain</w:t>
+        <w:t xml:space="preserve">Department of Sport Sciences, Faculty of Medicine, Health, and Sports, Universidad Europea de Madrid</w:t>
       </w:r>
     </w:p>
     <w:p>
@@ -267,7 +267,7 @@
         <w:t xml:space="preserve"> </w:t>
       </w:r>
       <w:r>
-        <w:t xml:space="preserve">Faculty of Biomedical and Health Sciences, Universidad Europea de Madrid, Madrid, Spain</w:t>
+        <w:t xml:space="preserve">Office of the Deputy Vice-Chancellor (Research and Enterprise), Australian Catholic University, North Sydney, Australia</w:t>
       </w:r>
     </w:p>
     <w:p>
@@ -284,7 +284,7 @@
         <w:t xml:space="preserve"> </w:t>
       </w:r>
       <w:r>
-        <w:t xml:space="preserve">Department of Sports Science and Clinical Biomechanics, University of Southern Denmark, Odense, Denmark</w:t>
+        <w:t xml:space="preserve">School of Psychology, University of Queensland, Brisbane, Australia</w:t>
       </w:r>
     </w:p>
     <w:p>
@@ -301,7 +301,7 @@
         <w:t xml:space="preserve"> </w:t>
       </w:r>
       <w:r>
-        <w:t xml:space="preserve">Office of the Deputy Vice-Chancellor (Research and Enterprise), Australian Catholic University, North Sydney, Australia</w:t>
+        <w:t xml:space="preserve">School of Education, University of Wollongong, Wollongong, Australia</w:t>
       </w:r>
     </w:p>
     <w:p>
@@ -318,7 +318,7 @@
         <w:t xml:space="preserve"> </w:t>
       </w:r>
       <w:r>
-        <w:t xml:space="preserve">School of Psychology, University of Queensland, Brisbane, Australia</w:t>
+        <w:t xml:space="preserve">Department of Sport and Physical Activity, Edge Hill University, Ormskirk, United Kingdom</w:t>
       </w:r>
     </w:p>
     <w:p>
@@ -330,40 +330,6 @@
           <w:vertAlign w:val="superscript"/>
         </w:rPr>
         <w:t xml:space="preserve">9</w:t>
-      </w:r>
-      <w:r>
-        <w:t xml:space="preserve"> </w:t>
-      </w:r>
-      <w:r>
-        <w:t xml:space="preserve">School of Education, University of Wollongong, Wollongong, Australia</w:t>
-      </w:r>
-    </w:p>
-    <w:p>
-      <w:pPr>
-        <w:pStyle w:val="Author"/>
-      </w:pPr>
-      <w:r>
-        <w:rPr>
-          <w:vertAlign w:val="superscript"/>
-        </w:rPr>
-        <w:t xml:space="preserve">10</w:t>
-      </w:r>
-      <w:r>
-        <w:t xml:space="preserve"> </w:t>
-      </w:r>
-      <w:r>
-        <w:t xml:space="preserve">Department of Sport and Physical Activity, Edge Hill University, Ormskirk, United Kingdom</w:t>
-      </w:r>
-    </w:p>
-    <w:p>
-      <w:pPr>
-        <w:pStyle w:val="Author"/>
-      </w:pPr>
-      <w:r>
-        <w:rPr>
-          <w:vertAlign w:val="superscript"/>
-        </w:rPr>
-        <w:t xml:space="preserve">11</w:t>
       </w:r>
       <w:r>
         <w:t xml:space="preserve"> </w:t>
@@ -386,7 +352,7 @@
         <w:rPr>
           <w:vertAlign w:val="superscript"/>
         </w:rPr>
-        <w:t xml:space="preserve">13</w:t>
+        <w:t xml:space="preserve">10</w:t>
       </w:r>
       <w:r>
         <w:t xml:space="preserve"> </w:t>
@@ -1817,8 +1783,8 @@
             <m:d>
               <m:dPr>
                 <m:begChr m:val="("/>
+                <m:endChr m:val=")"/>
                 <m:sepChr m:val=""/>
-                <m:endChr m:val=")"/>
                 <m:grow/>
               </m:dPr>
               <m:e>
@@ -12840,7 +12806,7 @@
         <w:t xml:space="preserve"> </w:t>
       </w:r>
       <w:r>
-        <w:t xml:space="preserve">Physical activity interventions may still be a useful treatment for these conditions</w:t>
+        <w:t xml:space="preserve">Physical activity interventions may still be a useful treatment for these conditions.</w:t>
       </w:r>
       <w:r>
         <w:t xml:space="preserve"> </w:t>

</xml_diff>